<commit_message>
capitulo 2 finalizado comecando o 3
</commit_message>
<xml_diff>
--- a/backup/tcc-jec.docx
+++ b/backup/tcc-jec.docx
@@ -11353,7 +11353,9 @@
     <w:p>
       <w:pPr>
         <w:pStyle w:val="Corpodetexto"/>
-        <w:ind w:firstLine="282"/>
+        <w:spacing w:before="100"/>
+        <w:ind w:left="147" w:firstLine="272"/>
+        <w:jc w:val="both"/>
       </w:pPr>
       <w:r>
         <w:t>A UFO-B é a parte da Unified Foundational Ontology voltada à representação de eventos, isto é, entidades que ocorrem no tempo. Diferentemente dos objetos, que permanecem ao longo do tempo mantendo sua identidade, os eventos possuem natureza temporal, pois acontecem, desenvolvem-se e se encerram em determinado intervalo. Assim, enquanto uma pessoa, uma organização ou um documento podem ser analisados como entidades que persistem, uma audiência, uma perícia, uma citação ou a prolação de uma sentença devem ser compreendidas como acontecimentos processuais.</w:t>
@@ -11362,7 +11364,9 @@
     <w:p>
       <w:pPr>
         <w:pStyle w:val="Corpodetexto"/>
-        <w:ind w:firstLine="282"/>
+        <w:spacing w:before="100"/>
+        <w:ind w:left="147" w:firstLine="272"/>
+        <w:jc w:val="both"/>
       </w:pPr>
       <w:r>
         <w:t>No contexto da modelagem conceitual, a distinção entre objetos e eventos é relevante porque permite representar adequadamente a dinâmica dos domínios analisados. Em muitos modelos, atos, atividades e acontecimentos são tratados como simples objetos ou registros, o que pode gerar perda de significado. A UFO-B contribui para evitar esse problema ao permitir que ocorrências temporais sejam modeladas como eventos, evidenciando sua relação com o tempo, com os participantes envolvidos e com os efeitos que produzem no domínio (GUIZZARDI et al., 2013; GUIZZARDI et al., 2015).</w:t>
@@ -11503,11 +11507,11 @@
         <w:jc w:val="both"/>
       </w:pPr>
       <w:r>
-        <w:t xml:space="preserve">A UFO-C é a parte da Unified Foundational Ontology voltada à representação de aspectos sociais, intencionais e institucionais da realidade. Enquanto a UFO-A trata principalmente de entidades que persistem no tempo e a UFO-B trata de eventos, a UFO-C permite representar </w:t>
+        <w:t xml:space="preserve">A UFO-C é a parte da Unified Foundational Ontology voltada à representação de aspectos sociais, intencionais e institucionais da realidade. Enquanto a UFO-A trata principalmente de </w:t>
       </w:r>
       <w:r>
         <w:lastRenderedPageBreak/>
-        <w:t>agentes, papéis sociais, relações sociais, compromissos, intenções e ações comunicativas. Essa dimensão é especialmente relevante para domínios em que há interação entre pessoas, organizações e instituições, como ocorre no Direito (GUIZZARDI, 2005; GUIZZARDI et al., 2015).</w:t>
+        <w:t>entidades que persistem no tempo e a UFO-B trata de eventos, a UFO-C permite representar agentes, papéis sociais, relações sociais, compromissos, intenções e ações comunicativas. Essa dimensão é especialmente relevante para domínios em que há interação entre pessoas, organizações e instituições, como ocorre no Direito (GUIZZARDI, 2005; GUIZZARDI et al., 2015).</w:t>
       </w:r>
     </w:p>
     <w:p>
@@ -11642,13 +11646,7 @@
         <w:rPr>
           <w:w w:val="105"/>
         </w:rPr>
-        <w:t xml:space="preserve">2.4 </w:t>
-      </w:r>
-      <w:r>
-        <w:rPr>
-          <w:w w:val="105"/>
-        </w:rPr>
-        <w:t xml:space="preserve">Core Ontology </w:t>
+        <w:t xml:space="preserve">2.4 Core Ontology </w:t>
       </w:r>
       <w:r>
         <w:t>UFO-L</w:t>
@@ -11658,6 +11656,7 @@
       <w:pPr>
         <w:pStyle w:val="Corpodetexto"/>
         <w:ind w:firstLine="272"/>
+        <w:jc w:val="both"/>
       </w:pPr>
       <w:r>
         <w:t xml:space="preserve">A </w:t>
@@ -11703,6 +11702,9 @@
         <w:jc w:val="center"/>
       </w:pPr>
       <w:r>
+        <w:rPr>
+          <w:noProof/>
+        </w:rPr>
         <w:lastRenderedPageBreak/>
         <w:drawing>
           <wp:inline distT="0" distB="0" distL="0" distR="0" wp14:anchorId="64743D22" wp14:editId="59386313">
@@ -11749,19 +11751,8 @@
         <w:jc w:val="center"/>
       </w:pPr>
       <w:r>
-        <w:t xml:space="preserve">Fonte: </w:t>
-      </w:r>
-      <w:r>
-        <w:t>GRIFFO</w:t>
-      </w:r>
-      <w:r>
-        <w:t>, 20</w:t>
-      </w:r>
-      <w:r>
-        <w:t>18</w:t>
-      </w:r>
-      <w:bookmarkStart w:id="25" w:name="_GoBack"/>
-      <w:bookmarkEnd w:id="25"/>
+        <w:t>Fonte: GRIFFO, 2018</w:t>
+      </w:r>
     </w:p>
     <w:p>
       <w:pPr>
@@ -11774,6 +11765,7 @@
       <w:pPr>
         <w:pStyle w:val="Corpodetexto"/>
         <w:ind w:firstLine="272"/>
+        <w:jc w:val="both"/>
       </w:pPr>
       <w:r>
         <w:t>A ontologia introduz categorias próprias do domínio jurídico, entre elas Legal Agent, Legal Role, Legal RoleMixin, Legal Moment, Legal Relator e Legal Event. Na UFO-L, os Legal Agents são agentes que podem ocupar posições em relações jurídicas e carregar Legal Moments. Esses momentos representam posições jurídicas, como direitos, deveres, permissões, poderes e sujeições. As relações entre os agentes podem ser reificadas por meio de Legal Relators, que são compostos por momentos jurídicos externamente dependentes.</w:t>
@@ -11783,6 +11775,7 @@
       <w:pPr>
         <w:pStyle w:val="Corpodetexto"/>
         <w:ind w:firstLine="272"/>
+        <w:jc w:val="both"/>
       </w:pPr>
       <w:r>
         <w:t>A</w:t>
@@ -11805,6 +11798,7 @@
       <w:pPr>
         <w:pStyle w:val="Corpodetexto"/>
         <w:ind w:firstLine="272"/>
+        <w:jc w:val="both"/>
         <w:rPr>
           <w:lang w:val="pt-BR" w:eastAsia="pt-BR"/>
         </w:rPr>
@@ -13153,6 +13147,7 @@
       <w:pPr>
         <w:pStyle w:val="pdq2pgselectionanchorcontainer"/>
         <w:ind w:firstLine="272"/>
+        <w:jc w:val="both"/>
       </w:pPr>
       <w:r>
         <w:t>Essa distinção entre tipos, papéis e relações é especialmente relevante para a modelagem jurídica. Conforme Griffo (2018), a construção de ontologias jurídicas exige atenção às relações jurídicas e aos papéis exercidos por agentes dentro de estruturas normativas. Desse modo, a OntoUML contribui para representar o Direito de forma mais precisa, pois permite diferenciar uma entidade que possui identidade própria, como uma pessoa ou organização, dos papéis que ela pode exercer em determinado processo, como autor, réu, advogado, perito ou testemunha. A tese de Griffo, inclusive, apresenta a UFO-L como uma ontologia núcleo jurídica construída sob a perspectiva das relações jurídicas, reforçando a importância de uma modelagem juridicamente fundamentada</w:t>
@@ -13192,13 +13187,7 @@
         <w:t>5</w:t>
       </w:r>
       <w:r>
-        <w:t>.</w:t>
-      </w:r>
-      <w:r>
-        <w:t>1</w:t>
-      </w:r>
-      <w:r>
-        <w:t xml:space="preserve"> </w:t>
+        <w:t xml:space="preserve">.1 </w:t>
       </w:r>
       <w:r>
         <w:t>Visual</w:t>
@@ -13240,10 +13229,7 @@
         <w:t>plugin OntoUML</w:t>
       </w:r>
       <w:r>
-        <w:t>, possibilitando a elaboração de modelos conceituais ontologicamente fundamentado</w:t>
-      </w:r>
-      <w:r>
-        <w:t>s</w:t>
+        <w:t>, possibilitando a elaboração de modelos conceituais ontologicamente fundamentados</w:t>
       </w:r>
       <w:r>
         <w:t>.</w:t>
@@ -13291,6 +13277,9 @@
         <w:jc w:val="center"/>
       </w:pPr>
       <w:r>
+        <w:rPr>
+          <w:noProof/>
+        </w:rPr>
         <w:drawing>
           <wp:inline distT="0" distB="0" distL="0" distR="0" wp14:anchorId="1A76E9AA" wp14:editId="1B2E1B7C">
             <wp:extent cx="5535168" cy="1582309"/>
@@ -13336,10 +13325,7 @@
         <w:jc w:val="center"/>
       </w:pPr>
       <w:r>
-        <w:t>Fonte: Elaborado pelo autor (2026)</w:t>
-      </w:r>
-      <w:r>
-        <w:t>.</w:t>
+        <w:t>Fonte: Elaborado pelo autor (2026).</w:t>
       </w:r>
     </w:p>
     <w:p>
@@ -13365,25 +13351,27 @@
         <w:tabs>
           <w:tab w:val="left" w:pos="825"/>
         </w:tabs>
-        <w:ind w:left="825" w:hanging="543"/>
+        <w:ind w:left="828" w:right="374"/>
       </w:pPr>
       <w:r>
         <w:rPr>
           <w:w w:val="90"/>
         </w:rPr>
         <w:lastRenderedPageBreak/>
-        <w:t>Apectos Metodológicos</w:t>
-      </w:r>
-    </w:p>
-    <w:p>
-      <w:pPr>
-        <w:pStyle w:val="Corpodetexto"/>
-        <w:spacing w:before="352"/>
-        <w:rPr>
-          <w:rFonts w:ascii="Tahoma"/>
-          <w:sz w:val="49"/>
-        </w:rPr>
-      </w:pPr>
+        <w:t>A</w:t>
+      </w:r>
+      <w:r>
+        <w:rPr>
+          <w:w w:val="90"/>
+        </w:rPr>
+        <w:t>s</w:t>
+      </w:r>
+      <w:r>
+        <w:rPr>
+          <w:w w:val="90"/>
+        </w:rPr>
+        <w:t>pectos Metodológicos</w:t>
+      </w:r>
     </w:p>
     <w:p>
       <w:pPr>
@@ -13391,468 +13379,639 @@
         <w:spacing w:line="312" w:lineRule="auto"/>
         <w:ind w:left="282" w:right="114" w:firstLine="737"/>
         <w:jc w:val="both"/>
-      </w:pPr>
-      <w:r>
-        <w:rPr>
-          <w:w w:val="105"/>
-        </w:rPr>
-        <w:t>Este capítulo deve apresentar a principal contribuição do trabalho. Caso o aluno e orientador desejem, o título do capítulo pode ser alterado para referenciar diretamente a contribuição</w:t>
-      </w:r>
-      <w:r>
-        <w:rPr>
-          <w:spacing w:val="-6"/>
-          <w:w w:val="105"/>
-        </w:rPr>
-        <w:t xml:space="preserve"> </w:t>
-      </w:r>
-      <w:r>
-        <w:rPr>
-          <w:w w:val="105"/>
-        </w:rPr>
-        <w:t>(por</w:t>
-      </w:r>
-      <w:r>
-        <w:rPr>
-          <w:spacing w:val="-6"/>
-          <w:w w:val="105"/>
-        </w:rPr>
-        <w:t xml:space="preserve"> </w:t>
-      </w:r>
-      <w:r>
-        <w:rPr>
-          <w:w w:val="105"/>
-        </w:rPr>
-        <w:t>exemplo,</w:t>
-      </w:r>
-      <w:r>
-        <w:rPr>
-          <w:spacing w:val="-6"/>
-          <w:w w:val="105"/>
-        </w:rPr>
-        <w:t xml:space="preserve"> </w:t>
-      </w:r>
-      <w:r>
-        <w:rPr>
-          <w:w w:val="105"/>
-        </w:rPr>
-        <w:t>PIS:</w:t>
-      </w:r>
-      <w:r>
-        <w:rPr>
-          <w:spacing w:val="-6"/>
-          <w:w w:val="105"/>
-        </w:rPr>
-        <w:t xml:space="preserve"> </w:t>
-      </w:r>
-      <w:r>
-        <w:rPr>
-          <w:w w:val="105"/>
-        </w:rPr>
-        <w:t>Plataforma</w:t>
-      </w:r>
-      <w:r>
-        <w:rPr>
-          <w:spacing w:val="-6"/>
-          <w:w w:val="105"/>
-        </w:rPr>
-        <w:t xml:space="preserve"> </w:t>
-      </w:r>
-      <w:r>
-        <w:rPr>
-          <w:w w:val="105"/>
-        </w:rPr>
-        <w:t>para</w:t>
-      </w:r>
-      <w:r>
-        <w:rPr>
-          <w:spacing w:val="-6"/>
-          <w:w w:val="105"/>
-        </w:rPr>
-        <w:t xml:space="preserve"> </w:t>
-      </w:r>
-      <w:r>
-        <w:rPr>
-          <w:w w:val="105"/>
-        </w:rPr>
-        <w:t>Integração</w:t>
-      </w:r>
-      <w:r>
-        <w:rPr>
-          <w:spacing w:val="-6"/>
-          <w:w w:val="105"/>
-        </w:rPr>
-        <w:t xml:space="preserve"> </w:t>
-      </w:r>
-      <w:r>
-        <w:rPr>
-          <w:w w:val="105"/>
-        </w:rPr>
-        <w:t>de</w:t>
-      </w:r>
-      <w:r>
-        <w:rPr>
-          <w:spacing w:val="-6"/>
-          <w:w w:val="105"/>
-        </w:rPr>
-        <w:t xml:space="preserve"> </w:t>
-      </w:r>
-      <w:r>
-        <w:rPr>
-          <w:w w:val="105"/>
-        </w:rPr>
-        <w:t>Serviços;</w:t>
-      </w:r>
-      <w:r>
-        <w:rPr>
-          <w:spacing w:val="-5"/>
-          <w:w w:val="105"/>
-        </w:rPr>
-        <w:t xml:space="preserve"> </w:t>
-      </w:r>
-      <w:r>
-        <w:rPr>
-          <w:w w:val="105"/>
-        </w:rPr>
-        <w:t>Um</w:t>
-      </w:r>
-      <w:r>
-        <w:rPr>
-          <w:spacing w:val="-6"/>
-          <w:w w:val="105"/>
-        </w:rPr>
-        <w:t xml:space="preserve"> </w:t>
-      </w:r>
-      <w:r>
-        <w:rPr>
-          <w:w w:val="105"/>
-        </w:rPr>
-        <w:t>Sistema</w:t>
-      </w:r>
-      <w:r>
-        <w:rPr>
-          <w:spacing w:val="-6"/>
-          <w:w w:val="105"/>
-        </w:rPr>
-        <w:t xml:space="preserve"> </w:t>
-      </w:r>
-      <w:r>
-        <w:rPr>
-          <w:w w:val="105"/>
-        </w:rPr>
-        <w:t xml:space="preserve">para </w:t>
-      </w:r>
-      <w:r>
-        <w:rPr>
-          <w:spacing w:val="-2"/>
-          <w:w w:val="105"/>
-        </w:rPr>
-        <w:t>Controle</w:t>
-      </w:r>
-      <w:r>
-        <w:rPr>
-          <w:spacing w:val="-9"/>
-          <w:w w:val="105"/>
-        </w:rPr>
-        <w:t xml:space="preserve"> </w:t>
-      </w:r>
-      <w:r>
-        <w:rPr>
-          <w:spacing w:val="-2"/>
-          <w:w w:val="105"/>
-        </w:rPr>
-        <w:t>de</w:t>
-      </w:r>
-      <w:r>
-        <w:rPr>
-          <w:spacing w:val="-9"/>
-          <w:w w:val="105"/>
-        </w:rPr>
-        <w:t xml:space="preserve"> </w:t>
-      </w:r>
-      <w:r>
-        <w:rPr>
-          <w:spacing w:val="-2"/>
-          <w:w w:val="105"/>
-        </w:rPr>
-        <w:t>Processos</w:t>
-      </w:r>
-      <w:r>
-        <w:rPr>
-          <w:spacing w:val="-9"/>
-          <w:w w:val="105"/>
-        </w:rPr>
-        <w:t xml:space="preserve"> </w:t>
-      </w:r>
-      <w:r>
-        <w:rPr>
-          <w:spacing w:val="-2"/>
-          <w:w w:val="105"/>
-        </w:rPr>
-        <w:t>da</w:t>
-      </w:r>
-      <w:r>
-        <w:rPr>
-          <w:spacing w:val="-9"/>
-          <w:w w:val="105"/>
-        </w:rPr>
-        <w:t xml:space="preserve"> </w:t>
-      </w:r>
-      <w:r>
-        <w:rPr>
-          <w:spacing w:val="-2"/>
-          <w:w w:val="105"/>
-        </w:rPr>
-        <w:t>UFES,</w:t>
-      </w:r>
-      <w:r>
-        <w:rPr>
-          <w:spacing w:val="-9"/>
-          <w:w w:val="105"/>
-        </w:rPr>
-        <w:t xml:space="preserve"> </w:t>
-      </w:r>
-      <w:r>
-        <w:rPr>
-          <w:spacing w:val="-2"/>
-          <w:w w:val="105"/>
-        </w:rPr>
-        <w:t>Solução</w:t>
-      </w:r>
-      <w:r>
-        <w:rPr>
-          <w:spacing w:val="-9"/>
-          <w:w w:val="105"/>
-        </w:rPr>
-        <w:t xml:space="preserve"> </w:t>
-      </w:r>
-      <w:r>
-        <w:rPr>
-          <w:spacing w:val="-2"/>
-          <w:w w:val="105"/>
-        </w:rPr>
-        <w:t>de</w:t>
-      </w:r>
-      <w:r>
-        <w:rPr>
-          <w:spacing w:val="-9"/>
-          <w:w w:val="105"/>
-        </w:rPr>
-        <w:t xml:space="preserve"> </w:t>
-      </w:r>
-      <w:r>
-        <w:rPr>
-          <w:spacing w:val="-2"/>
-          <w:w w:val="105"/>
-        </w:rPr>
-        <w:t>Otimização</w:t>
-      </w:r>
-      <w:r>
-        <w:rPr>
-          <w:spacing w:val="-9"/>
-          <w:w w:val="105"/>
-        </w:rPr>
-        <w:t xml:space="preserve"> </w:t>
-      </w:r>
-      <w:r>
-        <w:rPr>
-          <w:spacing w:val="-2"/>
-          <w:w w:val="105"/>
-        </w:rPr>
-        <w:t>para</w:t>
-      </w:r>
-      <w:r>
-        <w:rPr>
-          <w:spacing w:val="-9"/>
-          <w:w w:val="105"/>
-        </w:rPr>
-        <w:t xml:space="preserve"> </w:t>
-      </w:r>
-      <w:r>
-        <w:rPr>
-          <w:spacing w:val="-2"/>
-          <w:w w:val="105"/>
-        </w:rPr>
-        <w:t>Carregamento</w:t>
-      </w:r>
-      <w:r>
-        <w:rPr>
-          <w:spacing w:val="-9"/>
-          <w:w w:val="105"/>
-        </w:rPr>
-        <w:t xml:space="preserve"> </w:t>
-      </w:r>
-      <w:r>
-        <w:rPr>
-          <w:spacing w:val="-2"/>
-          <w:w w:val="105"/>
-        </w:rPr>
-        <w:t>de</w:t>
-      </w:r>
-      <w:r>
-        <w:rPr>
-          <w:spacing w:val="-9"/>
-          <w:w w:val="105"/>
-        </w:rPr>
-        <w:t xml:space="preserve"> </w:t>
-      </w:r>
-      <w:r>
-        <w:rPr>
-          <w:spacing w:val="-2"/>
-          <w:w w:val="105"/>
-        </w:rPr>
-        <w:t xml:space="preserve">Contêineres; </w:t>
-      </w:r>
-      <w:r>
-        <w:rPr>
-          <w:spacing w:val="-4"/>
-          <w:w w:val="105"/>
-        </w:rPr>
-        <w:t>etc.)</w:t>
+        <w:rPr>
+          <w:w w:val="105"/>
+        </w:rPr>
+      </w:pPr>
+    </w:p>
+    <w:p>
+      <w:pPr>
+        <w:pStyle w:val="Ttulo3"/>
+        <w:numPr>
+          <w:ilvl w:val="1"/>
+          <w:numId w:val="16"/>
+        </w:numPr>
+        <w:spacing w:before="2"/>
+        <w:ind w:left="737" w:hanging="737"/>
+      </w:pPr>
+      <w:r>
+        <w:t>Abordagem para desenvolvimento da ontologia</w:t>
       </w:r>
     </w:p>
     <w:p>
       <w:pPr>
         <w:pStyle w:val="Corpodetexto"/>
-        <w:spacing w:before="112" w:line="312" w:lineRule="auto"/>
-        <w:ind w:left="282" w:right="113" w:firstLine="737"/>
+        <w:spacing w:before="100"/>
+        <w:ind w:left="147" w:firstLine="272"/>
         <w:jc w:val="both"/>
-      </w:pPr>
-      <w:r>
-        <w:rPr>
-          <w:w w:val="105"/>
-        </w:rPr>
-        <w:t xml:space="preserve">O capítulo deve ser estruturado em seções de forma a apresentar de forma clara e com todas as informações necessárias, a </w:t>
-      </w:r>
-      <w:r>
-        <w:rPr>
-          <w:w w:val="105"/>
-          <w:u w:val="single"/>
-        </w:rPr>
-        <w:t>contribuição</w:t>
-      </w:r>
-      <w:r>
-        <w:rPr>
-          <w:w w:val="105"/>
-        </w:rPr>
-        <w:t xml:space="preserve"> do trabalho. Por exemplo, caso a contribuição produzida seja um sistema de informação, espera-se que sejam apresentados seus</w:t>
-      </w:r>
-      <w:r>
-        <w:rPr>
-          <w:spacing w:val="-6"/>
-          <w:w w:val="105"/>
-        </w:rPr>
-        <w:t xml:space="preserve"> </w:t>
-      </w:r>
-      <w:r>
-        <w:rPr>
-          <w:w w:val="105"/>
-        </w:rPr>
-        <w:t>requisitos,</w:t>
-      </w:r>
-      <w:r>
-        <w:rPr>
-          <w:spacing w:val="-6"/>
-          <w:w w:val="105"/>
-        </w:rPr>
-        <w:t xml:space="preserve"> </w:t>
-      </w:r>
-      <w:r>
-        <w:rPr>
-          <w:w w:val="105"/>
-        </w:rPr>
-        <w:t>funcionalidades,</w:t>
-      </w:r>
-      <w:r>
-        <w:rPr>
-          <w:spacing w:val="-6"/>
-          <w:w w:val="105"/>
-        </w:rPr>
-        <w:t xml:space="preserve"> </w:t>
-      </w:r>
-      <w:r>
-        <w:rPr>
-          <w:w w:val="105"/>
-        </w:rPr>
-        <w:t>modelos</w:t>
-      </w:r>
-      <w:r>
-        <w:rPr>
-          <w:spacing w:val="-6"/>
-          <w:w w:val="105"/>
-        </w:rPr>
-        <w:t xml:space="preserve"> </w:t>
-      </w:r>
-      <w:r>
-        <w:rPr>
-          <w:w w:val="105"/>
-        </w:rPr>
-        <w:t>(p.ex.,</w:t>
-      </w:r>
-      <w:r>
-        <w:rPr>
-          <w:spacing w:val="-6"/>
-          <w:w w:val="105"/>
-        </w:rPr>
-        <w:t xml:space="preserve"> </w:t>
-      </w:r>
-      <w:r>
-        <w:rPr>
-          <w:w w:val="105"/>
-        </w:rPr>
-        <w:t>modelo</w:t>
-      </w:r>
-      <w:r>
-        <w:rPr>
-          <w:spacing w:val="-6"/>
-          <w:w w:val="105"/>
-        </w:rPr>
-        <w:t xml:space="preserve"> </w:t>
-      </w:r>
-      <w:r>
-        <w:rPr>
-          <w:w w:val="105"/>
-        </w:rPr>
-        <w:t>estrutural,</w:t>
-      </w:r>
-      <w:r>
-        <w:rPr>
-          <w:spacing w:val="-6"/>
-          <w:w w:val="105"/>
-        </w:rPr>
-        <w:t xml:space="preserve"> </w:t>
-      </w:r>
-      <w:r>
-        <w:rPr>
-          <w:w w:val="105"/>
-        </w:rPr>
-        <w:t>modelo</w:t>
-      </w:r>
-      <w:r>
-        <w:rPr>
-          <w:spacing w:val="-6"/>
-          <w:w w:val="105"/>
-        </w:rPr>
-        <w:t xml:space="preserve"> </w:t>
-      </w:r>
-      <w:r>
-        <w:rPr>
-          <w:w w:val="105"/>
-        </w:rPr>
-        <w:t>da</w:t>
-      </w:r>
-      <w:r>
-        <w:rPr>
-          <w:spacing w:val="-6"/>
-          <w:w w:val="105"/>
-        </w:rPr>
-        <w:t xml:space="preserve"> </w:t>
-      </w:r>
-      <w:r>
-        <w:rPr>
-          <w:w w:val="105"/>
-        </w:rPr>
-        <w:t>arquitetura, etc.) e telas do sistema. Caso seja uma plataforma, espera-se que a plataforma como um todo seja apresentada e que seus componentes sejam descritos sejam apropriadamente.</w:t>
-      </w:r>
+        <w:rPr>
+          <w:lang w:val="pt-BR" w:eastAsia="pt-BR"/>
+        </w:rPr>
+      </w:pPr>
+      <w:r>
+        <w:rPr>
+          <w:lang w:val="pt-BR" w:eastAsia="pt-BR"/>
+        </w:rPr>
+        <w:t xml:space="preserve">O desenvolvimento da ontologia proposta neste trabalho foi conduzido com base na </w:t>
+      </w:r>
+      <w:proofErr w:type="spellStart"/>
+      <w:r>
+        <w:rPr>
+          <w:lang w:val="pt-BR" w:eastAsia="pt-BR"/>
+        </w:rPr>
+        <w:t>Systematic</w:t>
+      </w:r>
+      <w:proofErr w:type="spellEnd"/>
+      <w:r>
+        <w:rPr>
+          <w:lang w:val="pt-BR" w:eastAsia="pt-BR"/>
+        </w:rPr>
+        <w:t xml:space="preserve"> Approach for </w:t>
+      </w:r>
+      <w:proofErr w:type="spellStart"/>
+      <w:r>
+        <w:rPr>
+          <w:lang w:val="pt-BR" w:eastAsia="pt-BR"/>
+        </w:rPr>
+        <w:t>Building</w:t>
+      </w:r>
+      <w:proofErr w:type="spellEnd"/>
+      <w:r>
+        <w:rPr>
+          <w:lang w:val="pt-BR" w:eastAsia="pt-BR"/>
+        </w:rPr>
+        <w:t xml:space="preserve"> </w:t>
+      </w:r>
+      <w:proofErr w:type="spellStart"/>
+      <w:r>
+        <w:rPr>
+          <w:lang w:val="pt-BR" w:eastAsia="pt-BR"/>
+        </w:rPr>
+        <w:t>Ontologies</w:t>
+      </w:r>
+      <w:proofErr w:type="spellEnd"/>
+      <w:r>
+        <w:rPr>
+          <w:lang w:val="pt-BR" w:eastAsia="pt-BR"/>
+        </w:rPr>
+        <w:t xml:space="preserve"> (</w:t>
+      </w:r>
+      <w:proofErr w:type="spellStart"/>
+      <w:r>
+        <w:rPr>
+          <w:lang w:val="pt-BR" w:eastAsia="pt-BR"/>
+        </w:rPr>
+        <w:t>SABiO</w:t>
+      </w:r>
+      <w:proofErr w:type="spellEnd"/>
+      <w:r>
+        <w:rPr>
+          <w:lang w:val="pt-BR" w:eastAsia="pt-BR"/>
+        </w:rPr>
+        <w:t xml:space="preserve">), apresentada por </w:t>
+      </w:r>
+      <w:proofErr w:type="spellStart"/>
+      <w:r>
+        <w:rPr>
+          <w:lang w:val="pt-BR" w:eastAsia="pt-BR"/>
+        </w:rPr>
+        <w:t>Falbo</w:t>
+      </w:r>
+      <w:proofErr w:type="spellEnd"/>
+      <w:r>
+        <w:rPr>
+          <w:lang w:val="pt-BR" w:eastAsia="pt-BR"/>
+        </w:rPr>
+        <w:t xml:space="preserve"> (2014). A abordagem organiza a construção de ontologias por meio de um processo sistemático, envolvendo atividades de desenvolvimento e processos de apoio que acompanham a construção do artefato ontológico. Conforme apresentado no referencial teórico, o processo de desenvolvimento parte do levantamento dos requisitos e da identificação do propósito da ontologia, avança para a captura e formalização do conhecimento e resulta, inicialmente, na construção de uma ontologia de referência</w:t>
+      </w:r>
+      <w:r>
+        <w:rPr>
+          <w:lang w:val="pt-BR" w:eastAsia="pt-BR"/>
+        </w:rPr>
+        <w:t>.</w:t>
+      </w:r>
+    </w:p>
+    <w:p>
+      <w:pPr>
+        <w:pStyle w:val="Corpodetexto"/>
+        <w:spacing w:before="100"/>
+        <w:ind w:left="147" w:firstLine="272"/>
+        <w:jc w:val="both"/>
+        <w:rPr>
+          <w:lang w:val="pt-BR" w:eastAsia="pt-BR"/>
+        </w:rPr>
+      </w:pPr>
+      <w:r>
+        <w:rPr>
+          <w:lang w:val="pt-BR" w:eastAsia="pt-BR"/>
+        </w:rPr>
+        <w:t xml:space="preserve">A </w:t>
+      </w:r>
+      <w:proofErr w:type="spellStart"/>
+      <w:r>
+        <w:rPr>
+          <w:lang w:val="pt-BR" w:eastAsia="pt-BR"/>
+        </w:rPr>
+        <w:t>SABiO</w:t>
+      </w:r>
+      <w:proofErr w:type="spellEnd"/>
+      <w:r>
+        <w:rPr>
+          <w:lang w:val="pt-BR" w:eastAsia="pt-BR"/>
+        </w:rPr>
+        <w:t xml:space="preserve"> prevê ainda etapas posteriores relacionadas ao design e </w:t>
+      </w:r>
+      <w:r>
+        <w:rPr>
+          <w:lang w:val="pt-BR" w:eastAsia="pt-BR"/>
+        </w:rPr>
+        <w:t>a</w:t>
+      </w:r>
+      <w:r>
+        <w:rPr>
+          <w:lang w:val="pt-BR" w:eastAsia="pt-BR"/>
+        </w:rPr>
+        <w:t xml:space="preserve"> implementação, n</w:t>
+      </w:r>
+      <w:r>
+        <w:rPr>
+          <w:lang w:val="pt-BR" w:eastAsia="pt-BR"/>
+        </w:rPr>
+        <w:t>o</w:t>
+      </w:r>
+      <w:r>
+        <w:rPr>
+          <w:lang w:val="pt-BR" w:eastAsia="pt-BR"/>
+        </w:rPr>
+        <w:t xml:space="preserve">s quais a ontologia de referência pode ser transformada em uma representação voltada ao uso computacional, resultando, por exemplo, em uma ontologia operacional. </w:t>
+      </w:r>
+      <w:r>
+        <w:rPr>
+          <w:lang w:val="pt-BR" w:eastAsia="pt-BR"/>
+        </w:rPr>
+        <w:t>Apoiando</w:t>
+      </w:r>
+      <w:r>
+        <w:rPr>
+          <w:lang w:val="pt-BR" w:eastAsia="pt-BR"/>
+        </w:rPr>
+        <w:t xml:space="preserve"> </w:t>
+      </w:r>
+      <w:r>
+        <w:rPr>
+          <w:lang w:val="pt-BR" w:eastAsia="pt-BR"/>
+        </w:rPr>
+        <w:t>a</w:t>
+      </w:r>
+      <w:r>
+        <w:rPr>
+          <w:lang w:val="pt-BR" w:eastAsia="pt-BR"/>
+        </w:rPr>
+        <w:t xml:space="preserve">s atividades de desenvolvimento, a abordagem </w:t>
+      </w:r>
+      <w:r>
+        <w:rPr>
+          <w:lang w:val="pt-BR" w:eastAsia="pt-BR"/>
+        </w:rPr>
+        <w:t>oferece</w:t>
+      </w:r>
+      <w:r>
+        <w:rPr>
+          <w:lang w:val="pt-BR" w:eastAsia="pt-BR"/>
+        </w:rPr>
+        <w:t xml:space="preserve"> processos de apoio, como aquisição de conhecimento, documentação, gerenciamento de configuração, avaliação e </w:t>
+      </w:r>
+      <w:proofErr w:type="spellStart"/>
+      <w:r>
+        <w:rPr>
+          <w:lang w:val="pt-BR" w:eastAsia="pt-BR"/>
+        </w:rPr>
+        <w:t>reúso</w:t>
+      </w:r>
+      <w:proofErr w:type="spellEnd"/>
+      <w:r>
+        <w:rPr>
+          <w:lang w:val="pt-BR" w:eastAsia="pt-BR"/>
+        </w:rPr>
+        <w:t>. Esses processos não necessariamente ocorrem de maneira isolada ou estritamente sequencial, podendo acompanhar diferentes momentos do desenvolvimento da ontologia. No próprio referencial deste trabalho, esses processos são apresentados como mecanismos de suporte à construção e à avaliação do modelo.</w:t>
+      </w:r>
+    </w:p>
+    <w:p>
+      <w:pPr>
+        <w:pStyle w:val="Corpodetexto"/>
+        <w:spacing w:before="100"/>
+        <w:ind w:left="147" w:firstLine="272"/>
+        <w:jc w:val="both"/>
+        <w:rPr>
+          <w:lang w:val="pt-BR" w:eastAsia="pt-BR"/>
+        </w:rPr>
+      </w:pPr>
+      <w:r>
+        <w:rPr>
+          <w:lang w:val="pt-BR" w:eastAsia="pt-BR"/>
+        </w:rPr>
+        <w:t xml:space="preserve">Considerando que o objetivo deste trabalho é desenvolver uma ontologia de referência para o domínio do Juizado Especial Federal Cível, foram adotadas principalmente as atividades da </w:t>
+      </w:r>
+      <w:proofErr w:type="spellStart"/>
+      <w:r>
+        <w:rPr>
+          <w:lang w:val="pt-BR" w:eastAsia="pt-BR"/>
+        </w:rPr>
+        <w:t>SABiO</w:t>
+      </w:r>
+      <w:proofErr w:type="spellEnd"/>
+      <w:r>
+        <w:rPr>
+          <w:lang w:val="pt-BR" w:eastAsia="pt-BR"/>
+        </w:rPr>
+        <w:t xml:space="preserve"> relacionadas à identificação do propósito e levantamento dos requisitos, aquisição do conhecimento, captura e formalização do domínio, </w:t>
+      </w:r>
+      <w:proofErr w:type="spellStart"/>
+      <w:r>
+        <w:rPr>
+          <w:lang w:val="pt-BR" w:eastAsia="pt-BR"/>
+        </w:rPr>
+        <w:t>reúso</w:t>
+      </w:r>
+      <w:proofErr w:type="spellEnd"/>
+      <w:r>
+        <w:rPr>
+          <w:lang w:val="pt-BR" w:eastAsia="pt-BR"/>
+        </w:rPr>
+        <w:t>, modelagem conceitual e avaliação. As etapas destinadas ao design e à implementação de uma ontologia operacional não integram o escopo deste trabalho.</w:t>
+      </w:r>
+      <w:r>
+        <w:rPr>
+          <w:lang w:val="pt-BR" w:eastAsia="pt-BR"/>
+        </w:rPr>
+        <w:t xml:space="preserve"> </w:t>
+      </w:r>
+      <w:r>
+        <w:rPr>
+          <w:lang w:val="pt-BR" w:eastAsia="pt-BR"/>
+        </w:rPr>
+        <w:t>Nas seções seguintes, são descritas as atividades realizadas durante esse processo, iniciando-se pela definição do propósito e pela delimitação do domínio da ontologia, seguida da aquisição do conhecimento, do levantamento das Questões de Competência e da captura e modelagem dos conceitos identificados.</w:t>
+      </w:r>
+    </w:p>
+    <w:p>
+      <w:pPr>
+        <w:pStyle w:val="Corpodetexto"/>
+        <w:spacing w:line="312" w:lineRule="auto"/>
+        <w:jc w:val="both"/>
+      </w:pPr>
+    </w:p>
+    <w:p>
+      <w:pPr>
+        <w:pStyle w:val="Ttulo3"/>
+        <w:numPr>
+          <w:ilvl w:val="1"/>
+          <w:numId w:val="16"/>
+        </w:numPr>
+        <w:spacing w:before="2"/>
+        <w:ind w:left="737" w:hanging="737"/>
+      </w:pPr>
+      <w:r>
+        <w:t>Propósito e delimitação do domínio</w:t>
+      </w:r>
+    </w:p>
+    <w:p>
+      <w:pPr>
+        <w:pStyle w:val="Corpodetexto"/>
+        <w:spacing w:before="100"/>
+        <w:ind w:left="147" w:firstLine="272"/>
+        <w:jc w:val="both"/>
+        <w:rPr>
+          <w:lang w:val="pt-BR" w:eastAsia="pt-BR"/>
+        </w:rPr>
+      </w:pPr>
+      <w:r>
+        <w:rPr>
+          <w:lang w:val="pt-BR" w:eastAsia="pt-BR"/>
+        </w:rPr>
+        <w:t xml:space="preserve">Esta seção corresponde à etapa de levantamento de requisitos e identificação do propósito da ontologia prevista pela </w:t>
+      </w:r>
+      <w:proofErr w:type="spellStart"/>
+      <w:r>
+        <w:rPr>
+          <w:lang w:val="pt-BR" w:eastAsia="pt-BR"/>
+        </w:rPr>
+        <w:t>SABiO</w:t>
+      </w:r>
+      <w:proofErr w:type="spellEnd"/>
+      <w:r>
+        <w:rPr>
+          <w:lang w:val="pt-BR" w:eastAsia="pt-BR"/>
+        </w:rPr>
+        <w:t>. Nessa etapa são estabelecidos o objetivo do artefato a ser desenvolvido, o domínio que será representado e os limites de seu escopo, de modo a orientar as atividades posteriores de aquisição de conhecimento e modelagem.</w:t>
+      </w:r>
+    </w:p>
+    <w:p>
+      <w:pPr>
+        <w:pStyle w:val="Corpodetexto"/>
+        <w:spacing w:before="100"/>
+        <w:ind w:left="147" w:firstLine="272"/>
+        <w:jc w:val="both"/>
+        <w:rPr>
+          <w:lang w:val="pt-BR" w:eastAsia="pt-BR"/>
+        </w:rPr>
+      </w:pPr>
+      <w:r>
+        <w:rPr>
+          <w:lang w:val="pt-BR" w:eastAsia="pt-BR"/>
+        </w:rPr>
+        <w:t>A ontologia desenvolvida neste trabalho tem como propósito representar, de forma conceitual e estruturada, o domínio do Juizado Especial Federal Cível, organizando os principais elementos envolvidos no funcionamento e na tramitação de uma demanda judicial nesse contexto. Busca-se explicitar os conceitos e relações existentes entre os participantes do processo, seus papéis, as demandas apresentadas, os atos praticados, as provas produzidas, as decisões proferidas e os mecanismos de impugnação e cumprimento.</w:t>
+      </w:r>
+    </w:p>
+    <w:p>
+      <w:pPr>
+        <w:pStyle w:val="Corpodetexto"/>
+        <w:spacing w:before="100"/>
+        <w:ind w:left="147" w:firstLine="272"/>
+        <w:jc w:val="both"/>
+        <w:rPr>
+          <w:lang w:val="pt-BR" w:eastAsia="pt-BR"/>
+        </w:rPr>
+      </w:pPr>
+      <w:r>
+        <w:rPr>
+          <w:lang w:val="pt-BR" w:eastAsia="pt-BR"/>
+        </w:rPr>
+        <w:t>A definição do escopo partiu da necessidade de estabelecer um recorte do domínio jurídico que fosse suficientemente abrangente para representar o funcionamento do Juizado Especial Federal Cível, sem pretender modelar todo o Direito Processual Civil ou toda a estrutura da Justiça Federal. Dessa forma, o trabalho concentrou-se no percurso de uma demanda no JEF Cível, desde sua propositura até os possíveis desdobramentos decorrentes da decisão judicial.</w:t>
+      </w:r>
+    </w:p>
+    <w:p>
+      <w:pPr>
+        <w:pStyle w:val="Corpodetexto"/>
+        <w:spacing w:before="100"/>
+        <w:ind w:left="147" w:firstLine="272"/>
+        <w:jc w:val="both"/>
+        <w:rPr>
+          <w:lang w:val="pt-BR" w:eastAsia="pt-BR"/>
+        </w:rPr>
+      </w:pPr>
+      <w:r>
+        <w:rPr>
+          <w:lang w:val="pt-BR" w:eastAsia="pt-BR"/>
+        </w:rPr>
+        <w:t xml:space="preserve">Foram considerados no escopo conceitos relacionados aos sujeitos e papéis processuais, ação judicial, competência do Juizado, pedidos, tutela provisória, atos processuais, fases e estados do processo, produção de provas, conciliação, sentença, obrigações decorrentes da decisão, recursos </w:t>
+      </w:r>
+      <w:r>
+        <w:rPr>
+          <w:lang w:val="pt-BR" w:eastAsia="pt-BR"/>
+        </w:rPr>
+        <w:lastRenderedPageBreak/>
+        <w:t>e cumprimento da decisão. Também foram contemplados os órgãos e agentes que participam desses procedimentos, sempre na medida necessária para representar as relações relevantes ao domínio estudado.</w:t>
+      </w:r>
+    </w:p>
+    <w:p>
+      <w:pPr>
+        <w:pStyle w:val="Corpodetexto"/>
+        <w:spacing w:before="100"/>
+        <w:ind w:left="147" w:firstLine="272"/>
+        <w:jc w:val="both"/>
+        <w:rPr>
+          <w:lang w:val="pt-BR" w:eastAsia="pt-BR"/>
+        </w:rPr>
+      </w:pPr>
+      <w:r>
+        <w:rPr>
+          <w:lang w:val="pt-BR" w:eastAsia="pt-BR"/>
+        </w:rPr>
+        <w:t>Essa delimitação orientou tanto a formulação das Questões de Competência quanto a identificação inicial dos conceitos e relações posteriormente refinados durante a modelagem ontológica. Assim, elementos que não contribuíam diretamente para responder às questões definidas ou que pertenciam a outros ramos e procedimentos da Justiça Federal permaneceram fora do escopo da ontologia</w:t>
+      </w:r>
+      <w:r>
+        <w:rPr>
+          <w:lang w:val="pt-BR" w:eastAsia="pt-BR"/>
+        </w:rPr>
+        <w:t>.</w:t>
+      </w:r>
+    </w:p>
+    <w:p>
+      <w:pPr>
+        <w:pStyle w:val="Corpodetexto"/>
+        <w:spacing w:line="312" w:lineRule="auto"/>
+        <w:jc w:val="both"/>
+      </w:pPr>
+    </w:p>
+    <w:p>
+      <w:pPr>
+        <w:pStyle w:val="Ttulo3"/>
+        <w:numPr>
+          <w:ilvl w:val="1"/>
+          <w:numId w:val="16"/>
+        </w:numPr>
+        <w:spacing w:before="2"/>
+        <w:ind w:left="737" w:hanging="737"/>
+      </w:pPr>
+      <w:r>
+        <w:t>Aquisição do conhecimento do domínio</w:t>
+      </w:r>
+    </w:p>
+    <w:p>
+      <w:pPr>
+        <w:pStyle w:val="Corpodetexto"/>
+        <w:spacing w:before="100"/>
+        <w:ind w:left="147" w:firstLine="272"/>
+        <w:jc w:val="both"/>
+        <w:rPr>
+          <w:lang w:val="pt-BR" w:eastAsia="pt-BR"/>
+        </w:rPr>
+      </w:pPr>
+      <w:r>
+        <w:rPr>
+          <w:lang w:val="pt-BR" w:eastAsia="pt-BR"/>
+        </w:rPr>
+        <w:t xml:space="preserve">A </w:t>
+      </w:r>
+      <w:r>
+        <w:rPr>
+          <w:lang w:val="pt-BR" w:eastAsia="pt-BR"/>
+        </w:rPr>
+        <w:t>N</w:t>
+      </w:r>
+      <w:r>
+        <w:rPr>
+          <w:lang w:val="pt-BR" w:eastAsia="pt-BR"/>
+        </w:rPr>
+        <w:t>o</w:t>
+      </w:r>
+      <w:r>
+        <w:rPr>
+          <w:lang w:val="pt-BR" w:eastAsia="pt-BR"/>
+        </w:rPr>
+        <w:t xml:space="preserve"> </w:t>
+      </w:r>
+      <w:proofErr w:type="spellStart"/>
+      <w:r>
+        <w:rPr>
+          <w:lang w:val="pt-BR" w:eastAsia="pt-BR"/>
+        </w:rPr>
+        <w:t>SABiO</w:t>
+      </w:r>
+      <w:proofErr w:type="spellEnd"/>
+      <w:r>
+        <w:rPr>
+          <w:lang w:val="pt-BR" w:eastAsia="pt-BR"/>
+        </w:rPr>
+        <w:t>, a aquisição de conhecimento é caracterizada como um processo de apoio ao desenvolvimento da ontologia, podendo ocorrer ao longo das diferentes atividades de construção do modelo. Neste trabalho, esse processo teve papel especialmente relevante nas etapas de definição dos requisitos e de captura da ontologia, uma vez que forneceu o conhecimento necessário para a identificação dos conceitos, relações e restrições existentes no domínio do Juizado Especial Federal Cível.</w:t>
+      </w:r>
+    </w:p>
+    <w:p>
+      <w:pPr>
+        <w:pStyle w:val="Corpodetexto"/>
+        <w:spacing w:before="100"/>
+        <w:ind w:left="147" w:firstLine="272"/>
+        <w:jc w:val="both"/>
+        <w:rPr>
+          <w:lang w:val="pt-BR" w:eastAsia="pt-BR"/>
+        </w:rPr>
+      </w:pPr>
+      <w:r>
+        <w:rPr>
+          <w:lang w:val="pt-BR" w:eastAsia="pt-BR"/>
+        </w:rPr>
+        <w:t>A aquisição do conhecimento necessário à construção da ontologia foi realizada por meio de pesquisa bibliográfica e análise documental. Para a compreensão do domínio jurídico, foram consideradas principalmente a Lei nº 10.259/2001, que institui os Juizados Especiais Cíveis e Criminais no âmbito da Justiça Federal, e a Lei nº 9.099/1995, aplicada subsidiariamente aos Juizados Especiais Federais quando não houver conflito com a legislação específica</w:t>
+      </w:r>
+      <w:r>
+        <w:rPr>
+          <w:lang w:val="pt-BR" w:eastAsia="pt-BR"/>
+        </w:rPr>
+        <w:t>.</w:t>
+      </w:r>
+    </w:p>
+    <w:p>
+      <w:pPr>
+        <w:pStyle w:val="Corpodetexto"/>
+        <w:spacing w:before="100"/>
+        <w:ind w:left="147" w:firstLine="272"/>
+        <w:jc w:val="both"/>
+        <w:rPr>
+          <w:lang w:val="pt-BR" w:eastAsia="pt-BR"/>
+        </w:rPr>
+      </w:pPr>
+      <w:r>
+        <w:rPr>
+          <w:lang w:val="pt-BR" w:eastAsia="pt-BR"/>
+        </w:rPr>
+        <w:t xml:space="preserve">Também foram utilizados trabalhos da literatura jurídica voltados ao funcionamento e às características dos Juizados Especiais Federais, especialmente quanto à competência, aos sujeitos processuais, ao procedimento, aos atos praticados e aos mecanismos de acesso à justiça. Entre esses trabalhos, destaca-se o estudo de Ribeiro e </w:t>
+      </w:r>
+      <w:proofErr w:type="spellStart"/>
+      <w:r>
+        <w:rPr>
+          <w:lang w:val="pt-BR" w:eastAsia="pt-BR"/>
+        </w:rPr>
+        <w:t>Sanzovo</w:t>
+      </w:r>
+      <w:proofErr w:type="spellEnd"/>
+      <w:r>
+        <w:rPr>
+          <w:lang w:val="pt-BR" w:eastAsia="pt-BR"/>
+        </w:rPr>
+        <w:t xml:space="preserve"> (2011), utilizado como apoio para a compreensão da estrutura e das particularidades do Juizado Especial Federal Cível.</w:t>
+      </w:r>
+    </w:p>
+    <w:p>
+      <w:pPr>
+        <w:pStyle w:val="Corpodetexto"/>
+        <w:spacing w:before="100"/>
+        <w:ind w:left="147" w:firstLine="272"/>
+        <w:jc w:val="both"/>
+        <w:rPr>
+          <w:lang w:val="pt-BR" w:eastAsia="pt-BR"/>
+        </w:rPr>
+      </w:pPr>
+      <w:r>
+        <w:rPr>
+          <w:lang w:val="pt-BR" w:eastAsia="pt-BR"/>
+        </w:rPr>
+        <w:t>Além da análise das fontes documentais e bibliográficas, o desenvolvimento contou com acompanhamento e validação por especialista</w:t>
+      </w:r>
+      <w:r>
+        <w:rPr>
+          <w:lang w:val="pt-BR" w:eastAsia="pt-BR"/>
+        </w:rPr>
+        <w:t>s</w:t>
+      </w:r>
+      <w:r>
+        <w:rPr>
+          <w:lang w:val="pt-BR" w:eastAsia="pt-BR"/>
+        </w:rPr>
+        <w:t xml:space="preserve"> do domínio jurídico, que auxiliou na verificação da adequação dos conceitos, relações e situações processuais representadas. Essa participação contribuiu para confrontar a modelagem com a prática jurídica e para identificar eventuais imprecisões ou lacunas durante o refinamento da ontologia.</w:t>
+      </w:r>
+      <w:bookmarkStart w:id="25" w:name="_GoBack"/>
+      <w:bookmarkEnd w:id="25"/>
+    </w:p>
+    <w:p>
+      <w:pPr>
+        <w:pStyle w:val="Corpodetexto"/>
+        <w:spacing w:before="100"/>
+        <w:ind w:left="147" w:firstLine="272"/>
+        <w:jc w:val="both"/>
+        <w:rPr>
+          <w:lang w:val="pt-BR" w:eastAsia="pt-BR"/>
+        </w:rPr>
+      </w:pPr>
+      <w:r>
+        <w:rPr>
+          <w:lang w:val="pt-BR" w:eastAsia="pt-BR"/>
+        </w:rPr>
+        <w:t xml:space="preserve">No âmbito da modelagem ontológica, foram utilizadas como referências a UFO e a </w:t>
+      </w:r>
+      <w:proofErr w:type="spellStart"/>
+      <w:r>
+        <w:rPr>
+          <w:lang w:val="pt-BR" w:eastAsia="pt-BR"/>
+        </w:rPr>
+        <w:t>OntoUML</w:t>
+      </w:r>
+      <w:proofErr w:type="spellEnd"/>
+      <w:r>
+        <w:rPr>
+          <w:lang w:val="pt-BR" w:eastAsia="pt-BR"/>
+        </w:rPr>
+        <w:t xml:space="preserve">, bem como a UFO-L, proposta por </w:t>
+      </w:r>
+      <w:proofErr w:type="spellStart"/>
+      <w:r>
+        <w:rPr>
+          <w:lang w:val="pt-BR" w:eastAsia="pt-BR"/>
+        </w:rPr>
+        <w:t>Griffo</w:t>
+      </w:r>
+      <w:proofErr w:type="spellEnd"/>
+      <w:r>
+        <w:rPr>
+          <w:lang w:val="pt-BR" w:eastAsia="pt-BR"/>
+        </w:rPr>
+        <w:t xml:space="preserve"> (2018), que fornece conceitos jurídicos gerais reutilizáveis em ontologias de domínio. Também foi analisada a </w:t>
+      </w:r>
+      <w:proofErr w:type="spellStart"/>
+      <w:r>
+        <w:rPr>
+          <w:lang w:val="pt-BR" w:eastAsia="pt-BR"/>
+        </w:rPr>
+        <w:t>OntoRS</w:t>
+      </w:r>
+      <w:proofErr w:type="spellEnd"/>
+      <w:r>
+        <w:rPr>
+          <w:lang w:val="pt-BR" w:eastAsia="pt-BR"/>
+        </w:rPr>
+        <w:t>, desenvolvida para representar aspectos relacionados aos recursos no contexto dos Juizados Especiais Federais, servindo como referência para a análise de conceitos e decisões de modelagem já aplicadas ao domínio jurídico. O conhecimento obtido por meio dessas fontes foi utilizado como base para a formulação das Questões de Competência e para a identificação inicial dos conceitos e relações posteriormente refinados na modelagem da ontologia</w:t>
+      </w:r>
+      <w:r>
+        <w:rPr>
+          <w:lang w:val="pt-BR" w:eastAsia="pt-BR"/>
+        </w:rPr>
+        <w:t>.</w:t>
+      </w:r>
+    </w:p>
+    <w:p>
+      <w:pPr>
+        <w:pStyle w:val="Corpodetexto"/>
+        <w:spacing w:line="312" w:lineRule="auto"/>
+        <w:jc w:val="both"/>
+      </w:pPr>
     </w:p>
     <w:p>
       <w:pPr>
@@ -53735,7 +53894,7 @@
           </mc:Choice>
           <mc:Fallback>
             <w:pict>
-              <v:rect w14:anchorId="0BB80274" id="Shape 61" o:spid="_x0000_s1026" style="position:absolute;margin-left:774.95pt;margin-top:83.95pt;width:18pt;height:182.25pt;z-index:251657216;visibility:visible;mso-wrap-style:square;mso-wrap-distance-left:0;mso-wrap-distance-top:0;mso-wrap-distance-right:0;mso-wrap-distance-bottom:0;mso-position-horizontal:absolute;mso-position-horizontal-relative:page;mso-position-vertical:absolute;mso-position-vertical-relative:page;v-text-anchor:top" o:gfxdata="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" filled="f" stroked="f">
+              <v:rect w14:anchorId="724BBACC" id="Shape 61" o:spid="_x0000_s1026" style="position:absolute;margin-left:774.95pt;margin-top:83.95pt;width:18pt;height:182.25pt;z-index:251657216;visibility:visible;mso-wrap-style:square;mso-wrap-distance-left:0;mso-wrap-distance-top:0;mso-wrap-distance-right:0;mso-wrap-distance-bottom:0;mso-position-horizontal:absolute;mso-position-horizontal-relative:page;mso-position-vertical:absolute;mso-position-vertical-relative:page;v-text-anchor:top" o:gfxdata="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" filled="f" stroked="f">
                 <v:textbox inset="0,0,0,0"/>
                 <w10:wrap anchorx="page" anchory="page"/>
               </v:rect>
@@ -53786,7 +53945,7 @@
           </mc:Choice>
           <mc:Fallback>
             <w:pict>
-              <v:rect w14:anchorId="34502F25" id="Shape 62" o:spid="_x0000_s1026" style="position:absolute;margin-left:777.1pt;margin-top:527.3pt;width:16.5pt;height:12pt;z-index:251658240;visibility:visible;mso-wrap-style:square;mso-wrap-distance-left:0;mso-wrap-distance-top:0;mso-wrap-distance-right:0;mso-wrap-distance-bottom:0;mso-position-horizontal:absolute;mso-position-horizontal-relative:page;mso-position-vertical:absolute;mso-position-vertical-relative:page;v-text-anchor:top" o:gfxdata="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" filled="f" stroked="f">
+              <v:rect w14:anchorId="39222E86" id="Shape 62" o:spid="_x0000_s1026" style="position:absolute;margin-left:777.1pt;margin-top:527.3pt;width:16.5pt;height:12pt;z-index:251658240;visibility:visible;mso-wrap-style:square;mso-wrap-distance-left:0;mso-wrap-distance-top:0;mso-wrap-distance-right:0;mso-wrap-distance-bottom:0;mso-position-horizontal:absolute;mso-position-horizontal-relative:page;mso-position-vertical:absolute;mso-position-vertical-relative:page;v-text-anchor:top" o:gfxdata="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" filled="f" stroked="f">
                 <v:textbox inset="0,0,0,0"/>
                 <w10:wrap anchorx="page" anchory="page"/>
               </v:rect>
@@ -58918,7 +59077,7 @@
         </mc:Choice>
         <mc:Fallback>
           <w:pict>
-            <v:rect w14:anchorId="1BA9BCDD" id="Shape 2" o:spid="_x0000_s1026" style="position:absolute;margin-left:264.7pt;margin-top:79.45pt;width:93.85pt;height:23pt;z-index:-251665920;visibility:visible;mso-wrap-style:square;mso-wrap-distance-left:0;mso-wrap-distance-top:0;mso-wrap-distance-right:0;mso-wrap-distance-bottom:0;mso-position-horizontal:absolute;mso-position-horizontal-relative:page;mso-position-vertical:absolute;mso-position-vertical-relative:page;v-text-anchor:top" o:gfxdata="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" filled="f" stroked="f">
+            <v:rect w14:anchorId="290B6A9E" id="Shape 2" o:spid="_x0000_s1026" style="position:absolute;margin-left:264.7pt;margin-top:79.45pt;width:93.85pt;height:23pt;z-index:-251665920;visibility:visible;mso-wrap-style:square;mso-wrap-distance-left:0;mso-wrap-distance-top:0;mso-wrap-distance-right:0;mso-wrap-distance-bottom:0;mso-position-horizontal:absolute;mso-position-horizontal-relative:page;mso-position-vertical:absolute;mso-position-vertical-relative:page;v-text-anchor:top" o:gfxdata="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" filled="f" stroked="f">
               <v:textbox inset="0,0,0,0"/>
               <w10:wrap anchorx="page" anchory="page"/>
             </v:rect>
@@ -59012,7 +59171,7 @@
         </mc:Choice>
         <mc:Fallback>
           <w:pict>
-            <v:rect w14:anchorId="3E43736C" id="Shape 10" o:spid="_x0000_s1026" style="position:absolute;margin-left:525.3pt;margin-top:48.7pt;width:17pt;height:16.15pt;z-index:-251670528;visibility:visible;mso-wrap-style:square;mso-wrap-distance-left:0;mso-wrap-distance-top:0;mso-wrap-distance-right:0;mso-wrap-distance-bottom:0;mso-position-horizontal:absolute;mso-position-horizontal-relative:page;mso-position-vertical:absolute;mso-position-vertical-relative:page;v-text-anchor:top" o:gfxdata="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" filled="f" stroked="f">
+            <v:rect w14:anchorId="6E01B536" id="Shape 10" o:spid="_x0000_s1026" style="position:absolute;margin-left:525.3pt;margin-top:48.7pt;width:17pt;height:16.15pt;z-index:-251670528;visibility:visible;mso-wrap-style:square;mso-wrap-distance-left:0;mso-wrap-distance-top:0;mso-wrap-distance-right:0;mso-wrap-distance-bottom:0;mso-position-horizontal:absolute;mso-position-horizontal-relative:page;mso-position-vertical:absolute;mso-position-vertical-relative:page;v-text-anchor:top" o:gfxdata="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" filled="f" stroked="f">
               <v:textbox inset="0,0,0,0"/>
               <w10:wrap anchorx="page" anchory="page"/>
             </v:rect>
@@ -59078,7 +59237,7 @@
         </mc:Choice>
         <mc:Fallback>
           <w:pict>
-            <v:rect w14:anchorId="2D1C98A8" id="Shape 11" o:spid="_x0000_s1026" style="position:absolute;margin-left:83.95pt;margin-top:48.7pt;width:104.25pt;height:16.1pt;z-index:-251648000;visibility:visible;mso-wrap-style:square;mso-wrap-distance-left:0;mso-wrap-distance-top:0;mso-wrap-distance-right:0;mso-wrap-distance-bottom:0;mso-position-horizontal:absolute;mso-position-horizontal-relative:page;mso-position-vertical:absolute;mso-position-vertical-relative:page;v-text-anchor:top" o:gfxdata="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" filled="f" stroked="f">
+            <v:rect w14:anchorId="60B3BE04" id="Shape 11" o:spid="_x0000_s1026" style="position:absolute;margin-left:83.95pt;margin-top:48.7pt;width:104.25pt;height:16.1pt;z-index:-251648000;visibility:visible;mso-wrap-style:square;mso-wrap-distance-left:0;mso-wrap-distance-top:0;mso-wrap-distance-right:0;mso-wrap-distance-bottom:0;mso-position-horizontal:absolute;mso-position-horizontal-relative:page;mso-position-vertical:absolute;mso-position-vertical-relative:page;v-text-anchor:top" o:gfxdata="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" filled="f" stroked="f">
               <v:textbox inset="0,0,0,0"/>
               <w10:wrap anchorx="page" anchory="page"/>
             </v:rect>
@@ -59130,7 +59289,7 @@
         </mc:Choice>
         <mc:Fallback>
           <w:pict>
-            <v:rect w14:anchorId="117B0764" id="Shape 12" o:spid="_x0000_s1026" style="position:absolute;margin-left:527.3pt;margin-top:48.7pt;width:12pt;height:16.15pt;z-index:-251625472;visibility:visible;mso-wrap-style:square;mso-wrap-distance-left:0;mso-wrap-distance-top:0;mso-wrap-distance-right:0;mso-wrap-distance-bottom:0;mso-position-horizontal:absolute;mso-position-horizontal-relative:page;mso-position-vertical:absolute;mso-position-vertical-relative:page;v-text-anchor:top" o:gfxdata="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" filled="f" stroked="f">
+            <v:rect w14:anchorId="29F97DAA" id="Shape 12" o:spid="_x0000_s1026" style="position:absolute;margin-left:527.3pt;margin-top:48.7pt;width:12pt;height:16.15pt;z-index:-251625472;visibility:visible;mso-wrap-style:square;mso-wrap-distance-left:0;mso-wrap-distance-top:0;mso-wrap-distance-right:0;mso-wrap-distance-bottom:0;mso-position-horizontal:absolute;mso-position-horizontal-relative:page;mso-position-vertical:absolute;mso-position-vertical-relative:page;v-text-anchor:top" o:gfxdata="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" filled="f" stroked="f">
               <v:textbox inset="0,0,0,0"/>
               <w10:wrap anchorx="page" anchory="page"/>
             </v:rect>
@@ -59196,7 +59355,7 @@
         </mc:Choice>
         <mc:Fallback>
           <w:pict>
-            <v:rect w14:anchorId="57C135D3" id="Shape 16" o:spid="_x0000_s1026" style="position:absolute;margin-left:525.3pt;margin-top:48.7pt;width:17pt;height:16.15pt;z-index:-251660800;visibility:visible;mso-wrap-style:square;mso-wrap-distance-left:0;mso-wrap-distance-top:0;mso-wrap-distance-right:0;mso-wrap-distance-bottom:0;mso-position-horizontal:absolute;mso-position-horizontal-relative:page;mso-position-vertical:absolute;mso-position-vertical-relative:page;v-text-anchor:top" o:gfxdata="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" filled="f" stroked="f">
+            <v:rect w14:anchorId="5231098F" id="Shape 16" o:spid="_x0000_s1026" style="position:absolute;margin-left:525.3pt;margin-top:48.7pt;width:17pt;height:16.15pt;z-index:-251660800;visibility:visible;mso-wrap-style:square;mso-wrap-distance-left:0;mso-wrap-distance-top:0;mso-wrap-distance-right:0;mso-wrap-distance-bottom:0;mso-position-horizontal:absolute;mso-position-horizontal-relative:page;mso-position-vertical:absolute;mso-position-vertical-relative:page;v-text-anchor:top" o:gfxdata="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" filled="f" stroked="f">
               <v:textbox inset="0,0,0,0"/>
               <w10:wrap anchorx="page" anchory="page"/>
             </v:rect>
@@ -59262,7 +59421,7 @@
         </mc:Choice>
         <mc:Fallback>
           <w:pict>
-            <v:rect w14:anchorId="2F13641F" id="Shape 15" o:spid="_x0000_s1026" style="position:absolute;margin-left:525.3pt;margin-top:48.7pt;width:17pt;height:16.15pt;z-index:-251659776;visibility:visible;mso-wrap-style:square;mso-wrap-distance-left:0;mso-wrap-distance-top:0;mso-wrap-distance-right:0;mso-wrap-distance-bottom:0;mso-position-horizontal:absolute;mso-position-horizontal-relative:page;mso-position-vertical:absolute;mso-position-vertical-relative:page;v-text-anchor:top" o:gfxdata="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" filled="f" stroked="f">
+            <v:rect w14:anchorId="060A90FC" id="Shape 15" o:spid="_x0000_s1026" style="position:absolute;margin-left:525.3pt;margin-top:48.7pt;width:17pt;height:16.15pt;z-index:-251659776;visibility:visible;mso-wrap-style:square;mso-wrap-distance-left:0;mso-wrap-distance-top:0;mso-wrap-distance-right:0;mso-wrap-distance-bottom:0;mso-position-horizontal:absolute;mso-position-horizontal-relative:page;mso-position-vertical:absolute;mso-position-vertical-relative:page;v-text-anchor:top" o:gfxdata="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" filled="f" stroked="f">
               <v:textbox inset="0,0,0,0"/>
               <w10:wrap anchorx="page" anchory="page"/>
             </v:rect>
@@ -59328,7 +59487,7 @@
         </mc:Choice>
         <mc:Fallback>
           <w:pict>
-            <v:rect w14:anchorId="72B5962B" id="Shape 21" o:spid="_x0000_s1026" style="position:absolute;margin-left:83.95pt;margin-top:48.7pt;width:182.1pt;height:18.25pt;z-index:-251658752;visibility:visible;mso-wrap-style:square;mso-wrap-distance-left:0;mso-wrap-distance-top:0;mso-wrap-distance-right:0;mso-wrap-distance-bottom:0;mso-position-horizontal:absolute;mso-position-horizontal-relative:page;mso-position-vertical:absolute;mso-position-vertical-relative:page;v-text-anchor:top" o:gfxdata="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" filled="f" stroked="f">
+            <v:rect w14:anchorId="1D49CFFB" id="Shape 21" o:spid="_x0000_s1026" style="position:absolute;margin-left:83.95pt;margin-top:48.7pt;width:182.1pt;height:18.25pt;z-index:-251658752;visibility:visible;mso-wrap-style:square;mso-wrap-distance-left:0;mso-wrap-distance-top:0;mso-wrap-distance-right:0;mso-wrap-distance-bottom:0;mso-position-horizontal:absolute;mso-position-horizontal-relative:page;mso-position-vertical:absolute;mso-position-vertical-relative:page;v-text-anchor:top" o:gfxdata="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" filled="f" stroked="f">
               <v:textbox inset="0,0,0,0"/>
               <w10:wrap anchorx="page" anchory="page"/>
             </v:rect>
@@ -59380,7 +59539,7 @@
         </mc:Choice>
         <mc:Fallback>
           <w:pict>
-            <v:rect w14:anchorId="42C42326" id="Shape 22" o:spid="_x0000_s1026" style="position:absolute;margin-left:525.3pt;margin-top:48.7pt;width:17pt;height:16.15pt;z-index:-251657728;visibility:visible;mso-wrap-style:square;mso-wrap-distance-left:0;mso-wrap-distance-top:0;mso-wrap-distance-right:0;mso-wrap-distance-bottom:0;mso-position-horizontal:absolute;mso-position-horizontal-relative:page;mso-position-vertical:absolute;mso-position-vertical-relative:page;v-text-anchor:top" o:gfxdata="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" filled="f" stroked="f">
+            <v:rect w14:anchorId="73AAD28D" id="Shape 22" o:spid="_x0000_s1026" style="position:absolute;margin-left:525.3pt;margin-top:48.7pt;width:17pt;height:16.15pt;z-index:-251657728;visibility:visible;mso-wrap-style:square;mso-wrap-distance-left:0;mso-wrap-distance-top:0;mso-wrap-distance-right:0;mso-wrap-distance-bottom:0;mso-position-horizontal:absolute;mso-position-horizontal-relative:page;mso-position-vertical:absolute;mso-position-vertical-relative:page;v-text-anchor:top" o:gfxdata="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" filled="f" stroked="f">
               <v:textbox inset="0,0,0,0"/>
               <w10:wrap anchorx="page" anchory="page"/>
             </v:rect>
@@ -59446,7 +59605,7 @@
         </mc:Choice>
         <mc:Fallback>
           <w:pict>
-            <v:rect w14:anchorId="4D48DC62" id="Shape 18" o:spid="_x0000_s1026" style="position:absolute;margin-left:83.95pt;margin-top:48.7pt;width:182.1pt;height:18.25pt;z-index:-251656704;visibility:visible;mso-wrap-style:square;mso-wrap-distance-left:0;mso-wrap-distance-top:0;mso-wrap-distance-right:0;mso-wrap-distance-bottom:0;mso-position-horizontal:absolute;mso-position-horizontal-relative:page;mso-position-vertical:absolute;mso-position-vertical-relative:page;v-text-anchor:top" o:gfxdata="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" filled="f" stroked="f">
+            <v:rect w14:anchorId="6B8FEFA7" id="Shape 18" o:spid="_x0000_s1026" style="position:absolute;margin-left:83.95pt;margin-top:48.7pt;width:182.1pt;height:18.25pt;z-index:-251656704;visibility:visible;mso-wrap-style:square;mso-wrap-distance-left:0;mso-wrap-distance-top:0;mso-wrap-distance-right:0;mso-wrap-distance-bottom:0;mso-position-horizontal:absolute;mso-position-horizontal-relative:page;mso-position-vertical:absolute;mso-position-vertical-relative:page;v-text-anchor:top" o:gfxdata="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" filled="f" stroked="f">
               <v:textbox inset="0,0,0,0"/>
               <w10:wrap anchorx="page" anchory="page"/>
             </v:rect>
@@ -59498,7 +59657,7 @@
         </mc:Choice>
         <mc:Fallback>
           <w:pict>
-            <v:rect w14:anchorId="451BA146" id="Shape 19" o:spid="_x0000_s1026" style="position:absolute;margin-left:525.3pt;margin-top:48.7pt;width:17pt;height:16.15pt;z-index:-251655680;visibility:visible;mso-wrap-style:square;mso-wrap-distance-left:0;mso-wrap-distance-top:0;mso-wrap-distance-right:0;mso-wrap-distance-bottom:0;mso-position-horizontal:absolute;mso-position-horizontal-relative:page;mso-position-vertical:absolute;mso-position-vertical-relative:page;v-text-anchor:top" o:gfxdata="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" filled="f" stroked="f">
+            <v:rect w14:anchorId="6F515468" id="Shape 19" o:spid="_x0000_s1026" style="position:absolute;margin-left:525.3pt;margin-top:48.7pt;width:17pt;height:16.15pt;z-index:-251655680;visibility:visible;mso-wrap-style:square;mso-wrap-distance-left:0;mso-wrap-distance-top:0;mso-wrap-distance-right:0;mso-wrap-distance-bottom:0;mso-position-horizontal:absolute;mso-position-horizontal-relative:page;mso-position-vertical:absolute;mso-position-vertical-relative:page;v-text-anchor:top" o:gfxdata="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" filled="f" stroked="f">
               <v:textbox inset="0,0,0,0"/>
               <w10:wrap anchorx="page" anchory="page"/>
             </v:rect>
@@ -59578,7 +59737,7 @@
         </mc:Choice>
         <mc:Fallback>
           <w:pict>
-            <v:rect w14:anchorId="52B700D1" id="Shape 64" o:spid="_x0000_s1026" style="position:absolute;margin-left:83.95pt;margin-top:48.7pt;width:182.1pt;height:18.25pt;z-index:-251654656;visibility:visible;mso-wrap-style:square;mso-wrap-distance-left:0;mso-wrap-distance-top:0;mso-wrap-distance-right:0;mso-wrap-distance-bottom:0;mso-position-horizontal:absolute;mso-position-horizontal-relative:page;mso-position-vertical:absolute;mso-position-vertical-relative:page;v-text-anchor:top" o:gfxdata="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" filled="f" stroked="f">
+            <v:rect w14:anchorId="6AE21CF9" id="Shape 64" o:spid="_x0000_s1026" style="position:absolute;margin-left:83.95pt;margin-top:48.7pt;width:182.1pt;height:18.25pt;z-index:-251654656;visibility:visible;mso-wrap-style:square;mso-wrap-distance-left:0;mso-wrap-distance-top:0;mso-wrap-distance-right:0;mso-wrap-distance-bottom:0;mso-position-horizontal:absolute;mso-position-horizontal-relative:page;mso-position-vertical:absolute;mso-position-vertical-relative:page;v-text-anchor:top" o:gfxdata="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" filled="f" stroked="f">
               <v:textbox inset="0,0,0,0"/>
               <w10:wrap anchorx="page" anchory="page"/>
             </v:rect>
@@ -59630,7 +59789,7 @@
         </mc:Choice>
         <mc:Fallback>
           <w:pict>
-            <v:rect w14:anchorId="70F31EF9" id="Shape 65" o:spid="_x0000_s1026" style="position:absolute;margin-left:525.3pt;margin-top:48.7pt;width:17pt;height:16.15pt;z-index:-251653632;visibility:visible;mso-wrap-style:square;mso-wrap-distance-left:0;mso-wrap-distance-top:0;mso-wrap-distance-right:0;mso-wrap-distance-bottom:0;mso-position-horizontal:absolute;mso-position-horizontal-relative:page;mso-position-vertical:absolute;mso-position-vertical-relative:page;v-text-anchor:top" o:gfxdata="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" filled="f" stroked="f">
+            <v:rect w14:anchorId="1A322FB8" id="Shape 65" o:spid="_x0000_s1026" style="position:absolute;margin-left:525.3pt;margin-top:48.7pt;width:17pt;height:16.15pt;z-index:-251653632;visibility:visible;mso-wrap-style:square;mso-wrap-distance-left:0;mso-wrap-distance-top:0;mso-wrap-distance-right:0;mso-wrap-distance-bottom:0;mso-position-horizontal:absolute;mso-position-horizontal-relative:page;mso-position-vertical:absolute;mso-position-vertical-relative:page;v-text-anchor:top" o:gfxdata="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" filled="f" stroked="f">
               <v:textbox inset="0,0,0,0"/>
               <w10:wrap anchorx="page" anchory="page"/>
             </v:rect>
@@ -59710,7 +59869,7 @@
         </mc:Choice>
         <mc:Fallback>
           <w:pict>
-            <v:rect w14:anchorId="48B250B6" id="Shape 66" o:spid="_x0000_s1026" style="position:absolute;margin-left:527.3pt;margin-top:48.7pt;width:12pt;height:16.15pt;z-index:-251652608;visibility:visible;mso-wrap-style:square;mso-wrap-distance-left:0;mso-wrap-distance-top:0;mso-wrap-distance-right:0;mso-wrap-distance-bottom:0;mso-position-horizontal:absolute;mso-position-horizontal-relative:page;mso-position-vertical:absolute;mso-position-vertical-relative:page;v-text-anchor:top" o:gfxdata="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" filled="f" stroked="f">
+            <v:rect w14:anchorId="2BE851C4" id="Shape 66" o:spid="_x0000_s1026" style="position:absolute;margin-left:527.3pt;margin-top:48.7pt;width:12pt;height:16.15pt;z-index:-251652608;visibility:visible;mso-wrap-style:square;mso-wrap-distance-left:0;mso-wrap-distance-top:0;mso-wrap-distance-right:0;mso-wrap-distance-bottom:0;mso-position-horizontal:absolute;mso-position-horizontal-relative:page;mso-position-vertical:absolute;mso-position-vertical-relative:page;v-text-anchor:top" o:gfxdata="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" filled="f" stroked="f">
               <v:textbox inset="0,0,0,0"/>
               <w10:wrap anchorx="page" anchory="page"/>
             </v:rect>
@@ -59790,7 +59949,7 @@
         </mc:Choice>
         <mc:Fallback>
           <w:pict>
-            <v:rect w14:anchorId="37752EBB" id="Shape 66" o:spid="_x0000_s1026" style="position:absolute;margin-left:527.3pt;margin-top:48.7pt;width:12pt;height:16.15pt;z-index:-251651584;visibility:visible;mso-wrap-style:square;mso-wrap-distance-left:0;mso-wrap-distance-top:0;mso-wrap-distance-right:0;mso-wrap-distance-bottom:0;mso-position-horizontal:absolute;mso-position-horizontal-relative:page;mso-position-vertical:absolute;mso-position-vertical-relative:page;v-text-anchor:top" o:gfxdata="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" filled="f" stroked="f">
+            <v:rect w14:anchorId="6639302E" id="Shape 66" o:spid="_x0000_s1026" style="position:absolute;margin-left:527.3pt;margin-top:48.7pt;width:12pt;height:16.15pt;z-index:-251651584;visibility:visible;mso-wrap-style:square;mso-wrap-distance-left:0;mso-wrap-distance-top:0;mso-wrap-distance-right:0;mso-wrap-distance-bottom:0;mso-position-horizontal:absolute;mso-position-horizontal-relative:page;mso-position-vertical:absolute;mso-position-vertical-relative:page;v-text-anchor:top" o:gfxdata="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" filled="f" stroked="f">
               <v:textbox inset="0,0,0,0"/>
               <w10:wrap anchorx="page" anchory="page"/>
             </v:rect>
@@ -59856,7 +60015,7 @@
         </mc:Choice>
         <mc:Fallback>
           <w:pict>
-            <v:rect w14:anchorId="6E81ABF8" id="Shape 6" o:spid="_x0000_s1026" style="position:absolute;margin-left:262.75pt;margin-top:79.45pt;width:93.85pt;height:23pt;z-index:-251664896;visibility:visible;mso-wrap-style:square;mso-wrap-distance-left:0;mso-wrap-distance-top:0;mso-wrap-distance-right:0;mso-wrap-distance-bottom:0;mso-position-horizontal:absolute;mso-position-horizontal-relative:page;mso-position-vertical:absolute;mso-position-vertical-relative:page;v-text-anchor:top" o:gfxdata="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" filled="f" stroked="f">
+            <v:rect w14:anchorId="007A7238" id="Shape 6" o:spid="_x0000_s1026" style="position:absolute;margin-left:262.75pt;margin-top:79.45pt;width:93.85pt;height:23pt;z-index:-251664896;visibility:visible;mso-wrap-style:square;mso-wrap-distance-left:0;mso-wrap-distance-top:0;mso-wrap-distance-right:0;mso-wrap-distance-bottom:0;mso-position-horizontal:absolute;mso-position-horizontal-relative:page;mso-position-vertical:absolute;mso-position-vertical-relative:page;v-text-anchor:top" o:gfxdata="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" filled="f" stroked="f">
               <v:textbox inset="0,0,0,0"/>
               <w10:wrap anchorx="page" anchory="page"/>
             </v:rect>
@@ -63384,6 +63543,7 @@
     <w:rsid w:val="00690207"/>
     <w:rsid w:val="007E08FE"/>
     <w:rsid w:val="009D5B87"/>
+    <w:rsid w:val="00CB3A5C"/>
     <w:rsid w:val="00DE37A6"/>
     <w:rsid w:val="00E30DFA"/>
   </w:rsids>
@@ -64162,7 +64322,7 @@
 </file>
 
 <file path=customXml/itemProps1.xml><?xml version="1.0" encoding="utf-8"?>
-<ds:datastoreItem xmlns:ds="http://schemas.openxmlformats.org/officeDocument/2006/customXml" ds:itemID="{311DB736-CBD1-4510-9E6B-BEA7FAD90F98}">
+<ds:datastoreItem xmlns:ds="http://schemas.openxmlformats.org/officeDocument/2006/customXml" ds:itemID="{5ACF05F3-CAC4-45D4-8B51-99D78CB62218}">
   <ds:schemaRefs>
     <ds:schemaRef ds:uri="http://schemas.openxmlformats.org/officeDocument/2006/bibliography"/>
   </ds:schemaRefs>

</xml_diff>

<commit_message>
escrita sobre os diagramas e dicionariod e termos no repo
</commit_message>
<xml_diff>
--- a/backup/tcc-jec.docx
+++ b/backup/tcc-jec.docx
@@ -22842,6 +22842,7 @@
       </w:pPr>
       <w:r>
         <w:rPr>
+          <w:noProof/>
           <w:lang w:val="pt-BR" w:eastAsia="pt-BR"/>
         </w:rPr>
         <w:lastRenderedPageBreak/>
@@ -24282,6 +24283,7 @@
       </w:pPr>
       <w:r>
         <w:rPr>
+          <w:noProof/>
           <w:lang w:val="pt-BR" w:eastAsia="pt-BR"/>
         </w:rPr>
         <w:lastRenderedPageBreak/>
@@ -25092,6 +25094,7 @@
       </w:pPr>
       <w:r>
         <w:rPr>
+          <w:noProof/>
           <w:lang w:val="pt-BR" w:eastAsia="pt-BR"/>
         </w:rPr>
         <w:drawing>
@@ -25540,19 +25543,7 @@
         </w:rPr>
       </w:pPr>
       <w:r>
-        <w:t>Figura 1</w:t>
-      </w:r>
-      <w:r>
-        <w:t>6</w:t>
-      </w:r>
-      <w:r>
-        <w:t xml:space="preserve">. Diagrama de </w:t>
-      </w:r>
-      <w:r>
-        <w:t>Contestação</w:t>
-      </w:r>
-      <w:r>
-        <w:t>.</w:t>
+        <w:t>Figura 16. Diagrama de Contestação.</w:t>
       </w:r>
     </w:p>
     <w:p>
@@ -25567,6 +25558,7 @@
       </w:pPr>
       <w:r>
         <w:rPr>
+          <w:noProof/>
           <w:lang w:val="pt-BR" w:eastAsia="pt-BR"/>
         </w:rPr>
         <w:lastRenderedPageBreak/>
@@ -26273,19 +26265,7 @@
         </w:rPr>
       </w:pPr>
       <w:r>
-        <w:t>Figura 1</w:t>
-      </w:r>
-      <w:r>
-        <w:t>7</w:t>
-      </w:r>
-      <w:r>
-        <w:t xml:space="preserve">. Diagrama de </w:t>
-      </w:r>
-      <w:r>
-        <w:t>Conciliaçã</w:t>
-      </w:r>
-      <w:r>
-        <w:t>o.</w:t>
+        <w:t>Figura 17. Diagrama de Conciliação.</w:t>
       </w:r>
     </w:p>
     <w:p>
@@ -26953,19 +26933,7 @@
         </w:rPr>
       </w:pPr>
       <w:r>
-        <w:t>Figura 1</w:t>
-      </w:r>
-      <w:r>
-        <w:t>8</w:t>
-      </w:r>
-      <w:r>
-        <w:t xml:space="preserve">. Diagrama de </w:t>
-      </w:r>
-      <w:r>
-        <w:t>Produção de Prova</w:t>
-      </w:r>
-      <w:r>
-        <w:t>.</w:t>
+        <w:t>Figura 18. Diagrama de Produção de Prova.</w:t>
       </w:r>
     </w:p>
     <w:p>
@@ -26980,6 +26948,7 @@
       </w:pPr>
       <w:r>
         <w:rPr>
+          <w:noProof/>
           <w:lang w:val="pt-BR" w:eastAsia="pt-BR"/>
         </w:rPr>
         <w:lastRenderedPageBreak/>
@@ -27641,19 +27610,7 @@
         </w:rPr>
       </w:pPr>
       <w:r>
-        <w:t>Figura 1</w:t>
-      </w:r>
-      <w:r>
-        <w:t>9</w:t>
-      </w:r>
-      <w:r>
-        <w:t xml:space="preserve">. Diagrama de </w:t>
-      </w:r>
-      <w:r>
-        <w:t>Análise Probatória e Julgamento</w:t>
-      </w:r>
-      <w:r>
-        <w:t>.</w:t>
+        <w:t>Figura 19. Diagrama de Análise Probatória e Julgamento.</w:t>
       </w:r>
     </w:p>
     <w:p>
@@ -28469,15 +28426,7 @@
         <w:rPr>
           <w:lang w:val="pt-BR" w:eastAsia="pt-BR"/>
         </w:rPr>
-        <w:t xml:space="preserve"> integra em uma mesma estrutura a decisão judicial, sua materialização documental, seus possíveis resultados e os efeitos jurídicos produzidos entre as partes. O modelo fornece suporte especialmente às Questões de Competênci</w:t>
-      </w:r>
-      <w:bookmarkStart w:id="55" w:name="_GoBack"/>
-      <w:bookmarkEnd w:id="55"/>
-      <w:r>
-        <w:rPr>
-          <w:lang w:val="pt-BR" w:eastAsia="pt-BR"/>
-        </w:rPr>
-        <w:t>a relacionadas ao resultado da sentença, à obrigação imposta ao demandado e à verificação da ocorrência do trânsito em julgado</w:t>
+        <w:t xml:space="preserve"> integra em uma mesma estrutura a decisão judicial, sua materialização documental, seus possíveis resultados e os efeitos jurídicos produzidos entre as partes. O modelo fornece suporte especialmente às Questões de Competência relacionadas ao resultado da sentença, à obrigação imposta ao demandado e à verificação da ocorrência do trânsito em julgado</w:t>
       </w:r>
       <w:r>
         <w:rPr>
@@ -28497,19 +28446,7 @@
         </w:rPr>
       </w:pPr>
       <w:r>
-        <w:t xml:space="preserve">Figura </w:t>
-      </w:r>
-      <w:r>
-        <w:t>20</w:t>
-      </w:r>
-      <w:r>
-        <w:t xml:space="preserve">. Diagrama de </w:t>
-      </w:r>
-      <w:r>
-        <w:t>Sentença</w:t>
-      </w:r>
-      <w:r>
-        <w:t>.</w:t>
+        <w:t>Figura 20. Diagrama de Sentença.</w:t>
       </w:r>
     </w:p>
     <w:p>
@@ -28524,6 +28461,7 @@
       </w:pPr>
       <w:r>
         <w:rPr>
+          <w:noProof/>
           <w:lang w:val="pt-BR" w:eastAsia="pt-BR"/>
         </w:rPr>
         <w:drawing>
@@ -28626,28 +28564,112 @@
         <w:rPr>
           <w:lang w:val="pt-BR" w:eastAsia="pt-BR"/>
         </w:rPr>
-        <w:t xml:space="preserve">Texto </w:t>
+        <w:t xml:space="preserve">O diagrama </w:t>
+      </w:r>
+      <w:r>
+        <w:rPr>
+          <w:u w:val="single"/>
+          <w:lang w:val="pt-BR" w:eastAsia="pt-BR"/>
+        </w:rPr>
+        <w:t>Recursos</w:t>
+      </w:r>
+      <w:r>
+        <w:rPr>
+          <w:lang w:val="pt-BR" w:eastAsia="pt-BR"/>
+        </w:rPr>
+        <w:t xml:space="preserve"> representa os principais elementos envolvidos na impugnação da sentença, desde a abertura do prazo recursal até o </w:t>
+      </w:r>
+      <w:r>
+        <w:rPr>
+          <w:u w:val="single"/>
+          <w:lang w:val="pt-BR" w:eastAsia="pt-BR"/>
+        </w:rPr>
+        <w:t>julgamento do recurso</w:t>
+      </w:r>
+      <w:r>
+        <w:rPr>
+          <w:lang w:val="pt-BR" w:eastAsia="pt-BR"/>
+        </w:rPr>
+        <w:t xml:space="preserve"> pela </w:t>
+      </w:r>
+      <w:r>
+        <w:rPr>
+          <w:u w:val="single"/>
+          <w:lang w:val="pt-BR" w:eastAsia="pt-BR"/>
+        </w:rPr>
+        <w:t>Turma Recursal</w:t>
+      </w:r>
+      <w:r>
+        <w:rPr>
+          <w:lang w:val="pt-BR" w:eastAsia="pt-BR"/>
+        </w:rPr>
+        <w:t>. O modelo contempla tanto a hipótese de interposição do recurso quanto a ausência de manifestação recursal, além dos participantes, documentos, prazos e situações decorrentes dessa etapa do processo.</w:t>
+      </w:r>
+    </w:p>
+    <w:p>
+      <w:pPr>
+        <w:pStyle w:val="Corpodetexto"/>
+        <w:spacing w:line="312" w:lineRule="auto"/>
+        <w:ind w:left="282" w:right="116" w:firstLine="737"/>
+        <w:jc w:val="both"/>
+        <w:rPr>
+          <w:lang w:val="pt-BR" w:eastAsia="pt-BR"/>
+        </w:rPr>
+      </w:pPr>
+      <w:r>
+        <w:rPr>
+          <w:lang w:val="pt-BR" w:eastAsia="pt-BR"/>
+        </w:rPr>
+        <w:t xml:space="preserve">A </w:t>
+      </w:r>
+      <w:r>
+        <w:rPr>
+          <w:u w:val="single"/>
+          <w:lang w:val="pt-BR" w:eastAsia="pt-BR"/>
+        </w:rPr>
+        <w:t>Sentença</w:t>
+      </w:r>
+      <w:r>
+        <w:rPr>
+          <w:lang w:val="pt-BR" w:eastAsia="pt-BR"/>
+        </w:rPr>
+        <w:t xml:space="preserve">, representada como </w:t>
       </w:r>
       <w:proofErr w:type="spellStart"/>
       <w:r>
         <w:rPr>
-          <w:lang w:val="pt-BR" w:eastAsia="pt-BR"/>
-        </w:rPr>
-        <w:t>Texto</w:t>
+          <w:rFonts w:ascii="Courier New" w:hAnsi="Courier New" w:cs="Courier New"/>
+          <w:lang w:val="pt-BR" w:eastAsia="pt-BR"/>
+        </w:rPr>
+        <w:t>subkind</w:t>
       </w:r>
       <w:proofErr w:type="spellEnd"/>
       <w:r>
         <w:rPr>
           <w:lang w:val="pt-BR" w:eastAsia="pt-BR"/>
         </w:rPr>
-        <w:t xml:space="preserve"> </w:t>
+        <w:t xml:space="preserve"> de </w:t>
+      </w:r>
+      <w:r>
+        <w:rPr>
+          <w:u w:val="single"/>
+          <w:lang w:val="pt-BR" w:eastAsia="pt-BR"/>
+        </w:rPr>
+        <w:t>Documento</w:t>
+      </w:r>
+      <w:r>
+        <w:rPr>
+          <w:lang w:val="pt-BR" w:eastAsia="pt-BR"/>
+        </w:rPr>
+        <w:t xml:space="preserve">, é produzida pelo </w:t>
       </w:r>
       <w:proofErr w:type="spellStart"/>
       <w:r>
         <w:rPr>
-          <w:lang w:val="pt-BR" w:eastAsia="pt-BR"/>
-        </w:rPr>
-        <w:t>Texto</w:t>
+          <w:rFonts w:ascii="Courier New" w:hAnsi="Courier New" w:cs="Courier New"/>
+          <w:lang w:val="pt-BR" w:eastAsia="pt-BR"/>
+        </w:rPr>
+        <w:t>event</w:t>
       </w:r>
       <w:proofErr w:type="spellEnd"/>
       <w:r>
@@ -28656,26 +28678,136 @@
         </w:rPr>
         <w:t xml:space="preserve"> </w:t>
       </w:r>
+      <w:r>
+        <w:rPr>
+          <w:u w:val="single"/>
+          <w:lang w:val="pt-BR" w:eastAsia="pt-BR"/>
+        </w:rPr>
+        <w:t>Julgamento</w:t>
+      </w:r>
+      <w:r>
+        <w:rPr>
+          <w:lang w:val="pt-BR" w:eastAsia="pt-BR"/>
+        </w:rPr>
+        <w:t xml:space="preserve"> e pode assumir o role </w:t>
+      </w:r>
+      <w:r>
+        <w:rPr>
+          <w:u w:val="single"/>
+          <w:lang w:val="pt-BR" w:eastAsia="pt-BR"/>
+        </w:rPr>
+        <w:t>Sentença Recorrida</w:t>
+      </w:r>
+      <w:r>
+        <w:rPr>
+          <w:lang w:val="pt-BR" w:eastAsia="pt-BR"/>
+        </w:rPr>
+        <w:t xml:space="preserve"> quando se torna objeto de impugnação. Essa posição é mediada pelo relator </w:t>
+      </w:r>
+      <w:r>
+        <w:rPr>
+          <w:rFonts w:ascii="Courier New" w:hAnsi="Courier New" w:cs="Courier New"/>
+          <w:lang w:val="pt-BR" w:eastAsia="pt-BR"/>
+        </w:rPr>
+        <w:t>Relação Recursal</w:t>
+      </w:r>
+      <w:r>
+        <w:rPr>
+          <w:lang w:val="pt-BR" w:eastAsia="pt-BR"/>
+        </w:rPr>
+        <w:t xml:space="preserve">, que também envolve a </w:t>
+      </w:r>
+      <w:r>
+        <w:rPr>
+          <w:u w:val="single"/>
+          <w:lang w:val="pt-BR" w:eastAsia="pt-BR"/>
+        </w:rPr>
+        <w:t>Parte Processual</w:t>
+      </w:r>
+      <w:r>
+        <w:rPr>
+          <w:lang w:val="pt-BR" w:eastAsia="pt-BR"/>
+        </w:rPr>
+        <w:t>, permitindo representar a relação constituída em torno da impugnação da decisão.</w:t>
+      </w:r>
+    </w:p>
+    <w:p>
+      <w:pPr>
+        <w:pStyle w:val="Corpodetexto"/>
+        <w:spacing w:line="312" w:lineRule="auto"/>
+        <w:ind w:left="282" w:right="116" w:firstLine="737"/>
+        <w:jc w:val="both"/>
+        <w:rPr>
+          <w:lang w:val="pt-BR" w:eastAsia="pt-BR"/>
+        </w:rPr>
+      </w:pPr>
+      <w:r>
+        <w:rPr>
+          <w:lang w:val="pt-BR" w:eastAsia="pt-BR"/>
+        </w:rPr>
+        <w:t xml:space="preserve">O </w:t>
+      </w:r>
+      <w:r>
+        <w:rPr>
+          <w:u w:val="single"/>
+          <w:lang w:val="pt-BR" w:eastAsia="pt-BR"/>
+        </w:rPr>
+        <w:t>Recurso Inominado</w:t>
+      </w:r>
+      <w:r>
+        <w:rPr>
+          <w:lang w:val="pt-BR" w:eastAsia="pt-BR"/>
+        </w:rPr>
+        <w:t xml:space="preserve"> é modelado como </w:t>
+      </w:r>
       <w:proofErr w:type="spellStart"/>
       <w:r>
         <w:rPr>
-          <w:lang w:val="pt-BR" w:eastAsia="pt-BR"/>
-        </w:rPr>
-        <w:t>Texto</w:t>
+          <w:rFonts w:ascii="Courier New" w:hAnsi="Courier New" w:cs="Courier New"/>
+          <w:lang w:val="pt-BR" w:eastAsia="pt-BR"/>
+        </w:rPr>
+        <w:t>subkind</w:t>
       </w:r>
       <w:proofErr w:type="spellEnd"/>
       <w:r>
         <w:rPr>
           <w:lang w:val="pt-BR" w:eastAsia="pt-BR"/>
         </w:rPr>
-        <w:t xml:space="preserve"> </w:t>
+        <w:t xml:space="preserve"> de </w:t>
+      </w:r>
+      <w:r>
+        <w:rPr>
+          <w:u w:val="single"/>
+          <w:lang w:val="pt-BR" w:eastAsia="pt-BR"/>
+        </w:rPr>
+        <w:t>Documento</w:t>
+      </w:r>
+      <w:r>
+        <w:rPr>
+          <w:lang w:val="pt-BR" w:eastAsia="pt-BR"/>
+        </w:rPr>
+        <w:t xml:space="preserve"> e impugna a </w:t>
+      </w:r>
+      <w:r>
+        <w:rPr>
+          <w:u w:val="single"/>
+          <w:lang w:val="pt-BR" w:eastAsia="pt-BR"/>
+        </w:rPr>
+        <w:t>Sentença Recorrida</w:t>
+      </w:r>
+      <w:r>
+        <w:rPr>
+          <w:lang w:val="pt-BR" w:eastAsia="pt-BR"/>
+        </w:rPr>
+        <w:t xml:space="preserve">. Sua apresentação ocorre por meio do </w:t>
       </w:r>
       <w:proofErr w:type="spellStart"/>
       <w:r>
         <w:rPr>
-          <w:lang w:val="pt-BR" w:eastAsia="pt-BR"/>
-        </w:rPr>
-        <w:t>Texto</w:t>
+          <w:rFonts w:ascii="Courier New" w:hAnsi="Courier New" w:cs="Courier New"/>
+          <w:lang w:val="pt-BR" w:eastAsia="pt-BR"/>
+        </w:rPr>
+        <w:t>event</w:t>
       </w:r>
       <w:proofErr w:type="spellEnd"/>
       <w:r>
@@ -28684,12 +28816,52 @@
         </w:rPr>
         <w:t xml:space="preserve"> </w:t>
       </w:r>
+      <w:r>
+        <w:rPr>
+          <w:u w:val="single"/>
+          <w:lang w:val="pt-BR" w:eastAsia="pt-BR"/>
+        </w:rPr>
+        <w:t>Interposição de Recurso</w:t>
+      </w:r>
+      <w:r>
+        <w:rPr>
+          <w:lang w:val="pt-BR" w:eastAsia="pt-BR"/>
+        </w:rPr>
+        <w:t xml:space="preserve">, regulado pela </w:t>
+      </w:r>
+      <w:r>
+        <w:rPr>
+          <w:u w:val="single"/>
+          <w:lang w:val="pt-BR" w:eastAsia="pt-BR"/>
+        </w:rPr>
+        <w:t>Regra de Prazo Recursal</w:t>
+      </w:r>
+      <w:r>
+        <w:rPr>
+          <w:lang w:val="pt-BR" w:eastAsia="pt-BR"/>
+        </w:rPr>
+        <w:t xml:space="preserve">, especialização de </w:t>
+      </w:r>
+      <w:r>
+        <w:rPr>
+          <w:u w:val="single"/>
+          <w:lang w:val="pt-BR" w:eastAsia="pt-BR"/>
+        </w:rPr>
+        <w:t>Regra Jurídica</w:t>
+      </w:r>
+      <w:r>
+        <w:rPr>
+          <w:lang w:val="pt-BR" w:eastAsia="pt-BR"/>
+        </w:rPr>
+        <w:t xml:space="preserve">. A regra é caracterizada pela </w:t>
+      </w:r>
       <w:proofErr w:type="spellStart"/>
       <w:r>
         <w:rPr>
-          <w:lang w:val="pt-BR" w:eastAsia="pt-BR"/>
-        </w:rPr>
-        <w:t>Texto</w:t>
+          <w:rFonts w:ascii="Courier New" w:hAnsi="Courier New" w:cs="Courier New"/>
+          <w:lang w:val="pt-BR" w:eastAsia="pt-BR"/>
+        </w:rPr>
+        <w:t>quality</w:t>
       </w:r>
       <w:proofErr w:type="spellEnd"/>
       <w:r>
@@ -28698,12 +28870,80 @@
         </w:rPr>
         <w:t xml:space="preserve"> </w:t>
       </w:r>
+      <w:r>
+        <w:rPr>
+          <w:u w:val="single"/>
+          <w:lang w:val="pt-BR" w:eastAsia="pt-BR"/>
+        </w:rPr>
+        <w:t>Prazo Recursal</w:t>
+      </w:r>
+      <w:r>
+        <w:rPr>
+          <w:lang w:val="pt-BR" w:eastAsia="pt-BR"/>
+        </w:rPr>
+        <w:t>, permitindo representar o intervalo temporal aplicável à apresentação do recurso.</w:t>
+      </w:r>
+    </w:p>
+    <w:p>
+      <w:pPr>
+        <w:pStyle w:val="Corpodetexto"/>
+        <w:spacing w:line="312" w:lineRule="auto"/>
+        <w:ind w:left="282" w:right="116" w:firstLine="737"/>
+        <w:jc w:val="both"/>
+        <w:rPr>
+          <w:lang w:val="pt-BR" w:eastAsia="pt-BR"/>
+        </w:rPr>
+      </w:pPr>
+      <w:r>
+        <w:rPr>
+          <w:lang w:val="pt-BR" w:eastAsia="pt-BR"/>
+        </w:rPr>
+        <w:t xml:space="preserve">A </w:t>
+      </w:r>
+      <w:r>
+        <w:rPr>
+          <w:u w:val="single"/>
+          <w:lang w:val="pt-BR" w:eastAsia="pt-BR"/>
+        </w:rPr>
+        <w:t>Interposição de Recurso</w:t>
+      </w:r>
+      <w:r>
+        <w:rPr>
+          <w:lang w:val="pt-BR" w:eastAsia="pt-BR"/>
+        </w:rPr>
+        <w:t xml:space="preserve"> cria o </w:t>
+      </w:r>
+      <w:r>
+        <w:rPr>
+          <w:u w:val="single"/>
+          <w:lang w:val="pt-BR" w:eastAsia="pt-BR"/>
+        </w:rPr>
+        <w:t>Recurso Inominado</w:t>
+      </w:r>
+      <w:r>
+        <w:rPr>
+          <w:lang w:val="pt-BR" w:eastAsia="pt-BR"/>
+        </w:rPr>
+        <w:t xml:space="preserve"> e </w:t>
+      </w:r>
+      <w:r>
+        <w:rPr>
+          <w:lang w:val="pt-BR" w:eastAsia="pt-BR"/>
+        </w:rPr>
+        <w:t>leva</w:t>
+      </w:r>
+      <w:r>
+        <w:rPr>
+          <w:lang w:val="pt-BR" w:eastAsia="pt-BR"/>
+        </w:rPr>
+        <w:t xml:space="preserve"> </w:t>
+      </w:r>
       <w:proofErr w:type="spellStart"/>
       <w:r>
         <w:rPr>
           <w:lang w:val="pt-BR" w:eastAsia="pt-BR"/>
         </w:rPr>
-        <w:t>Texto</w:t>
+        <w:t>a</w:t>
       </w:r>
       <w:proofErr w:type="spellEnd"/>
       <w:r>
@@ -28715,9 +28955,10 @@
       <w:proofErr w:type="spellStart"/>
       <w:r>
         <w:rPr>
-          <w:lang w:val="pt-BR" w:eastAsia="pt-BR"/>
-        </w:rPr>
-        <w:t>Texto</w:t>
+          <w:rFonts w:ascii="Courier New" w:hAnsi="Courier New" w:cs="Courier New"/>
+          <w:lang w:val="pt-BR" w:eastAsia="pt-BR"/>
+        </w:rPr>
+        <w:t>situation</w:t>
       </w:r>
       <w:proofErr w:type="spellEnd"/>
       <w:r>
@@ -28726,12 +28967,40 @@
         </w:rPr>
         <w:t xml:space="preserve"> </w:t>
       </w:r>
+      <w:r>
+        <w:rPr>
+          <w:u w:val="single"/>
+          <w:lang w:val="pt-BR" w:eastAsia="pt-BR"/>
+        </w:rPr>
+        <w:t>Recurso Interposto</w:t>
+      </w:r>
+      <w:r>
+        <w:rPr>
+          <w:lang w:val="pt-BR" w:eastAsia="pt-BR"/>
+        </w:rPr>
+        <w:t xml:space="preserve">. Essa situação, por sua vez, </w:t>
+      </w:r>
+      <w:r>
+        <w:rPr>
+          <w:rFonts w:ascii="Courier New" w:hAnsi="Courier New" w:cs="Courier New"/>
+          <w:lang w:val="pt-BR" w:eastAsia="pt-BR"/>
+        </w:rPr>
+        <w:t>triggers</w:t>
+      </w:r>
+      <w:r>
+        <w:rPr>
+          <w:lang w:val="pt-BR" w:eastAsia="pt-BR"/>
+        </w:rPr>
+        <w:t xml:space="preserve"> o </w:t>
+      </w:r>
       <w:proofErr w:type="spellStart"/>
-      <w:r>
-        <w:rPr>
-          <w:lang w:val="pt-BR" w:eastAsia="pt-BR"/>
-        </w:rPr>
-        <w:t>Texto</w:t>
+      <w:proofErr w:type="gramStart"/>
+      <w:r>
+        <w:rPr>
+          <w:rFonts w:ascii="Courier New" w:hAnsi="Courier New" w:cs="Courier New"/>
+          <w:lang w:val="pt-BR" w:eastAsia="pt-BR"/>
+        </w:rPr>
+        <w:t>event</w:t>
       </w:r>
       <w:proofErr w:type="spellEnd"/>
       <w:r>
@@ -28740,12 +29009,47 @@
         </w:rPr>
         <w:t xml:space="preserve"> </w:t>
       </w:r>
+      <w:r>
+        <w:rPr>
+          <w:u w:val="single"/>
+          <w:lang w:val="pt-BR" w:eastAsia="pt-BR"/>
+        </w:rPr>
+        <w:t>Remessa</w:t>
+      </w:r>
+      <w:proofErr w:type="gramEnd"/>
+      <w:r>
+        <w:rPr>
+          <w:u w:val="single"/>
+          <w:lang w:val="pt-BR" w:eastAsia="pt-BR"/>
+        </w:rPr>
+        <w:t xml:space="preserve"> à Turma Recursal</w:t>
+      </w:r>
+      <w:r>
+        <w:rPr>
+          <w:lang w:val="pt-BR" w:eastAsia="pt-BR"/>
+        </w:rPr>
+        <w:t xml:space="preserve">, representando o encaminhamento do processo para apreciação do recurso. A remessa destina o recurso à </w:t>
+      </w:r>
+      <w:r>
+        <w:rPr>
+          <w:u w:val="single"/>
+          <w:lang w:val="pt-BR" w:eastAsia="pt-BR"/>
+        </w:rPr>
+        <w:t>Turma Recursal</w:t>
+      </w:r>
+      <w:r>
+        <w:rPr>
+          <w:lang w:val="pt-BR" w:eastAsia="pt-BR"/>
+        </w:rPr>
+        <w:t xml:space="preserve"> e leva à </w:t>
+      </w:r>
       <w:proofErr w:type="spellStart"/>
       <w:r>
         <w:rPr>
-          <w:lang w:val="pt-BR" w:eastAsia="pt-BR"/>
-        </w:rPr>
-        <w:t>Texto</w:t>
+          <w:rFonts w:ascii="Courier New" w:hAnsi="Courier New" w:cs="Courier New"/>
+          <w:lang w:val="pt-BR" w:eastAsia="pt-BR"/>
+        </w:rPr>
+        <w:t>situation</w:t>
       </w:r>
       <w:proofErr w:type="spellEnd"/>
       <w:r>
@@ -28754,82 +29058,333 @@
         </w:rPr>
         <w:t xml:space="preserve"> </w:t>
       </w:r>
+      <w:r>
+        <w:rPr>
+          <w:u w:val="single"/>
+          <w:lang w:val="pt-BR" w:eastAsia="pt-BR"/>
+        </w:rPr>
+        <w:t>Processo Encaminhado à Turma Recursal</w:t>
+      </w:r>
+      <w:r>
+        <w:rPr>
+          <w:lang w:val="pt-BR" w:eastAsia="pt-BR"/>
+        </w:rPr>
+        <w:t>.</w:t>
+      </w:r>
+    </w:p>
+    <w:p>
+      <w:pPr>
+        <w:pStyle w:val="Corpodetexto"/>
+        <w:spacing w:line="312" w:lineRule="auto"/>
+        <w:ind w:left="282" w:right="116" w:firstLine="737"/>
+        <w:jc w:val="both"/>
+        <w:rPr>
+          <w:lang w:val="pt-BR" w:eastAsia="pt-BR"/>
+        </w:rPr>
+      </w:pPr>
+      <w:r>
+        <w:rPr>
+          <w:lang w:val="pt-BR" w:eastAsia="pt-BR"/>
+        </w:rPr>
+        <w:t xml:space="preserve">A representação processual em grau recursal é detalhada por meio de </w:t>
+      </w:r>
+      <w:r>
+        <w:rPr>
+          <w:u w:val="single"/>
+          <w:lang w:val="pt-BR" w:eastAsia="pt-BR"/>
+        </w:rPr>
+        <w:t>Representação Recursal</w:t>
+      </w:r>
+      <w:r>
+        <w:rPr>
+          <w:lang w:val="pt-BR" w:eastAsia="pt-BR"/>
+        </w:rPr>
+        <w:t xml:space="preserve">, modelada como </w:t>
+      </w:r>
       <w:proofErr w:type="spellStart"/>
       <w:r>
         <w:rPr>
-          <w:lang w:val="pt-BR" w:eastAsia="pt-BR"/>
-        </w:rPr>
-        <w:t>Texto</w:t>
+          <w:rFonts w:ascii="Courier New" w:hAnsi="Courier New" w:cs="Courier New"/>
+          <w:lang w:val="pt-BR" w:eastAsia="pt-BR"/>
+        </w:rPr>
+        <w:t>subkind</w:t>
       </w:r>
       <w:proofErr w:type="spellEnd"/>
       <w:r>
         <w:rPr>
           <w:lang w:val="pt-BR" w:eastAsia="pt-BR"/>
         </w:rPr>
-        <w:t xml:space="preserve"> </w:t>
+        <w:t xml:space="preserve"> de </w:t>
+      </w:r>
+      <w:r>
+        <w:rPr>
+          <w:u w:val="single"/>
+          <w:lang w:val="pt-BR" w:eastAsia="pt-BR"/>
+        </w:rPr>
+        <w:t>Representação Processual</w:t>
+      </w:r>
+      <w:r>
+        <w:rPr>
+          <w:lang w:val="pt-BR" w:eastAsia="pt-BR"/>
+        </w:rPr>
+        <w:t xml:space="preserve">. Esse </w:t>
+      </w:r>
+      <w:r>
+        <w:rPr>
+          <w:rFonts w:ascii="Courier New" w:hAnsi="Courier New" w:cs="Courier New"/>
+          <w:lang w:val="pt-BR" w:eastAsia="pt-BR"/>
+        </w:rPr>
+        <w:t>relator</w:t>
+      </w:r>
+      <w:r>
+        <w:rPr>
+          <w:lang w:val="pt-BR" w:eastAsia="pt-BR"/>
+        </w:rPr>
+        <w:t xml:space="preserve"> media a </w:t>
+      </w:r>
+      <w:r>
+        <w:rPr>
+          <w:u w:val="single"/>
+          <w:lang w:val="pt-BR" w:eastAsia="pt-BR"/>
+        </w:rPr>
+        <w:t>Parte Processual</w:t>
+      </w:r>
+      <w:r>
+        <w:rPr>
+          <w:lang w:val="pt-BR" w:eastAsia="pt-BR"/>
+        </w:rPr>
+        <w:t xml:space="preserve"> e o </w:t>
+      </w:r>
+      <w:r>
+        <w:rPr>
+          <w:u w:val="single"/>
+          <w:lang w:val="pt-BR" w:eastAsia="pt-BR"/>
+        </w:rPr>
+        <w:t>Representante Processual</w:t>
+      </w:r>
+      <w:r>
+        <w:rPr>
+          <w:lang w:val="pt-BR" w:eastAsia="pt-BR"/>
+        </w:rPr>
+        <w:t>, permitindo distinguir a representação exercida especificamente durante a fase recursal daquela existente nas etapas anteriores do processo.</w:t>
+      </w:r>
+    </w:p>
+    <w:p>
+      <w:pPr>
+        <w:pStyle w:val="Corpodetexto"/>
+        <w:spacing w:line="312" w:lineRule="auto"/>
+        <w:ind w:left="282" w:right="116" w:firstLine="737"/>
+        <w:jc w:val="both"/>
+        <w:rPr>
+          <w:lang w:val="pt-BR" w:eastAsia="pt-BR"/>
+        </w:rPr>
+      </w:pPr>
+      <w:r>
+        <w:rPr>
+          <w:lang w:val="pt-BR" w:eastAsia="pt-BR"/>
+        </w:rPr>
+        <w:t xml:space="preserve">O </w:t>
+      </w:r>
+      <w:r>
+        <w:rPr>
+          <w:u w:val="single"/>
+          <w:lang w:val="pt-BR" w:eastAsia="pt-BR"/>
+        </w:rPr>
+        <w:t>Julgamento do Recurso</w:t>
+      </w:r>
+      <w:r>
+        <w:rPr>
+          <w:lang w:val="pt-BR" w:eastAsia="pt-BR"/>
+        </w:rPr>
+        <w:t xml:space="preserve"> é modelado como </w:t>
       </w:r>
       <w:proofErr w:type="spellStart"/>
       <w:r>
         <w:rPr>
-          <w:lang w:val="pt-BR" w:eastAsia="pt-BR"/>
-        </w:rPr>
-        <w:t>Texto</w:t>
+          <w:rFonts w:ascii="Courier New" w:hAnsi="Courier New" w:cs="Courier New"/>
+          <w:lang w:val="pt-BR" w:eastAsia="pt-BR"/>
+        </w:rPr>
+        <w:t>event</w:t>
       </w:r>
       <w:proofErr w:type="spellEnd"/>
       <w:r>
         <w:rPr>
           <w:lang w:val="pt-BR" w:eastAsia="pt-BR"/>
         </w:rPr>
-        <w:t xml:space="preserve"> </w:t>
+        <w:t xml:space="preserve"> e possui </w:t>
       </w:r>
       <w:proofErr w:type="spellStart"/>
       <w:r>
         <w:rPr>
-          <w:lang w:val="pt-BR" w:eastAsia="pt-BR"/>
-        </w:rPr>
-        <w:t>Texto</w:t>
+          <w:rFonts w:ascii="Courier New" w:hAnsi="Courier New" w:cs="Courier New"/>
+          <w:lang w:val="pt-BR" w:eastAsia="pt-BR"/>
+        </w:rPr>
+        <w:t>historicalDependence</w:t>
       </w:r>
       <w:proofErr w:type="spellEnd"/>
       <w:r>
         <w:rPr>
           <w:lang w:val="pt-BR" w:eastAsia="pt-BR"/>
         </w:rPr>
-        <w:t xml:space="preserve"> </w:t>
+        <w:t xml:space="preserve"> em relação à </w:t>
+      </w:r>
+      <w:r>
+        <w:rPr>
+          <w:u w:val="single"/>
+          <w:lang w:val="pt-BR" w:eastAsia="pt-BR"/>
+        </w:rPr>
+        <w:t>Remessa à Turma Recursal</w:t>
+      </w:r>
+      <w:r>
+        <w:rPr>
+          <w:lang w:val="pt-BR" w:eastAsia="pt-BR"/>
+        </w:rPr>
+        <w:t xml:space="preserve">. A situação </w:t>
+      </w:r>
+      <w:r>
+        <w:rPr>
+          <w:u w:val="single"/>
+          <w:lang w:val="pt-BR" w:eastAsia="pt-BR"/>
+        </w:rPr>
+        <w:t>Processo Encaminhado à Turma Recursal</w:t>
+      </w:r>
+      <w:r>
+        <w:rPr>
+          <w:lang w:val="pt-BR" w:eastAsia="pt-BR"/>
+        </w:rPr>
+        <w:t xml:space="preserve"> </w:t>
+      </w:r>
+      <w:r>
+        <w:rPr>
+          <w:rFonts w:ascii="Courier New" w:hAnsi="Courier New" w:cs="Courier New"/>
+          <w:lang w:val="pt-BR" w:eastAsia="pt-BR"/>
+        </w:rPr>
+        <w:t>triggers</w:t>
+      </w:r>
+      <w:r>
+        <w:rPr>
+          <w:lang w:val="pt-BR" w:eastAsia="pt-BR"/>
+        </w:rPr>
+        <w:t xml:space="preserve"> esse julgamento, que produz o </w:t>
+      </w:r>
+      <w:r>
+        <w:rPr>
+          <w:u w:val="single"/>
+          <w:lang w:val="pt-BR" w:eastAsia="pt-BR"/>
+        </w:rPr>
+        <w:t>Acórdão</w:t>
+      </w:r>
+      <w:r>
+        <w:rPr>
+          <w:lang w:val="pt-BR" w:eastAsia="pt-BR"/>
+        </w:rPr>
+        <w:t xml:space="preserve">, representado como </w:t>
       </w:r>
       <w:proofErr w:type="spellStart"/>
       <w:r>
         <w:rPr>
-          <w:lang w:val="pt-BR" w:eastAsia="pt-BR"/>
-        </w:rPr>
-        <w:t>Texto</w:t>
+          <w:rFonts w:ascii="Courier New" w:hAnsi="Courier New" w:cs="Courier New"/>
+          <w:lang w:val="pt-BR" w:eastAsia="pt-BR"/>
+        </w:rPr>
+        <w:t>subkind</w:t>
       </w:r>
       <w:proofErr w:type="spellEnd"/>
       <w:r>
         <w:rPr>
           <w:lang w:val="pt-BR" w:eastAsia="pt-BR"/>
         </w:rPr>
-        <w:t xml:space="preserve"> </w:t>
+        <w:t xml:space="preserve"> de </w:t>
+      </w:r>
+      <w:r>
+        <w:rPr>
+          <w:u w:val="single"/>
+          <w:lang w:val="pt-BR" w:eastAsia="pt-BR"/>
+        </w:rPr>
+        <w:t>Documento</w:t>
+      </w:r>
+      <w:r>
+        <w:rPr>
+          <w:lang w:val="pt-BR" w:eastAsia="pt-BR"/>
+        </w:rPr>
+        <w:t xml:space="preserve">, e </w:t>
+      </w:r>
+      <w:r>
+        <w:rPr>
+          <w:lang w:val="pt-BR" w:eastAsia="pt-BR"/>
+        </w:rPr>
+        <w:t>leva</w:t>
+      </w:r>
+      <w:r>
+        <w:rPr>
+          <w:lang w:val="pt-BR" w:eastAsia="pt-BR"/>
+        </w:rPr>
+        <w:t xml:space="preserve"> a </w:t>
       </w:r>
       <w:proofErr w:type="spellStart"/>
       <w:r>
         <w:rPr>
-          <w:lang w:val="pt-BR" w:eastAsia="pt-BR"/>
-        </w:rPr>
-        <w:t>Texto</w:t>
+          <w:rFonts w:ascii="Courier New" w:hAnsi="Courier New" w:cs="Courier New"/>
+          <w:lang w:val="pt-BR" w:eastAsia="pt-BR"/>
+        </w:rPr>
+        <w:t>situation</w:t>
       </w:r>
       <w:proofErr w:type="spellEnd"/>
       <w:r>
         <w:rPr>
           <w:lang w:val="pt-BR" w:eastAsia="pt-BR"/>
         </w:rPr>
-        <w:t xml:space="preserve"> </w:t>
+        <w:t xml:space="preserve"> Resulta</w:t>
+      </w:r>
+      <w:r>
+        <w:rPr>
+          <w:u w:val="single"/>
+          <w:lang w:val="pt-BR" w:eastAsia="pt-BR"/>
+        </w:rPr>
+        <w:t>do do Julgamento Recursal</w:t>
+      </w:r>
+      <w:r>
+        <w:rPr>
+          <w:lang w:val="pt-BR" w:eastAsia="pt-BR"/>
+        </w:rPr>
+        <w:t>.</w:t>
+      </w:r>
+    </w:p>
+    <w:p>
+      <w:pPr>
+        <w:pStyle w:val="Corpodetexto"/>
+        <w:spacing w:line="312" w:lineRule="auto"/>
+        <w:ind w:left="282" w:right="116" w:firstLine="737"/>
+        <w:jc w:val="both"/>
+        <w:rPr>
+          <w:lang w:val="pt-BR" w:eastAsia="pt-BR"/>
+        </w:rPr>
+      </w:pPr>
+      <w:r>
+        <w:rPr>
+          <w:lang w:val="pt-BR" w:eastAsia="pt-BR"/>
+        </w:rPr>
+        <w:t xml:space="preserve">O </w:t>
+      </w:r>
+      <w:r>
+        <w:rPr>
+          <w:u w:val="single"/>
+          <w:lang w:val="pt-BR" w:eastAsia="pt-BR"/>
+        </w:rPr>
+        <w:t>Resultado do Julgamento Recursal</w:t>
+      </w:r>
+      <w:r>
+        <w:rPr>
+          <w:lang w:val="pt-BR" w:eastAsia="pt-BR"/>
+        </w:rPr>
+        <w:t xml:space="preserve"> é especializado nas </w:t>
       </w:r>
       <w:proofErr w:type="spellStart"/>
       <w:r>
         <w:rPr>
-          <w:lang w:val="pt-BR" w:eastAsia="pt-BR"/>
-        </w:rPr>
-        <w:t>Texto</w:t>
+          <w:rFonts w:ascii="Courier New" w:hAnsi="Courier New" w:cs="Courier New"/>
+          <w:lang w:val="pt-BR" w:eastAsia="pt-BR"/>
+        </w:rPr>
+        <w:t>situations</w:t>
       </w:r>
       <w:proofErr w:type="spellEnd"/>
       <w:r>
@@ -28838,26 +29393,137 @@
         </w:rPr>
         <w:t xml:space="preserve"> </w:t>
       </w:r>
+      <w:r>
+        <w:rPr>
+          <w:u w:val="single"/>
+          <w:lang w:val="pt-BR" w:eastAsia="pt-BR"/>
+        </w:rPr>
+        <w:t>Recurso Provido</w:t>
+      </w:r>
+      <w:r>
+        <w:rPr>
+          <w:lang w:val="pt-BR" w:eastAsia="pt-BR"/>
+        </w:rPr>
+        <w:t xml:space="preserve">, </w:t>
+      </w:r>
+      <w:r>
+        <w:rPr>
+          <w:u w:val="single"/>
+          <w:lang w:val="pt-BR" w:eastAsia="pt-BR"/>
+        </w:rPr>
+        <w:t>Recurso Parcialmente Provido</w:t>
+      </w:r>
+      <w:r>
+        <w:rPr>
+          <w:lang w:val="pt-BR" w:eastAsia="pt-BR"/>
+        </w:rPr>
+        <w:t xml:space="preserve">, </w:t>
+      </w:r>
+      <w:r>
+        <w:rPr>
+          <w:u w:val="single"/>
+          <w:lang w:val="pt-BR" w:eastAsia="pt-BR"/>
+        </w:rPr>
+        <w:t>Recurso Desprovido</w:t>
+      </w:r>
+      <w:r>
+        <w:rPr>
+          <w:lang w:val="pt-BR" w:eastAsia="pt-BR"/>
+        </w:rPr>
+        <w:t xml:space="preserve"> e </w:t>
+      </w:r>
+      <w:r>
+        <w:rPr>
+          <w:u w:val="single"/>
+          <w:lang w:val="pt-BR" w:eastAsia="pt-BR"/>
+        </w:rPr>
+        <w:t>Recurso Não Conhecido</w:t>
+      </w:r>
+      <w:r>
+        <w:rPr>
+          <w:lang w:val="pt-BR" w:eastAsia="pt-BR"/>
+        </w:rPr>
+        <w:t xml:space="preserve">. Essas especializações formam um conjunto </w:t>
+      </w:r>
+      <w:r>
+        <w:rPr>
+          <w:rFonts w:ascii="Courier New" w:hAnsi="Courier New" w:cs="Courier New"/>
+          <w:lang w:val="pt-BR" w:eastAsia="pt-BR"/>
+        </w:rPr>
+        <w:t>{</w:t>
+      </w:r>
       <w:proofErr w:type="spellStart"/>
       <w:r>
         <w:rPr>
-          <w:lang w:val="pt-BR" w:eastAsia="pt-BR"/>
-        </w:rPr>
-        <w:t>Texto</w:t>
+          <w:rFonts w:ascii="Courier New" w:hAnsi="Courier New" w:cs="Courier New"/>
+          <w:lang w:val="pt-BR" w:eastAsia="pt-BR"/>
+        </w:rPr>
+        <w:t>disjoint</w:t>
       </w:r>
       <w:proofErr w:type="spellEnd"/>
       <w:r>
         <w:rPr>
-          <w:lang w:val="pt-BR" w:eastAsia="pt-BR"/>
-        </w:rPr>
-        <w:t xml:space="preserve"> </w:t>
+          <w:rFonts w:ascii="Courier New" w:hAnsi="Courier New" w:cs="Courier New"/>
+          <w:lang w:val="pt-BR" w:eastAsia="pt-BR"/>
+        </w:rPr>
+        <w:t>, complete}</w:t>
+      </w:r>
+      <w:r>
+        <w:rPr>
+          <w:lang w:val="pt-BR" w:eastAsia="pt-BR"/>
+        </w:rPr>
+        <w:t>, permitindo representar, dentro do escopo da ontologia, os diferentes resultados possíveis da apreciação do recurso.</w:t>
+      </w:r>
+    </w:p>
+    <w:p>
+      <w:pPr>
+        <w:pStyle w:val="Corpodetexto"/>
+        <w:spacing w:line="312" w:lineRule="auto"/>
+        <w:ind w:left="282" w:right="116" w:firstLine="737"/>
+        <w:jc w:val="both"/>
+        <w:rPr>
+          <w:lang w:val="pt-BR" w:eastAsia="pt-BR"/>
+        </w:rPr>
+      </w:pPr>
+      <w:r>
+        <w:rPr>
+          <w:lang w:val="pt-BR" w:eastAsia="pt-BR"/>
+        </w:rPr>
+        <w:t xml:space="preserve">O modelo também contempla a hipótese de não interposição. A </w:t>
+      </w:r>
+      <w:r>
+        <w:rPr>
+          <w:u w:val="single"/>
+          <w:lang w:val="pt-BR" w:eastAsia="pt-BR"/>
+        </w:rPr>
+        <w:t>Sentença</w:t>
+      </w:r>
+      <w:r>
+        <w:rPr>
+          <w:lang w:val="pt-BR" w:eastAsia="pt-BR"/>
+        </w:rPr>
+        <w:t xml:space="preserve"> </w:t>
+      </w:r>
+      <w:r>
+        <w:rPr>
+          <w:rFonts w:ascii="Courier New" w:hAnsi="Courier New" w:cs="Courier New"/>
+          <w:lang w:val="pt-BR" w:eastAsia="pt-BR"/>
+        </w:rPr>
+        <w:t>triggers</w:t>
+      </w:r>
+      <w:r>
+        <w:rPr>
+          <w:lang w:val="pt-BR" w:eastAsia="pt-BR"/>
+        </w:rPr>
+        <w:t xml:space="preserve"> o </w:t>
       </w:r>
       <w:proofErr w:type="spellStart"/>
       <w:r>
         <w:rPr>
-          <w:lang w:val="pt-BR" w:eastAsia="pt-BR"/>
-        </w:rPr>
-        <w:t>Texto</w:t>
+          <w:rFonts w:ascii="Courier New" w:hAnsi="Courier New" w:cs="Courier New"/>
+          <w:lang w:val="pt-BR" w:eastAsia="pt-BR"/>
+        </w:rPr>
+        <w:t>event</w:t>
       </w:r>
       <w:proofErr w:type="spellEnd"/>
       <w:r>
@@ -28866,12 +29532,38 @@
         </w:rPr>
         <w:t xml:space="preserve"> </w:t>
       </w:r>
+      <w:r>
+        <w:rPr>
+          <w:u w:val="single"/>
+          <w:lang w:val="pt-BR" w:eastAsia="pt-BR"/>
+        </w:rPr>
+        <w:t>Decurso do Prazo Recursal</w:t>
+      </w:r>
+      <w:r>
+        <w:rPr>
+          <w:lang w:val="pt-BR" w:eastAsia="pt-BR"/>
+        </w:rPr>
+        <w:t xml:space="preserve">, que </w:t>
+      </w:r>
+      <w:r>
+        <w:rPr>
+          <w:lang w:val="pt-BR" w:eastAsia="pt-BR"/>
+        </w:rPr>
+        <w:t>leva</w:t>
+      </w:r>
+      <w:r>
+        <w:rPr>
+          <w:lang w:val="pt-BR" w:eastAsia="pt-BR"/>
+        </w:rPr>
+        <w:t xml:space="preserve"> a </w:t>
+      </w:r>
       <w:proofErr w:type="spellStart"/>
       <w:r>
         <w:rPr>
-          <w:lang w:val="pt-BR" w:eastAsia="pt-BR"/>
-        </w:rPr>
-        <w:t>Texto</w:t>
+          <w:rFonts w:ascii="Courier New" w:hAnsi="Courier New" w:cs="Courier New"/>
+          <w:lang w:val="pt-BR" w:eastAsia="pt-BR"/>
+        </w:rPr>
+        <w:t>situation</w:t>
       </w:r>
       <w:proofErr w:type="spellEnd"/>
       <w:r>
@@ -28880,12 +29572,39 @@
         </w:rPr>
         <w:t xml:space="preserve"> </w:t>
       </w:r>
+      <w:r>
+        <w:rPr>
+          <w:u w:val="single"/>
+          <w:lang w:val="pt-BR" w:eastAsia="pt-BR"/>
+        </w:rPr>
+        <w:t>Ausência de Recurso</w:t>
+      </w:r>
+      <w:r>
+        <w:rPr>
+          <w:lang w:val="pt-BR" w:eastAsia="pt-BR"/>
+        </w:rPr>
+        <w:t xml:space="preserve">. Essa situação, por sua vez, </w:t>
+      </w:r>
+      <w:r>
+        <w:rPr>
+          <w:rFonts w:ascii="Courier New" w:hAnsi="Courier New" w:cs="Courier New"/>
+          <w:lang w:val="pt-BR" w:eastAsia="pt-BR"/>
+        </w:rPr>
+        <w:t>triggers</w:t>
+      </w:r>
+      <w:r>
+        <w:rPr>
+          <w:lang w:val="pt-BR" w:eastAsia="pt-BR"/>
+        </w:rPr>
+        <w:t xml:space="preserve"> o </w:t>
+      </w:r>
       <w:proofErr w:type="spellStart"/>
       <w:r>
         <w:rPr>
-          <w:lang w:val="pt-BR" w:eastAsia="pt-BR"/>
-        </w:rPr>
-        <w:t>Texto</w:t>
+          <w:rFonts w:ascii="Courier New" w:hAnsi="Courier New" w:cs="Courier New"/>
+          <w:lang w:val="pt-BR" w:eastAsia="pt-BR"/>
+        </w:rPr>
+        <w:t>event</w:t>
       </w:r>
       <w:proofErr w:type="spellEnd"/>
       <w:r>
@@ -28894,285 +29613,155 @@
         </w:rPr>
         <w:t xml:space="preserve"> </w:t>
       </w:r>
-      <w:proofErr w:type="spellStart"/>
-      <w:r>
-        <w:rPr>
-          <w:lang w:val="pt-BR" w:eastAsia="pt-BR"/>
-        </w:rPr>
-        <w:t>Texto</w:t>
-      </w:r>
-      <w:proofErr w:type="spellEnd"/>
-      <w:r>
-        <w:rPr>
-          <w:lang w:val="pt-BR" w:eastAsia="pt-BR"/>
-        </w:rPr>
-        <w:t xml:space="preserve"> </w:t>
-      </w:r>
-      <w:proofErr w:type="spellStart"/>
-      <w:r>
-        <w:rPr>
-          <w:lang w:val="pt-BR" w:eastAsia="pt-BR"/>
-        </w:rPr>
-        <w:t>Texto</w:t>
-      </w:r>
-      <w:proofErr w:type="spellEnd"/>
-      <w:r>
-        <w:rPr>
-          <w:lang w:val="pt-BR" w:eastAsia="pt-BR"/>
-        </w:rPr>
-        <w:t xml:space="preserve"> </w:t>
-      </w:r>
-      <w:proofErr w:type="spellStart"/>
-      <w:r>
-        <w:rPr>
-          <w:lang w:val="pt-BR" w:eastAsia="pt-BR"/>
-        </w:rPr>
-        <w:t>Texto</w:t>
-      </w:r>
-      <w:proofErr w:type="spellEnd"/>
-      <w:r>
-        <w:rPr>
-          <w:lang w:val="pt-BR" w:eastAsia="pt-BR"/>
-        </w:rPr>
-        <w:t xml:space="preserve"> </w:t>
-      </w:r>
-      <w:proofErr w:type="spellStart"/>
-      <w:r>
-        <w:rPr>
-          <w:lang w:val="pt-BR" w:eastAsia="pt-BR"/>
-        </w:rPr>
-        <w:t>Texto</w:t>
-      </w:r>
-      <w:proofErr w:type="spellEnd"/>
-      <w:r>
-        <w:rPr>
-          <w:lang w:val="pt-BR" w:eastAsia="pt-BR"/>
-        </w:rPr>
-        <w:t xml:space="preserve"> </w:t>
-      </w:r>
-      <w:proofErr w:type="spellStart"/>
-      <w:r>
-        <w:rPr>
-          <w:lang w:val="pt-BR" w:eastAsia="pt-BR"/>
-        </w:rPr>
-        <w:t>Texto</w:t>
-      </w:r>
-      <w:proofErr w:type="spellEnd"/>
-      <w:r>
-        <w:rPr>
-          <w:lang w:val="pt-BR" w:eastAsia="pt-BR"/>
-        </w:rPr>
-        <w:t xml:space="preserve"> </w:t>
-      </w:r>
-      <w:proofErr w:type="spellStart"/>
-      <w:r>
-        <w:rPr>
-          <w:lang w:val="pt-BR" w:eastAsia="pt-BR"/>
-        </w:rPr>
-        <w:t>Texto</w:t>
-      </w:r>
-      <w:proofErr w:type="spellEnd"/>
-      <w:r>
-        <w:rPr>
-          <w:lang w:val="pt-BR" w:eastAsia="pt-BR"/>
-        </w:rPr>
-        <w:t xml:space="preserve"> </w:t>
-      </w:r>
-      <w:proofErr w:type="spellStart"/>
-      <w:r>
-        <w:rPr>
-          <w:lang w:val="pt-BR" w:eastAsia="pt-BR"/>
-        </w:rPr>
-        <w:t>Texto</w:t>
-      </w:r>
-      <w:proofErr w:type="spellEnd"/>
-      <w:r>
-        <w:rPr>
-          <w:lang w:val="pt-BR" w:eastAsia="pt-BR"/>
-        </w:rPr>
-        <w:t xml:space="preserve"> </w:t>
-      </w:r>
-      <w:proofErr w:type="spellStart"/>
-      <w:r>
-        <w:rPr>
-          <w:lang w:val="pt-BR" w:eastAsia="pt-BR"/>
-        </w:rPr>
-        <w:t>Texto</w:t>
-      </w:r>
-      <w:proofErr w:type="spellEnd"/>
-      <w:r>
-        <w:rPr>
-          <w:lang w:val="pt-BR" w:eastAsia="pt-BR"/>
-        </w:rPr>
-        <w:t xml:space="preserve"> </w:t>
-      </w:r>
-      <w:proofErr w:type="spellStart"/>
-      <w:r>
-        <w:rPr>
-          <w:lang w:val="pt-BR" w:eastAsia="pt-BR"/>
-        </w:rPr>
-        <w:t>Texto</w:t>
-      </w:r>
-      <w:proofErr w:type="spellEnd"/>
-      <w:r>
-        <w:rPr>
-          <w:lang w:val="pt-BR" w:eastAsia="pt-BR"/>
-        </w:rPr>
-        <w:t xml:space="preserve"> </w:t>
-      </w:r>
-      <w:proofErr w:type="spellStart"/>
-      <w:r>
-        <w:rPr>
-          <w:lang w:val="pt-BR" w:eastAsia="pt-BR"/>
-        </w:rPr>
-        <w:t>Texto</w:t>
-      </w:r>
-      <w:proofErr w:type="spellEnd"/>
-      <w:r>
-        <w:rPr>
-          <w:lang w:val="pt-BR" w:eastAsia="pt-BR"/>
-        </w:rPr>
-        <w:t xml:space="preserve"> </w:t>
-      </w:r>
-      <w:proofErr w:type="spellStart"/>
-      <w:r>
-        <w:rPr>
-          <w:lang w:val="pt-BR" w:eastAsia="pt-BR"/>
-        </w:rPr>
-        <w:t>Texto</w:t>
-      </w:r>
-      <w:proofErr w:type="spellEnd"/>
-      <w:r>
-        <w:rPr>
-          <w:lang w:val="pt-BR" w:eastAsia="pt-BR"/>
-        </w:rPr>
-        <w:t xml:space="preserve"> </w:t>
-      </w:r>
-      <w:proofErr w:type="spellStart"/>
-      <w:r>
-        <w:rPr>
-          <w:lang w:val="pt-BR" w:eastAsia="pt-BR"/>
-        </w:rPr>
-        <w:t>Texto</w:t>
-      </w:r>
-      <w:proofErr w:type="spellEnd"/>
-      <w:r>
-        <w:rPr>
-          <w:lang w:val="pt-BR" w:eastAsia="pt-BR"/>
-        </w:rPr>
-        <w:t xml:space="preserve"> </w:t>
-      </w:r>
-      <w:proofErr w:type="spellStart"/>
-      <w:r>
-        <w:rPr>
-          <w:lang w:val="pt-BR" w:eastAsia="pt-BR"/>
-        </w:rPr>
-        <w:t>Texto</w:t>
-      </w:r>
-      <w:proofErr w:type="spellEnd"/>
-      <w:r>
-        <w:rPr>
-          <w:lang w:val="pt-BR" w:eastAsia="pt-BR"/>
-        </w:rPr>
-        <w:t xml:space="preserve"> </w:t>
-      </w:r>
-      <w:proofErr w:type="spellStart"/>
-      <w:r>
-        <w:rPr>
-          <w:lang w:val="pt-BR" w:eastAsia="pt-BR"/>
-        </w:rPr>
-        <w:t>Texto</w:t>
-      </w:r>
-      <w:proofErr w:type="spellEnd"/>
-      <w:r>
-        <w:rPr>
-          <w:lang w:val="pt-BR" w:eastAsia="pt-BR"/>
-        </w:rPr>
-        <w:t xml:space="preserve"> </w:t>
-      </w:r>
-      <w:proofErr w:type="spellStart"/>
-      <w:r>
-        <w:rPr>
-          <w:lang w:val="pt-BR" w:eastAsia="pt-BR"/>
-        </w:rPr>
-        <w:t>Texto</w:t>
-      </w:r>
-      <w:proofErr w:type="spellEnd"/>
-      <w:r>
-        <w:rPr>
-          <w:lang w:val="pt-BR" w:eastAsia="pt-BR"/>
-        </w:rPr>
-        <w:t xml:space="preserve"> </w:t>
-      </w:r>
-      <w:proofErr w:type="spellStart"/>
-      <w:r>
-        <w:rPr>
-          <w:lang w:val="pt-BR" w:eastAsia="pt-BR"/>
-        </w:rPr>
-        <w:t>Texto</w:t>
-      </w:r>
-      <w:proofErr w:type="spellEnd"/>
-      <w:r>
-        <w:rPr>
-          <w:lang w:val="pt-BR" w:eastAsia="pt-BR"/>
-        </w:rPr>
-        <w:t xml:space="preserve"> </w:t>
-      </w:r>
-      <w:proofErr w:type="spellStart"/>
-      <w:r>
-        <w:rPr>
-          <w:lang w:val="pt-BR" w:eastAsia="pt-BR"/>
-        </w:rPr>
-        <w:t>Texto</w:t>
-      </w:r>
-      <w:proofErr w:type="spellEnd"/>
-      <w:r>
-        <w:rPr>
-          <w:lang w:val="pt-BR" w:eastAsia="pt-BR"/>
-        </w:rPr>
-        <w:t xml:space="preserve"> </w:t>
-      </w:r>
-      <w:proofErr w:type="spellStart"/>
-      <w:r>
-        <w:rPr>
-          <w:lang w:val="pt-BR" w:eastAsia="pt-BR"/>
-        </w:rPr>
-        <w:t>Texto</w:t>
-      </w:r>
-      <w:proofErr w:type="spellEnd"/>
-      <w:r>
-        <w:rPr>
-          <w:lang w:val="pt-BR" w:eastAsia="pt-BR"/>
-        </w:rPr>
-        <w:t xml:space="preserve"> </w:t>
-      </w:r>
-      <w:proofErr w:type="spellStart"/>
-      <w:r>
-        <w:rPr>
-          <w:lang w:val="pt-BR" w:eastAsia="pt-BR"/>
-        </w:rPr>
-        <w:t>Texto</w:t>
-      </w:r>
-      <w:proofErr w:type="spellEnd"/>
-      <w:r>
-        <w:rPr>
-          <w:lang w:val="pt-BR" w:eastAsia="pt-BR"/>
-        </w:rPr>
-        <w:t xml:space="preserve"> </w:t>
-      </w:r>
-      <w:proofErr w:type="spellStart"/>
-      <w:r>
-        <w:rPr>
-          <w:lang w:val="pt-BR" w:eastAsia="pt-BR"/>
-        </w:rPr>
-        <w:t>Texto</w:t>
-      </w:r>
-      <w:proofErr w:type="spellEnd"/>
+      <w:r>
+        <w:rPr>
+          <w:u w:val="single"/>
+          <w:lang w:val="pt-BR" w:eastAsia="pt-BR"/>
+        </w:rPr>
+        <w:t>Trânsito em Julgado</w:t>
+      </w:r>
+      <w:r>
+        <w:rPr>
+          <w:lang w:val="pt-BR" w:eastAsia="pt-BR"/>
+        </w:rPr>
+        <w:t>, representando o encerramento da possibilidade recursal considerada nesse trecho do modelo.</w:t>
+      </w:r>
+    </w:p>
+    <w:p>
+      <w:pPr>
+        <w:pStyle w:val="Corpodetexto"/>
+        <w:spacing w:line="312" w:lineRule="auto"/>
+        <w:ind w:left="282" w:right="116" w:firstLine="737"/>
+        <w:jc w:val="both"/>
+        <w:rPr>
+          <w:lang w:val="pt-BR" w:eastAsia="pt-BR"/>
+        </w:rPr>
+      </w:pPr>
+      <w:r>
+        <w:rPr>
+          <w:lang w:val="pt-BR" w:eastAsia="pt-BR"/>
+        </w:rPr>
+        <w:t xml:space="preserve">Dessa forma, o diagrama </w:t>
+      </w:r>
+      <w:r>
+        <w:rPr>
+          <w:u w:val="single"/>
+          <w:lang w:val="pt-BR" w:eastAsia="pt-BR"/>
+        </w:rPr>
+        <w:t>Recursos</w:t>
+      </w:r>
+      <w:r>
+        <w:rPr>
+          <w:lang w:val="pt-BR" w:eastAsia="pt-BR"/>
+        </w:rPr>
+        <w:t xml:space="preserve"> organiza os principais conceitos relacionados à fase recursal, integrando a decisão impugnada, o recurso, o prazo, a representação processual, a remessa à </w:t>
+      </w:r>
+      <w:r>
+        <w:rPr>
+          <w:lang w:val="pt-BR" w:eastAsia="pt-BR"/>
+        </w:rPr>
+        <w:t>Turma Recursal</w:t>
+      </w:r>
+      <w:r>
+        <w:rPr>
+          <w:lang w:val="pt-BR" w:eastAsia="pt-BR"/>
+        </w:rPr>
+        <w:t xml:space="preserve">, o julgamento e seus possíveis resultados. O modelo fornece suporte especialmente às Questões de Competência relacionadas à existência de recurso contra a sentença, ao prazo recursal, à necessidade de representação, ao encaminhamento à Turma </w:t>
+      </w:r>
+      <w:r>
+        <w:rPr>
+          <w:lang w:val="pt-BR" w:eastAsia="pt-BR"/>
+        </w:rPr>
+        <w:lastRenderedPageBreak/>
+        <w:t>Recursal e ao resultado do julgamento do recurso</w:t>
+      </w:r>
       <w:r>
         <w:rPr>
           <w:lang w:val="pt-BR" w:eastAsia="pt-BR"/>
         </w:rPr>
         <w:t>.</w:t>
+      </w:r>
+    </w:p>
+    <w:p>
+      <w:pPr>
+        <w:pStyle w:val="Corpodetexto"/>
+        <w:spacing w:line="312" w:lineRule="auto"/>
+        <w:ind w:right="116"/>
+        <w:jc w:val="center"/>
+        <w:rPr>
+          <w:lang w:val="pt-BR" w:eastAsia="pt-BR"/>
+        </w:rPr>
+      </w:pPr>
+      <w:r>
+        <w:t>Figura 21. Diagrama de Recursos.</w:t>
+      </w:r>
+    </w:p>
+    <w:p>
+      <w:pPr>
+        <w:pStyle w:val="Corpodetexto"/>
+        <w:spacing w:line="312" w:lineRule="auto"/>
+        <w:ind w:right="116"/>
+        <w:jc w:val="both"/>
+        <w:rPr>
+          <w:lang w:val="pt-BR" w:eastAsia="pt-BR"/>
+        </w:rPr>
+      </w:pPr>
+      <w:r>
+        <w:rPr>
+          <w:lang w:val="pt-BR" w:eastAsia="pt-BR"/>
+        </w:rPr>
+        <w:drawing>
+          <wp:inline distT="0" distB="0" distL="0" distR="0" wp14:anchorId="2FD5B63B" wp14:editId="15EA9AB7">
+            <wp:extent cx="6033135" cy="3617595"/>
+            <wp:effectExtent l="0" t="0" r="5715" b="1905"/>
+            <wp:docPr id="32" name="Imagem 32"/>
+            <wp:cNvGraphicFramePr>
+              <a:graphicFrameLocks xmlns:a="http://schemas.openxmlformats.org/drawingml/2006/main" noChangeAspect="1"/>
+            </wp:cNvGraphicFramePr>
+            <a:graphic xmlns:a="http://schemas.openxmlformats.org/drawingml/2006/main">
+              <a:graphicData uri="http://schemas.openxmlformats.org/drawingml/2006/picture">
+                <pic:pic xmlns:pic="http://schemas.openxmlformats.org/drawingml/2006/picture">
+                  <pic:nvPicPr>
+                    <pic:cNvPr id="1" name=""/>
+                    <pic:cNvPicPr/>
+                  </pic:nvPicPr>
+                  <pic:blipFill>
+                    <a:blip r:embed="rId45"/>
+                    <a:stretch>
+                      <a:fillRect/>
+                    </a:stretch>
+                  </pic:blipFill>
+                  <pic:spPr>
+                    <a:xfrm>
+                      <a:off x="0" y="0"/>
+                      <a:ext cx="6033135" cy="3617595"/>
+                    </a:xfrm>
+                    <a:prstGeom prst="rect">
+                      <a:avLst/>
+                    </a:prstGeom>
+                  </pic:spPr>
+                </pic:pic>
+              </a:graphicData>
+            </a:graphic>
+          </wp:inline>
+        </w:drawing>
+      </w:r>
+    </w:p>
+    <w:p>
+      <w:pPr>
+        <w:pStyle w:val="Corpodetexto"/>
+        <w:spacing w:line="312" w:lineRule="auto"/>
+        <w:ind w:right="116"/>
+        <w:jc w:val="center"/>
+        <w:rPr>
+          <w:lang w:val="pt-BR" w:eastAsia="pt-BR"/>
+        </w:rPr>
+      </w:pPr>
+      <w:r>
+        <w:rPr>
+          <w:w w:val="105"/>
+        </w:rPr>
+        <w:t>Fonte: elaborado pelo autor (2026)</w:t>
       </w:r>
     </w:p>
     <w:p>
@@ -29221,14 +29810,45 @@
         <w:rPr>
           <w:lang w:val="pt-BR" w:eastAsia="pt-BR"/>
         </w:rPr>
-        <w:t xml:space="preserve">Texto </w:t>
+        <w:t xml:space="preserve">O diagrama </w:t>
+      </w:r>
+      <w:r>
+        <w:rPr>
+          <w:u w:val="single"/>
+          <w:lang w:val="pt-BR" w:eastAsia="pt-BR"/>
+        </w:rPr>
+        <w:t>Cumprimento e Encerramento</w:t>
+      </w:r>
+      <w:r>
+        <w:rPr>
+          <w:lang w:val="pt-BR" w:eastAsia="pt-BR"/>
+        </w:rPr>
+        <w:t xml:space="preserve"> representa os eventos e situações relacionados à fase posterior ao trânsito em julgado da sentença, abrangendo o cumprimento da obrigação judicial e os possíveis desdobramentos até o encerramento do processo.</w:t>
+      </w:r>
+    </w:p>
+    <w:p>
+      <w:pPr>
+        <w:pStyle w:val="Corpodetexto"/>
+        <w:spacing w:line="312" w:lineRule="auto"/>
+        <w:ind w:left="282" w:right="116" w:firstLine="737"/>
+        <w:jc w:val="both"/>
+        <w:rPr>
+          <w:lang w:val="pt-BR" w:eastAsia="pt-BR"/>
+        </w:rPr>
+      </w:pPr>
+      <w:r>
+        <w:rPr>
+          <w:lang w:val="pt-BR" w:eastAsia="pt-BR"/>
+        </w:rPr>
+        <w:t xml:space="preserve">A </w:t>
       </w:r>
       <w:proofErr w:type="spellStart"/>
       <w:r>
         <w:rPr>
-          <w:lang w:val="pt-BR" w:eastAsia="pt-BR"/>
-        </w:rPr>
-        <w:t>Texto</w:t>
+          <w:rFonts w:ascii="Courier New" w:hAnsi="Courier New" w:cs="Courier New"/>
+          <w:lang w:val="pt-BR" w:eastAsia="pt-BR"/>
+        </w:rPr>
+        <w:t>situation</w:t>
       </w:r>
       <w:proofErr w:type="spellEnd"/>
       <w:r>
@@ -29237,12 +29857,39 @@
         </w:rPr>
         <w:t xml:space="preserve"> </w:t>
       </w:r>
+      <w:r>
+        <w:rPr>
+          <w:u w:val="single"/>
+          <w:lang w:val="pt-BR" w:eastAsia="pt-BR"/>
+        </w:rPr>
+        <w:t>Sentença Transitada em Julgado</w:t>
+      </w:r>
+      <w:r>
+        <w:rPr>
+          <w:lang w:val="pt-BR" w:eastAsia="pt-BR"/>
+        </w:rPr>
+        <w:t xml:space="preserve"> </w:t>
+      </w:r>
+      <w:r>
+        <w:rPr>
+          <w:rFonts w:ascii="Courier New" w:hAnsi="Courier New" w:cs="Courier New"/>
+          <w:lang w:val="pt-BR" w:eastAsia="pt-BR"/>
+        </w:rPr>
+        <w:t>triggers</w:t>
+      </w:r>
+      <w:r>
+        <w:rPr>
+          <w:lang w:val="pt-BR" w:eastAsia="pt-BR"/>
+        </w:rPr>
+        <w:t xml:space="preserve"> o </w:t>
+      </w:r>
       <w:proofErr w:type="spellStart"/>
       <w:r>
         <w:rPr>
-          <w:lang w:val="pt-BR" w:eastAsia="pt-BR"/>
-        </w:rPr>
-        <w:t>Texto</w:t>
+          <w:rFonts w:ascii="Courier New" w:hAnsi="Courier New" w:cs="Courier New"/>
+          <w:lang w:val="pt-BR" w:eastAsia="pt-BR"/>
+        </w:rPr>
+        <w:t>event</w:t>
       </w:r>
       <w:proofErr w:type="spellEnd"/>
       <w:r>
@@ -29251,12 +29898,107 @@
         </w:rPr>
         <w:t xml:space="preserve"> </w:t>
       </w:r>
+      <w:r>
+        <w:rPr>
+          <w:u w:val="single"/>
+          <w:lang w:val="pt-BR" w:eastAsia="pt-BR"/>
+        </w:rPr>
+        <w:t>Cumprimento da Sentença</w:t>
+      </w:r>
+      <w:r>
+        <w:rPr>
+          <w:lang w:val="pt-BR" w:eastAsia="pt-BR"/>
+        </w:rPr>
+        <w:t xml:space="preserve">, indicando que, no recorte representado pelo modelo, o início dessa etapa decorre da estabilização da decisão judicial. O </w:t>
+      </w:r>
+      <w:r>
+        <w:rPr>
+          <w:u w:val="single"/>
+          <w:lang w:val="pt-BR" w:eastAsia="pt-BR"/>
+        </w:rPr>
+        <w:t>Cumprimento da Sentença</w:t>
+      </w:r>
+      <w:r>
+        <w:rPr>
+          <w:lang w:val="pt-BR" w:eastAsia="pt-BR"/>
+        </w:rPr>
+        <w:t xml:space="preserve"> está relacionado ao </w:t>
+      </w:r>
+      <w:r>
+        <w:rPr>
+          <w:rFonts w:ascii="Courier New" w:hAnsi="Courier New" w:cs="Courier New"/>
+          <w:lang w:val="pt-BR" w:eastAsia="pt-BR"/>
+        </w:rPr>
+        <w:t>relator</w:t>
+      </w:r>
+      <w:r>
+        <w:rPr>
+          <w:lang w:val="pt-BR" w:eastAsia="pt-BR"/>
+        </w:rPr>
+        <w:t xml:space="preserve"> </w:t>
+      </w:r>
+      <w:r>
+        <w:rPr>
+          <w:u w:val="single"/>
+          <w:lang w:val="pt-BR" w:eastAsia="pt-BR"/>
+        </w:rPr>
+        <w:t>Obrigação Judicial</w:t>
+      </w:r>
+      <w:r>
+        <w:rPr>
+          <w:lang w:val="pt-BR" w:eastAsia="pt-BR"/>
+        </w:rPr>
+        <w:t xml:space="preserve"> pela relação satisfaz, evidenciando que essa fase tem como finalidade efetivar a prestação estabelecida na decisão.</w:t>
+      </w:r>
+    </w:p>
+    <w:p>
+      <w:pPr>
+        <w:pStyle w:val="Corpodetexto"/>
+        <w:spacing w:line="312" w:lineRule="auto"/>
+        <w:ind w:left="282" w:right="116" w:firstLine="737"/>
+        <w:jc w:val="both"/>
+        <w:rPr>
+          <w:lang w:val="pt-BR" w:eastAsia="pt-BR"/>
+        </w:rPr>
+      </w:pPr>
+      <w:r>
+        <w:rPr>
+          <w:lang w:val="pt-BR" w:eastAsia="pt-BR"/>
+        </w:rPr>
+        <w:t xml:space="preserve">A ocorrência do </w:t>
+      </w:r>
+      <w:r>
+        <w:rPr>
+          <w:u w:val="single"/>
+          <w:lang w:val="pt-BR" w:eastAsia="pt-BR"/>
+        </w:rPr>
+        <w:t>Cumprimento da Sentença</w:t>
+      </w:r>
+      <w:r>
+        <w:rPr>
+          <w:lang w:val="pt-BR" w:eastAsia="pt-BR"/>
+        </w:rPr>
+        <w:t xml:space="preserve"> </w:t>
+      </w:r>
+      <w:r>
+        <w:rPr>
+          <w:lang w:val="pt-BR" w:eastAsia="pt-BR"/>
+        </w:rPr>
+        <w:t>leva</w:t>
+      </w:r>
+      <w:r>
+        <w:rPr>
+          <w:lang w:val="pt-BR" w:eastAsia="pt-BR"/>
+        </w:rPr>
+        <w:t xml:space="preserve"> a </w:t>
+      </w:r>
       <w:proofErr w:type="spellStart"/>
       <w:r>
         <w:rPr>
-          <w:lang w:val="pt-BR" w:eastAsia="pt-BR"/>
-        </w:rPr>
-        <w:t>Texto</w:t>
+          <w:rFonts w:ascii="Courier New" w:hAnsi="Courier New" w:cs="Courier New"/>
+          <w:lang w:val="pt-BR" w:eastAsia="pt-BR"/>
+        </w:rPr>
+        <w:t>situation</w:t>
       </w:r>
       <w:proofErr w:type="spellEnd"/>
       <w:r>
@@ -29265,26 +30007,111 @@
         </w:rPr>
         <w:t xml:space="preserve"> </w:t>
       </w:r>
+      <w:r>
+        <w:rPr>
+          <w:u w:val="single"/>
+          <w:lang w:val="pt-BR" w:eastAsia="pt-BR"/>
+        </w:rPr>
+        <w:t>Resultado do Cumprimento</w:t>
+      </w:r>
+      <w:r>
+        <w:rPr>
+          <w:lang w:val="pt-BR" w:eastAsia="pt-BR"/>
+        </w:rPr>
+        <w:t xml:space="preserve">. Esse resultado é especializado nas situações </w:t>
+      </w:r>
+      <w:r>
+        <w:rPr>
+          <w:u w:val="single"/>
+          <w:lang w:val="pt-BR" w:eastAsia="pt-BR"/>
+        </w:rPr>
+        <w:t>Obrigação Cumprida</w:t>
+      </w:r>
+      <w:r>
+        <w:rPr>
+          <w:lang w:val="pt-BR" w:eastAsia="pt-BR"/>
+        </w:rPr>
+        <w:t xml:space="preserve">, </w:t>
+      </w:r>
+      <w:r>
+        <w:rPr>
+          <w:u w:val="single"/>
+          <w:lang w:val="pt-BR" w:eastAsia="pt-BR"/>
+        </w:rPr>
+        <w:t>Obrigação Parcialmente Cumprida</w:t>
+      </w:r>
+      <w:r>
+        <w:rPr>
+          <w:lang w:val="pt-BR" w:eastAsia="pt-BR"/>
+        </w:rPr>
+        <w:t xml:space="preserve"> e </w:t>
+      </w:r>
+      <w:r>
+        <w:rPr>
+          <w:u w:val="single"/>
+          <w:lang w:val="pt-BR" w:eastAsia="pt-BR"/>
+        </w:rPr>
+        <w:t>Obrigação Não Cumprida</w:t>
+      </w:r>
+      <w:r>
+        <w:rPr>
+          <w:lang w:val="pt-BR" w:eastAsia="pt-BR"/>
+        </w:rPr>
+        <w:t xml:space="preserve">. As três especializações integram um conjunto </w:t>
+      </w:r>
+      <w:r>
+        <w:rPr>
+          <w:rFonts w:ascii="Courier New" w:hAnsi="Courier New" w:cs="Courier New"/>
+          <w:lang w:val="pt-BR" w:eastAsia="pt-BR"/>
+        </w:rPr>
+        <w:t>{</w:t>
+      </w:r>
       <w:proofErr w:type="spellStart"/>
       <w:r>
         <w:rPr>
-          <w:lang w:val="pt-BR" w:eastAsia="pt-BR"/>
-        </w:rPr>
-        <w:t>Texto</w:t>
+          <w:rFonts w:ascii="Courier New" w:hAnsi="Courier New" w:cs="Courier New"/>
+          <w:lang w:val="pt-BR" w:eastAsia="pt-BR"/>
+        </w:rPr>
+        <w:t>disjoint</w:t>
       </w:r>
       <w:proofErr w:type="spellEnd"/>
       <w:r>
         <w:rPr>
-          <w:lang w:val="pt-BR" w:eastAsia="pt-BR"/>
-        </w:rPr>
-        <w:t xml:space="preserve"> </w:t>
+          <w:rFonts w:ascii="Courier New" w:hAnsi="Courier New" w:cs="Courier New"/>
+          <w:lang w:val="pt-BR" w:eastAsia="pt-BR"/>
+        </w:rPr>
+        <w:t>, complete}</w:t>
+      </w:r>
+      <w:r>
+        <w:rPr>
+          <w:lang w:val="pt-BR" w:eastAsia="pt-BR"/>
+        </w:rPr>
+        <w:t>, permitindo representar, no escopo da ontologia, os possíveis resultados da verificação do cumprimento da obrigação judicial.</w:t>
+      </w:r>
+    </w:p>
+    <w:p>
+      <w:pPr>
+        <w:pStyle w:val="Corpodetexto"/>
+        <w:spacing w:line="312" w:lineRule="auto"/>
+        <w:ind w:left="282" w:right="116" w:firstLine="737"/>
+        <w:jc w:val="both"/>
+        <w:rPr>
+          <w:lang w:val="pt-BR" w:eastAsia="pt-BR"/>
+        </w:rPr>
+      </w:pPr>
+      <w:r>
+        <w:rPr>
+          <w:lang w:val="pt-BR" w:eastAsia="pt-BR"/>
+        </w:rPr>
+        <w:t xml:space="preserve">Quando a obrigação é integralmente satisfeita, a </w:t>
       </w:r>
       <w:proofErr w:type="spellStart"/>
       <w:r>
         <w:rPr>
-          <w:lang w:val="pt-BR" w:eastAsia="pt-BR"/>
-        </w:rPr>
-        <w:t>Texto</w:t>
+          <w:rFonts w:ascii="Courier New" w:hAnsi="Courier New" w:cs="Courier New"/>
+          <w:lang w:val="pt-BR" w:eastAsia="pt-BR"/>
+        </w:rPr>
+        <w:t>situation</w:t>
       </w:r>
       <w:proofErr w:type="spellEnd"/>
       <w:r>
@@ -29293,12 +30120,39 @@
         </w:rPr>
         <w:t xml:space="preserve"> </w:t>
       </w:r>
+      <w:r>
+        <w:rPr>
+          <w:u w:val="single"/>
+          <w:lang w:val="pt-BR" w:eastAsia="pt-BR"/>
+        </w:rPr>
+        <w:t>Obrigação Cumprida</w:t>
+      </w:r>
+      <w:r>
+        <w:rPr>
+          <w:lang w:val="pt-BR" w:eastAsia="pt-BR"/>
+        </w:rPr>
+        <w:t xml:space="preserve"> </w:t>
+      </w:r>
+      <w:r>
+        <w:rPr>
+          <w:rFonts w:ascii="Courier New" w:hAnsi="Courier New" w:cs="Courier New"/>
+          <w:lang w:val="pt-BR" w:eastAsia="pt-BR"/>
+        </w:rPr>
+        <w:t>triggers</w:t>
+      </w:r>
+      <w:r>
+        <w:rPr>
+          <w:lang w:val="pt-BR" w:eastAsia="pt-BR"/>
+        </w:rPr>
+        <w:t xml:space="preserve"> o </w:t>
+      </w:r>
       <w:proofErr w:type="spellStart"/>
       <w:r>
         <w:rPr>
-          <w:lang w:val="pt-BR" w:eastAsia="pt-BR"/>
-        </w:rPr>
-        <w:t>Texto</w:t>
+          <w:rFonts w:ascii="Courier New" w:hAnsi="Courier New" w:cs="Courier New"/>
+          <w:lang w:val="pt-BR" w:eastAsia="pt-BR"/>
+        </w:rPr>
+        <w:t>event</w:t>
       </w:r>
       <w:proofErr w:type="spellEnd"/>
       <w:r>
@@ -29307,12 +30161,107 @@
         </w:rPr>
         <w:t xml:space="preserve"> </w:t>
       </w:r>
+      <w:r>
+        <w:rPr>
+          <w:u w:val="single"/>
+          <w:lang w:val="pt-BR" w:eastAsia="pt-BR"/>
+        </w:rPr>
+        <w:t>Conclusão do Cumprimento</w:t>
+      </w:r>
+      <w:r>
+        <w:rPr>
+          <w:lang w:val="pt-BR" w:eastAsia="pt-BR"/>
+        </w:rPr>
+        <w:t xml:space="preserve">. Esse evento </w:t>
+      </w:r>
+      <w:r>
+        <w:rPr>
+          <w:lang w:val="pt-BR" w:eastAsia="pt-BR"/>
+        </w:rPr>
+        <w:t>leva</w:t>
+      </w:r>
+      <w:r>
+        <w:rPr>
+          <w:lang w:val="pt-BR" w:eastAsia="pt-BR"/>
+        </w:rPr>
+        <w:t xml:space="preserve"> a situação </w:t>
+      </w:r>
+      <w:r>
+        <w:rPr>
+          <w:u w:val="single"/>
+          <w:lang w:val="pt-BR" w:eastAsia="pt-BR"/>
+        </w:rPr>
+        <w:t>Cumprimento Concluído</w:t>
+      </w:r>
+      <w:r>
+        <w:rPr>
+          <w:lang w:val="pt-BR" w:eastAsia="pt-BR"/>
+        </w:rPr>
+        <w:t>, indicando que não há necessidade de continuidade dos atos voltados à satisfação da obrigação.</w:t>
+      </w:r>
+    </w:p>
+    <w:p>
+      <w:pPr>
+        <w:pStyle w:val="Corpodetexto"/>
+        <w:spacing w:line="312" w:lineRule="auto"/>
+        <w:ind w:left="282" w:right="116" w:firstLine="737"/>
+        <w:jc w:val="both"/>
+        <w:rPr>
+          <w:lang w:val="pt-BR" w:eastAsia="pt-BR"/>
+        </w:rPr>
+      </w:pPr>
+      <w:r>
+        <w:rPr>
+          <w:lang w:val="pt-BR" w:eastAsia="pt-BR"/>
+        </w:rPr>
+        <w:t xml:space="preserve">Nos casos em que a obrigação é apenas parcialmente cumprida ou permanece não cumprida, as situações </w:t>
+      </w:r>
+      <w:r>
+        <w:rPr>
+          <w:u w:val="single"/>
+          <w:lang w:val="pt-BR" w:eastAsia="pt-BR"/>
+        </w:rPr>
+        <w:t>Obrigação Parcialmente Cumprida</w:t>
+      </w:r>
+      <w:r>
+        <w:rPr>
+          <w:lang w:val="pt-BR" w:eastAsia="pt-BR"/>
+        </w:rPr>
+        <w:t xml:space="preserve"> e </w:t>
+      </w:r>
+      <w:r>
+        <w:rPr>
+          <w:u w:val="single"/>
+          <w:lang w:val="pt-BR" w:eastAsia="pt-BR"/>
+        </w:rPr>
+        <w:t>Obrigação Não Cumprida</w:t>
+      </w:r>
+      <w:r>
+        <w:rPr>
+          <w:lang w:val="pt-BR" w:eastAsia="pt-BR"/>
+        </w:rPr>
+        <w:t xml:space="preserve"> </w:t>
+      </w:r>
+      <w:r>
+        <w:rPr>
+          <w:rFonts w:ascii="Courier New" w:hAnsi="Courier New" w:cs="Courier New"/>
+          <w:lang w:val="pt-BR" w:eastAsia="pt-BR"/>
+        </w:rPr>
+        <w:t>trigger</w:t>
+      </w:r>
+      <w:r>
+        <w:rPr>
+          <w:lang w:val="pt-BR" w:eastAsia="pt-BR"/>
+        </w:rPr>
+        <w:t xml:space="preserve"> o </w:t>
+      </w:r>
       <w:proofErr w:type="spellStart"/>
       <w:r>
         <w:rPr>
-          <w:lang w:val="pt-BR" w:eastAsia="pt-BR"/>
-        </w:rPr>
-        <w:t>Texto</w:t>
+          <w:rFonts w:ascii="Courier New" w:hAnsi="Courier New" w:cs="Courier New"/>
+          <w:lang w:val="pt-BR" w:eastAsia="pt-BR"/>
+        </w:rPr>
+        <w:t>event</w:t>
       </w:r>
       <w:proofErr w:type="spellEnd"/>
       <w:r>
@@ -29321,12 +30270,75 @@
         </w:rPr>
         <w:t xml:space="preserve"> </w:t>
       </w:r>
+      <w:r>
+        <w:rPr>
+          <w:u w:val="single"/>
+          <w:lang w:val="pt-BR" w:eastAsia="pt-BR"/>
+        </w:rPr>
+        <w:t>Prosseguimento do Cumprimento</w:t>
+      </w:r>
+      <w:r>
+        <w:rPr>
+          <w:lang w:val="pt-BR" w:eastAsia="pt-BR"/>
+        </w:rPr>
+        <w:t xml:space="preserve">. Esse evento representa a continuidade </w:t>
+      </w:r>
+      <w:r>
+        <w:rPr>
+          <w:lang w:val="pt-BR" w:eastAsia="pt-BR"/>
+        </w:rPr>
+        <w:lastRenderedPageBreak/>
+        <w:t xml:space="preserve">das medidas destinadas à satisfação da obrigação e pode posteriormente </w:t>
+      </w:r>
+      <w:r>
+        <w:rPr>
+          <w:lang w:val="pt-BR" w:eastAsia="pt-BR"/>
+        </w:rPr>
+        <w:t>levar</w:t>
+      </w:r>
+      <w:r>
+        <w:rPr>
+          <w:lang w:val="pt-BR" w:eastAsia="pt-BR"/>
+        </w:rPr>
+        <w:t xml:space="preserve"> a </w:t>
+      </w:r>
+      <w:r>
+        <w:rPr>
+          <w:u w:val="single"/>
+          <w:lang w:val="pt-BR" w:eastAsia="pt-BR"/>
+        </w:rPr>
+        <w:t>Conclusão do Cumprimento</w:t>
+      </w:r>
+      <w:r>
+        <w:rPr>
+          <w:lang w:val="pt-BR" w:eastAsia="pt-BR"/>
+        </w:rPr>
+        <w:t>, caso a prestação venha a ser efetivamente satisfeita.</w:t>
+      </w:r>
+    </w:p>
+    <w:p>
+      <w:pPr>
+        <w:pStyle w:val="Corpodetexto"/>
+        <w:spacing w:line="312" w:lineRule="auto"/>
+        <w:ind w:left="282" w:right="116" w:firstLine="737"/>
+        <w:jc w:val="both"/>
+        <w:rPr>
+          <w:lang w:val="pt-BR" w:eastAsia="pt-BR"/>
+        </w:rPr>
+      </w:pPr>
+      <w:r>
+        <w:rPr>
+          <w:lang w:val="pt-BR" w:eastAsia="pt-BR"/>
+        </w:rPr>
+        <w:t xml:space="preserve">A </w:t>
+      </w:r>
       <w:proofErr w:type="spellStart"/>
       <w:r>
         <w:rPr>
-          <w:lang w:val="pt-BR" w:eastAsia="pt-BR"/>
-        </w:rPr>
-        <w:t>Texto</w:t>
+          <w:rFonts w:ascii="Courier New" w:hAnsi="Courier New" w:cs="Courier New"/>
+          <w:lang w:val="pt-BR" w:eastAsia="pt-BR"/>
+        </w:rPr>
+        <w:t>situation</w:t>
       </w:r>
       <w:proofErr w:type="spellEnd"/>
       <w:r>
@@ -29335,12 +30347,39 @@
         </w:rPr>
         <w:t xml:space="preserve"> </w:t>
       </w:r>
+      <w:r>
+        <w:rPr>
+          <w:u w:val="single"/>
+          <w:lang w:val="pt-BR" w:eastAsia="pt-BR"/>
+        </w:rPr>
+        <w:t>Cumprimento Concluído</w:t>
+      </w:r>
+      <w:r>
+        <w:rPr>
+          <w:lang w:val="pt-BR" w:eastAsia="pt-BR"/>
+        </w:rPr>
+        <w:t xml:space="preserve">, por sua vez, </w:t>
+      </w:r>
+      <w:r>
+        <w:rPr>
+          <w:rFonts w:ascii="Courier New" w:hAnsi="Courier New" w:cs="Courier New"/>
+          <w:lang w:val="pt-BR" w:eastAsia="pt-BR"/>
+        </w:rPr>
+        <w:t>triggers</w:t>
+      </w:r>
+      <w:r>
+        <w:rPr>
+          <w:lang w:val="pt-BR" w:eastAsia="pt-BR"/>
+        </w:rPr>
+        <w:t xml:space="preserve"> o </w:t>
+      </w:r>
       <w:proofErr w:type="spellStart"/>
       <w:r>
         <w:rPr>
-          <w:lang w:val="pt-BR" w:eastAsia="pt-BR"/>
-        </w:rPr>
-        <w:t>Texto</w:t>
+          <w:rFonts w:ascii="Courier New" w:hAnsi="Courier New" w:cs="Courier New"/>
+          <w:lang w:val="pt-BR" w:eastAsia="pt-BR"/>
+        </w:rPr>
+        <w:t>event</w:t>
       </w:r>
       <w:proofErr w:type="spellEnd"/>
       <w:r>
@@ -29349,420 +30388,69 @@
         </w:rPr>
         <w:t xml:space="preserve"> </w:t>
       </w:r>
-      <w:proofErr w:type="spellStart"/>
-      <w:r>
-        <w:rPr>
-          <w:lang w:val="pt-BR" w:eastAsia="pt-BR"/>
-        </w:rPr>
-        <w:t>Texto</w:t>
-      </w:r>
-      <w:proofErr w:type="spellEnd"/>
-      <w:r>
-        <w:rPr>
-          <w:lang w:val="pt-BR" w:eastAsia="pt-BR"/>
-        </w:rPr>
-        <w:t xml:space="preserve"> </w:t>
-      </w:r>
-      <w:proofErr w:type="spellStart"/>
-      <w:r>
-        <w:rPr>
-          <w:lang w:val="pt-BR" w:eastAsia="pt-BR"/>
-        </w:rPr>
-        <w:t>Texto</w:t>
-      </w:r>
-      <w:proofErr w:type="spellEnd"/>
-      <w:r>
-        <w:rPr>
-          <w:lang w:val="pt-BR" w:eastAsia="pt-BR"/>
-        </w:rPr>
-        <w:t xml:space="preserve"> </w:t>
-      </w:r>
-      <w:proofErr w:type="spellStart"/>
-      <w:r>
-        <w:rPr>
-          <w:lang w:val="pt-BR" w:eastAsia="pt-BR"/>
-        </w:rPr>
-        <w:t>Texto</w:t>
-      </w:r>
-      <w:proofErr w:type="spellEnd"/>
-      <w:r>
-        <w:rPr>
-          <w:lang w:val="pt-BR" w:eastAsia="pt-BR"/>
-        </w:rPr>
-        <w:t xml:space="preserve"> </w:t>
-      </w:r>
-      <w:proofErr w:type="spellStart"/>
-      <w:r>
-        <w:rPr>
-          <w:lang w:val="pt-BR" w:eastAsia="pt-BR"/>
-        </w:rPr>
-        <w:t>Texto</w:t>
-      </w:r>
-      <w:proofErr w:type="spellEnd"/>
-      <w:r>
-        <w:rPr>
-          <w:lang w:val="pt-BR" w:eastAsia="pt-BR"/>
-        </w:rPr>
-        <w:t xml:space="preserve"> </w:t>
-      </w:r>
-      <w:proofErr w:type="spellStart"/>
-      <w:r>
-        <w:rPr>
-          <w:lang w:val="pt-BR" w:eastAsia="pt-BR"/>
-        </w:rPr>
-        <w:t>Texto</w:t>
-      </w:r>
-      <w:proofErr w:type="spellEnd"/>
-      <w:r>
-        <w:rPr>
-          <w:lang w:val="pt-BR" w:eastAsia="pt-BR"/>
-        </w:rPr>
-        <w:t xml:space="preserve"> </w:t>
-      </w:r>
-      <w:proofErr w:type="spellStart"/>
-      <w:r>
-        <w:rPr>
-          <w:lang w:val="pt-BR" w:eastAsia="pt-BR"/>
-        </w:rPr>
-        <w:t>Texto</w:t>
-      </w:r>
-      <w:proofErr w:type="spellEnd"/>
-      <w:r>
-        <w:rPr>
-          <w:lang w:val="pt-BR" w:eastAsia="pt-BR"/>
-        </w:rPr>
-        <w:t xml:space="preserve"> </w:t>
-      </w:r>
-      <w:proofErr w:type="spellStart"/>
-      <w:r>
-        <w:rPr>
-          <w:lang w:val="pt-BR" w:eastAsia="pt-BR"/>
-        </w:rPr>
-        <w:t>Texto</w:t>
-      </w:r>
-      <w:proofErr w:type="spellEnd"/>
-      <w:r>
-        <w:rPr>
-          <w:lang w:val="pt-BR" w:eastAsia="pt-BR"/>
-        </w:rPr>
-        <w:t xml:space="preserve"> </w:t>
-      </w:r>
-      <w:proofErr w:type="spellStart"/>
-      <w:r>
-        <w:rPr>
-          <w:lang w:val="pt-BR" w:eastAsia="pt-BR"/>
-        </w:rPr>
-        <w:t>Texto</w:t>
-      </w:r>
-      <w:proofErr w:type="spellEnd"/>
-      <w:r>
-        <w:rPr>
-          <w:lang w:val="pt-BR" w:eastAsia="pt-BR"/>
-        </w:rPr>
-        <w:t xml:space="preserve"> </w:t>
-      </w:r>
-      <w:proofErr w:type="spellStart"/>
-      <w:r>
-        <w:rPr>
-          <w:lang w:val="pt-BR" w:eastAsia="pt-BR"/>
-        </w:rPr>
-        <w:t>Texto</w:t>
-      </w:r>
-      <w:proofErr w:type="spellEnd"/>
-      <w:r>
-        <w:rPr>
-          <w:lang w:val="pt-BR" w:eastAsia="pt-BR"/>
-        </w:rPr>
-        <w:t xml:space="preserve"> </w:t>
-      </w:r>
-      <w:proofErr w:type="spellStart"/>
-      <w:r>
-        <w:rPr>
-          <w:lang w:val="pt-BR" w:eastAsia="pt-BR"/>
-        </w:rPr>
-        <w:t>Texto</w:t>
-      </w:r>
-      <w:proofErr w:type="spellEnd"/>
-      <w:r>
-        <w:rPr>
-          <w:lang w:val="pt-BR" w:eastAsia="pt-BR"/>
-        </w:rPr>
-        <w:t xml:space="preserve"> </w:t>
-      </w:r>
-      <w:proofErr w:type="spellStart"/>
-      <w:r>
-        <w:rPr>
-          <w:lang w:val="pt-BR" w:eastAsia="pt-BR"/>
-        </w:rPr>
-        <w:t>Texto</w:t>
-      </w:r>
-      <w:proofErr w:type="spellEnd"/>
-      <w:r>
-        <w:rPr>
-          <w:lang w:val="pt-BR" w:eastAsia="pt-BR"/>
-        </w:rPr>
-        <w:t xml:space="preserve"> </w:t>
-      </w:r>
-      <w:proofErr w:type="spellStart"/>
-      <w:r>
-        <w:rPr>
-          <w:lang w:val="pt-BR" w:eastAsia="pt-BR"/>
-        </w:rPr>
-        <w:t>Texto</w:t>
-      </w:r>
-      <w:proofErr w:type="spellEnd"/>
-      <w:r>
-        <w:rPr>
-          <w:lang w:val="pt-BR" w:eastAsia="pt-BR"/>
-        </w:rPr>
-        <w:t xml:space="preserve"> </w:t>
-      </w:r>
-      <w:proofErr w:type="spellStart"/>
-      <w:r>
-        <w:rPr>
-          <w:lang w:val="pt-BR" w:eastAsia="pt-BR"/>
-        </w:rPr>
-        <w:t>Texto</w:t>
-      </w:r>
-      <w:proofErr w:type="spellEnd"/>
-      <w:r>
-        <w:rPr>
-          <w:lang w:val="pt-BR" w:eastAsia="pt-BR"/>
-        </w:rPr>
-        <w:t xml:space="preserve"> </w:t>
-      </w:r>
-      <w:proofErr w:type="spellStart"/>
-      <w:r>
-        <w:rPr>
-          <w:lang w:val="pt-BR" w:eastAsia="pt-BR"/>
-        </w:rPr>
-        <w:t>Texto</w:t>
-      </w:r>
-      <w:proofErr w:type="spellEnd"/>
-      <w:r>
-        <w:rPr>
-          <w:lang w:val="pt-BR" w:eastAsia="pt-BR"/>
-        </w:rPr>
-        <w:t xml:space="preserve"> </w:t>
-      </w:r>
-      <w:proofErr w:type="spellStart"/>
-      <w:r>
-        <w:rPr>
-          <w:lang w:val="pt-BR" w:eastAsia="pt-BR"/>
-        </w:rPr>
-        <w:t>Texto</w:t>
-      </w:r>
-      <w:proofErr w:type="spellEnd"/>
-      <w:r>
-        <w:rPr>
-          <w:lang w:val="pt-BR" w:eastAsia="pt-BR"/>
-        </w:rPr>
-        <w:t xml:space="preserve"> </w:t>
-      </w:r>
-      <w:proofErr w:type="spellStart"/>
-      <w:r>
-        <w:rPr>
-          <w:lang w:val="pt-BR" w:eastAsia="pt-BR"/>
-        </w:rPr>
-        <w:t>Texto</w:t>
-      </w:r>
-      <w:proofErr w:type="spellEnd"/>
-      <w:r>
-        <w:rPr>
-          <w:lang w:val="pt-BR" w:eastAsia="pt-BR"/>
-        </w:rPr>
-        <w:t xml:space="preserve"> </w:t>
-      </w:r>
-      <w:proofErr w:type="spellStart"/>
-      <w:r>
-        <w:rPr>
-          <w:lang w:val="pt-BR" w:eastAsia="pt-BR"/>
-        </w:rPr>
-        <w:t>Texto</w:t>
-      </w:r>
-      <w:proofErr w:type="spellEnd"/>
-      <w:r>
-        <w:rPr>
-          <w:lang w:val="pt-BR" w:eastAsia="pt-BR"/>
-        </w:rPr>
-        <w:t xml:space="preserve"> </w:t>
-      </w:r>
-      <w:proofErr w:type="spellStart"/>
-      <w:r>
-        <w:rPr>
-          <w:lang w:val="pt-BR" w:eastAsia="pt-BR"/>
-        </w:rPr>
-        <w:t>Texto</w:t>
-      </w:r>
-      <w:proofErr w:type="spellEnd"/>
-      <w:r>
-        <w:rPr>
-          <w:lang w:val="pt-BR" w:eastAsia="pt-BR"/>
-        </w:rPr>
-        <w:t xml:space="preserve"> </w:t>
-      </w:r>
-      <w:proofErr w:type="spellStart"/>
-      <w:r>
-        <w:rPr>
-          <w:lang w:val="pt-BR" w:eastAsia="pt-BR"/>
-        </w:rPr>
-        <w:t>Texto</w:t>
-      </w:r>
-      <w:proofErr w:type="spellEnd"/>
-      <w:r>
-        <w:rPr>
-          <w:lang w:val="pt-BR" w:eastAsia="pt-BR"/>
-        </w:rPr>
-        <w:t xml:space="preserve"> </w:t>
-      </w:r>
-      <w:proofErr w:type="spellStart"/>
-      <w:r>
-        <w:rPr>
-          <w:lang w:val="pt-BR" w:eastAsia="pt-BR"/>
-        </w:rPr>
-        <w:t>Texto</w:t>
-      </w:r>
-      <w:proofErr w:type="spellEnd"/>
-      <w:r>
-        <w:rPr>
-          <w:lang w:val="pt-BR" w:eastAsia="pt-BR"/>
-        </w:rPr>
-        <w:t xml:space="preserve"> </w:t>
-      </w:r>
-      <w:proofErr w:type="spellStart"/>
-      <w:r>
-        <w:rPr>
-          <w:lang w:val="pt-BR" w:eastAsia="pt-BR"/>
-        </w:rPr>
-        <w:t>Texto</w:t>
-      </w:r>
-      <w:proofErr w:type="spellEnd"/>
-      <w:r>
-        <w:rPr>
-          <w:lang w:val="pt-BR" w:eastAsia="pt-BR"/>
-        </w:rPr>
-        <w:t xml:space="preserve"> </w:t>
-      </w:r>
-      <w:proofErr w:type="spellStart"/>
-      <w:r>
-        <w:rPr>
-          <w:lang w:val="pt-BR" w:eastAsia="pt-BR"/>
-        </w:rPr>
-        <w:t>Texto</w:t>
-      </w:r>
-      <w:proofErr w:type="spellEnd"/>
-      <w:r>
-        <w:rPr>
-          <w:lang w:val="pt-BR" w:eastAsia="pt-BR"/>
-        </w:rPr>
-        <w:t xml:space="preserve"> </w:t>
-      </w:r>
-      <w:proofErr w:type="spellStart"/>
-      <w:r>
-        <w:rPr>
-          <w:lang w:val="pt-BR" w:eastAsia="pt-BR"/>
-        </w:rPr>
-        <w:t>Texto</w:t>
-      </w:r>
-      <w:proofErr w:type="spellEnd"/>
-      <w:r>
-        <w:rPr>
-          <w:lang w:val="pt-BR" w:eastAsia="pt-BR"/>
-        </w:rPr>
-        <w:t xml:space="preserve"> </w:t>
-      </w:r>
-      <w:proofErr w:type="spellStart"/>
-      <w:r>
-        <w:rPr>
-          <w:lang w:val="pt-BR" w:eastAsia="pt-BR"/>
-        </w:rPr>
-        <w:t>Texto</w:t>
-      </w:r>
-      <w:proofErr w:type="spellEnd"/>
-      <w:r>
-        <w:rPr>
-          <w:lang w:val="pt-BR" w:eastAsia="pt-BR"/>
-        </w:rPr>
-        <w:t xml:space="preserve"> </w:t>
-      </w:r>
-      <w:proofErr w:type="spellStart"/>
-      <w:r>
-        <w:rPr>
-          <w:lang w:val="pt-BR" w:eastAsia="pt-BR"/>
-        </w:rPr>
-        <w:t>Texto</w:t>
-      </w:r>
-      <w:proofErr w:type="spellEnd"/>
-      <w:r>
-        <w:rPr>
-          <w:lang w:val="pt-BR" w:eastAsia="pt-BR"/>
-        </w:rPr>
-        <w:t xml:space="preserve"> </w:t>
-      </w:r>
-      <w:proofErr w:type="spellStart"/>
-      <w:r>
-        <w:rPr>
-          <w:lang w:val="pt-BR" w:eastAsia="pt-BR"/>
-        </w:rPr>
-        <w:t>Texto</w:t>
-      </w:r>
-      <w:proofErr w:type="spellEnd"/>
-      <w:r>
-        <w:rPr>
-          <w:lang w:val="pt-BR" w:eastAsia="pt-BR"/>
-        </w:rPr>
-        <w:t xml:space="preserve"> </w:t>
-      </w:r>
-      <w:proofErr w:type="spellStart"/>
-      <w:r>
-        <w:rPr>
-          <w:lang w:val="pt-BR" w:eastAsia="pt-BR"/>
-        </w:rPr>
-        <w:t>Texto</w:t>
-      </w:r>
-      <w:proofErr w:type="spellEnd"/>
-      <w:r>
-        <w:rPr>
-          <w:lang w:val="pt-BR" w:eastAsia="pt-BR"/>
-        </w:rPr>
-        <w:t xml:space="preserve"> </w:t>
-      </w:r>
-      <w:proofErr w:type="spellStart"/>
-      <w:r>
-        <w:rPr>
-          <w:lang w:val="pt-BR" w:eastAsia="pt-BR"/>
-        </w:rPr>
-        <w:t>Texto</w:t>
-      </w:r>
-      <w:proofErr w:type="spellEnd"/>
-      <w:r>
-        <w:rPr>
-          <w:lang w:val="pt-BR" w:eastAsia="pt-BR"/>
-        </w:rPr>
-        <w:t xml:space="preserve"> </w:t>
-      </w:r>
-      <w:proofErr w:type="spellStart"/>
-      <w:r>
-        <w:rPr>
-          <w:lang w:val="pt-BR" w:eastAsia="pt-BR"/>
-        </w:rPr>
-        <w:t>Texto</w:t>
-      </w:r>
-      <w:proofErr w:type="spellEnd"/>
-      <w:r>
-        <w:rPr>
-          <w:lang w:val="pt-BR" w:eastAsia="pt-BR"/>
-        </w:rPr>
-        <w:t xml:space="preserve"> </w:t>
-      </w:r>
-      <w:proofErr w:type="spellStart"/>
-      <w:r>
-        <w:rPr>
-          <w:lang w:val="pt-BR" w:eastAsia="pt-BR"/>
-        </w:rPr>
-        <w:t>Texto</w:t>
-      </w:r>
-      <w:proofErr w:type="spellEnd"/>
+      <w:r>
+        <w:rPr>
+          <w:u w:val="single"/>
+          <w:lang w:val="pt-BR" w:eastAsia="pt-BR"/>
+        </w:rPr>
+        <w:t>Arquivamento do Processo</w:t>
+      </w:r>
+      <w:r>
+        <w:rPr>
+          <w:lang w:val="pt-BR" w:eastAsia="pt-BR"/>
+        </w:rPr>
+        <w:t xml:space="preserve">. O arquivamento </w:t>
+      </w:r>
+      <w:r>
+        <w:rPr>
+          <w:lang w:val="pt-BR" w:eastAsia="pt-BR"/>
+        </w:rPr>
+        <w:t>leva</w:t>
+      </w:r>
+      <w:r>
+        <w:rPr>
+          <w:lang w:val="pt-BR" w:eastAsia="pt-BR"/>
+        </w:rPr>
+        <w:t xml:space="preserve"> a situação </w:t>
+      </w:r>
+      <w:r>
+        <w:rPr>
+          <w:u w:val="single"/>
+          <w:lang w:val="pt-BR" w:eastAsia="pt-BR"/>
+        </w:rPr>
+        <w:t>Processo Arquivado por Satisfação da Obrigação</w:t>
+      </w:r>
+      <w:r>
+        <w:rPr>
+          <w:lang w:val="pt-BR" w:eastAsia="pt-BR"/>
+        </w:rPr>
+        <w:t>, representando o encerramento do percurso processual contemplado pela ontologia após o cumprimen</w:t>
+      </w:r>
+      <w:bookmarkStart w:id="55" w:name="_GoBack"/>
+      <w:bookmarkEnd w:id="55"/>
+      <w:r>
+        <w:rPr>
+          <w:lang w:val="pt-BR" w:eastAsia="pt-BR"/>
+        </w:rPr>
+        <w:t>to da prestação reconhecida judicialmente.</w:t>
+      </w:r>
+    </w:p>
+    <w:p>
+      <w:pPr>
+        <w:pStyle w:val="Corpodetexto"/>
+        <w:spacing w:line="312" w:lineRule="auto"/>
+        <w:ind w:left="282" w:right="116" w:firstLine="737"/>
+        <w:jc w:val="both"/>
+        <w:rPr>
+          <w:lang w:val="pt-BR" w:eastAsia="pt-BR"/>
+        </w:rPr>
+      </w:pPr>
+      <w:r>
+        <w:rPr>
+          <w:lang w:val="pt-BR" w:eastAsia="pt-BR"/>
+        </w:rPr>
+        <w:t>Dessa forma, o diagrama permite acompanhar a evolução da fase de cumprimento desde o trânsito em julgado até o arquivamento do processo, distinguindo as hipóteses de cumprimento integral, parcial ou inexistente da obrigação. O modelo fornece suporte especialmente às Questões de Competência relacionadas ao cumprimento da sentença, à conclusão dessa fase e à possibilidade de arquivamento do processo em razão da satisfação da obrigação</w:t>
+      </w:r>
       <w:r>
         <w:rPr>
           <w:lang w:val="pt-BR" w:eastAsia="pt-BR"/>
@@ -29774,20 +30462,100 @@
       <w:pPr>
         <w:pStyle w:val="Corpodetexto"/>
         <w:spacing w:line="312" w:lineRule="auto"/>
+        <w:ind w:right="116"/>
+        <w:jc w:val="center"/>
+        <w:rPr>
+          <w:lang w:val="pt-BR" w:eastAsia="pt-BR"/>
+        </w:rPr>
+      </w:pPr>
+      <w:r>
+        <w:t>Figura 2</w:t>
+      </w:r>
+      <w:r>
+        <w:t>2</w:t>
+      </w:r>
+      <w:r>
+        <w:t xml:space="preserve">. Diagrama de </w:t>
+      </w:r>
+      <w:r>
+        <w:t>Cumprimento e Encerramento</w:t>
+      </w:r>
+      <w:r>
+        <w:t>.</w:t>
+      </w:r>
+    </w:p>
+    <w:p>
+      <w:pPr>
+        <w:pStyle w:val="Corpodetexto"/>
+        <w:spacing w:line="312" w:lineRule="auto"/>
+        <w:ind w:right="116"/>
         <w:jc w:val="both"/>
-      </w:pPr>
+        <w:rPr>
+          <w:lang w:val="pt-BR" w:eastAsia="pt-BR"/>
+        </w:rPr>
+      </w:pPr>
+      <w:r>
+        <w:rPr>
+          <w:lang w:val="pt-BR" w:eastAsia="pt-BR"/>
+        </w:rPr>
+        <w:drawing>
+          <wp:inline distT="0" distB="0" distL="0" distR="0" wp14:anchorId="782BC31A" wp14:editId="6AA5BDB3">
+            <wp:extent cx="6033135" cy="6166485"/>
+            <wp:effectExtent l="0" t="0" r="5715" b="5715"/>
+            <wp:docPr id="34" name="Imagem 34"/>
+            <wp:cNvGraphicFramePr>
+              <a:graphicFrameLocks xmlns:a="http://schemas.openxmlformats.org/drawingml/2006/main" noChangeAspect="1"/>
+            </wp:cNvGraphicFramePr>
+            <a:graphic xmlns:a="http://schemas.openxmlformats.org/drawingml/2006/main">
+              <a:graphicData uri="http://schemas.openxmlformats.org/drawingml/2006/picture">
+                <pic:pic xmlns:pic="http://schemas.openxmlformats.org/drawingml/2006/picture">
+                  <pic:nvPicPr>
+                    <pic:cNvPr id="1" name=""/>
+                    <pic:cNvPicPr/>
+                  </pic:nvPicPr>
+                  <pic:blipFill>
+                    <a:blip r:embed="rId46"/>
+                    <a:stretch>
+                      <a:fillRect/>
+                    </a:stretch>
+                  </pic:blipFill>
+                  <pic:spPr>
+                    <a:xfrm>
+                      <a:off x="0" y="0"/>
+                      <a:ext cx="6033135" cy="6166485"/>
+                    </a:xfrm>
+                    <a:prstGeom prst="rect">
+                      <a:avLst/>
+                    </a:prstGeom>
+                  </pic:spPr>
+                </pic:pic>
+              </a:graphicData>
+            </a:graphic>
+          </wp:inline>
+        </w:drawing>
+      </w:r>
     </w:p>
     <w:p>
       <w:pPr>
         <w:pStyle w:val="Corpodetexto"/>
         <w:spacing w:line="312" w:lineRule="auto"/>
-        <w:jc w:val="both"/>
+        <w:ind w:right="116"/>
+        <w:jc w:val="center"/>
+        <w:rPr>
+          <w:lang w:val="pt-BR" w:eastAsia="pt-BR"/>
+        </w:rPr>
         <w:sectPr>
           <w:pgSz w:w="11910" w:h="16840"/>
           <w:pgMar w:top="1260" w:right="992" w:bottom="280" w:left="1417" w:header="994" w:footer="0" w:gutter="0"/>
           <w:cols w:space="720"/>
         </w:sectPr>
       </w:pPr>
+      <w:r>
+        <w:rPr>
+          <w:w w:val="105"/>
+        </w:rPr>
+        <w:t>Fonte: elaborado pelo autor (2026)</w:t>
+      </w:r>
     </w:p>
     <w:p>
       <w:pPr>
@@ -31646,7 +32414,7 @@
         </w:rPr>
         <w:t xml:space="preserve">Experience (online first: </w:t>
       </w:r>
-      <w:hyperlink r:id="rId45">
+      <w:hyperlink r:id="rId47">
         <w:r>
           <w:rPr>
             <w:rFonts w:ascii="Palatino Linotype" w:hAnsi="Palatino Linotype"/>
@@ -31787,8 +32555,8 @@
           <w:sz w:val="24"/>
         </w:rPr>
         <w:sectPr>
-          <w:headerReference w:type="even" r:id="rId46"/>
-          <w:headerReference w:type="default" r:id="rId47"/>
+          <w:headerReference w:type="even" r:id="rId48"/>
+          <w:headerReference w:type="default" r:id="rId49"/>
           <w:pgSz w:w="11910" w:h="16840"/>
           <w:pgMar w:top="1380" w:right="992" w:bottom="280" w:left="1559" w:header="994" w:footer="0" w:gutter="0"/>
           <w:cols w:space="720"/>
@@ -31886,9 +32654,9 @@
       <w:bookmarkEnd w:id="74"/>
     </w:p>
     <w:sectPr>
-      <w:headerReference w:type="even" r:id="rId48"/>
-      <w:headerReference w:type="default" r:id="rId49"/>
-      <w:footerReference w:type="even" r:id="rId50"/>
+      <w:headerReference w:type="even" r:id="rId50"/>
+      <w:headerReference w:type="default" r:id="rId51"/>
+      <w:footerReference w:type="even" r:id="rId52"/>
       <w:pgSz w:w="11910" w:h="16840"/>
       <w:pgMar w:top="1920" w:right="992" w:bottom="280" w:left="1559" w:header="0" w:footer="0" w:gutter="0"/>
       <w:cols w:space="720"/>
@@ -36530,6 +37298,7 @@
     <w:rsid w:val="007E08FE"/>
     <w:rsid w:val="009D5B87"/>
     <w:rsid w:val="00AC02CF"/>
+    <w:rsid w:val="00B515BA"/>
     <w:rsid w:val="00B65997"/>
     <w:rsid w:val="00B94D0D"/>
     <w:rsid w:val="00CA08CA"/>
@@ -37318,7 +38087,7 @@
 </file>
 
 <file path=customXml/itemProps1.xml><?xml version="1.0" encoding="utf-8"?>
-<ds:datastoreItem xmlns:ds="http://schemas.openxmlformats.org/officeDocument/2006/customXml" ds:itemID="{ACBCD048-9CB9-4501-BA0C-8AD6F6E1F84C}">
+<ds:datastoreItem xmlns:ds="http://schemas.openxmlformats.org/officeDocument/2006/customXml" ds:itemID="{18402B0D-6CB3-4596-AC56-8AEAE8D46E0A}">
   <ds:schemaRefs>
     <ds:schemaRef ds:uri="http://schemas.openxmlformats.org/officeDocument/2006/bibliography"/>
   </ds:schemaRefs>

</xml_diff>

<commit_message>
ajustes de diagramas na escrita
</commit_message>
<xml_diff>
--- a/backup/tcc-jec.docx
+++ b/backup/tcc-jec.docx
@@ -22494,15 +22494,14 @@
       </w:pPr>
       <w:r>
         <w:rPr>
-          <w:noProof/>
           <w:lang w:val="pt-BR" w:eastAsia="pt-BR"/>
         </w:rPr>
         <w:lastRenderedPageBreak/>
         <w:drawing>
-          <wp:inline distT="0" distB="0" distL="0" distR="0" wp14:anchorId="7157D1AA" wp14:editId="7824A15D">
-            <wp:extent cx="6033135" cy="3046730"/>
-            <wp:effectExtent l="0" t="0" r="5715" b="1270"/>
-            <wp:docPr id="17" name="Imagem 17"/>
+          <wp:inline distT="0" distB="0" distL="0" distR="0" wp14:anchorId="6CCDE98F" wp14:editId="1E9D9074">
+            <wp:extent cx="6033135" cy="3091815"/>
+            <wp:effectExtent l="0" t="0" r="5715" b="0"/>
+            <wp:docPr id="33" name="Imagem 33"/>
             <wp:cNvGraphicFramePr>
               <a:graphicFrameLocks xmlns:a="http://schemas.openxmlformats.org/drawingml/2006/main" noChangeAspect="1"/>
             </wp:cNvGraphicFramePr>
@@ -22522,7 +22521,7 @@
                   <pic:spPr>
                     <a:xfrm>
                       <a:off x="0" y="0"/>
-                      <a:ext cx="6033135" cy="3046730"/>
+                      <a:ext cx="6033135" cy="3091815"/>
                     </a:xfrm>
                     <a:prstGeom prst="rect">
                       <a:avLst/>
@@ -22534,6 +22533,8 @@
           </wp:inline>
         </w:drawing>
       </w:r>
+      <w:bookmarkStart w:id="54" w:name="_GoBack"/>
+      <w:bookmarkEnd w:id="54"/>
     </w:p>
     <w:p>
       <w:pPr>
@@ -22580,11 +22581,11 @@
         <w:spacing w:before="2"/>
         <w:ind w:left="737" w:hanging="737"/>
       </w:pPr>
-      <w:bookmarkStart w:id="54" w:name="_Toc243053032"/>
+      <w:bookmarkStart w:id="55" w:name="_Toc243053032"/>
       <w:r>
         <w:t>Pacote Procedimental</w:t>
       </w:r>
-      <w:bookmarkEnd w:id="54"/>
+      <w:bookmarkEnd w:id="55"/>
       <w:r>
         <w:br/>
       </w:r>
@@ -25932,13 +25933,13 @@
       </w:pPr>
       <w:r>
         <w:rPr>
-          <w:noProof/>
+          <w:lang w:val="pt-BR" w:eastAsia="pt-BR"/>
         </w:rPr>
         <w:drawing>
-          <wp:inline distT="0" distB="0" distL="0" distR="0" wp14:anchorId="6785FDA8" wp14:editId="1B04FD6C">
-            <wp:extent cx="6033135" cy="3699510"/>
-            <wp:effectExtent l="0" t="0" r="5715" b="0"/>
-            <wp:docPr id="27" name="Imagem 27" descr="C:\Users\leo\AppData\Local\Microsoft\Windows\INetCache\Content.MSO\5576D734.tmp"/>
+          <wp:inline distT="0" distB="0" distL="0" distR="0" wp14:anchorId="0234CAC1" wp14:editId="6B004DC3">
+            <wp:extent cx="6033135" cy="4850765"/>
+            <wp:effectExtent l="0" t="0" r="5715" b="6985"/>
+            <wp:docPr id="30" name="Imagem 30"/>
             <wp:cNvGraphicFramePr>
               <a:graphicFrameLocks xmlns:a="http://schemas.openxmlformats.org/drawingml/2006/main" noChangeAspect="1"/>
             </wp:cNvGraphicFramePr>
@@ -25946,36 +25947,23 @@
               <a:graphicData uri="http://schemas.openxmlformats.org/drawingml/2006/picture">
                 <pic:pic xmlns:pic="http://schemas.openxmlformats.org/drawingml/2006/picture">
                   <pic:nvPicPr>
-                    <pic:cNvPr id="0" name="Picture 3" descr="C:\Users\leo\AppData\Local\Microsoft\Windows\INetCache\Content.MSO\5576D734.tmp"/>
-                    <pic:cNvPicPr>
-                      <a:picLocks noChangeAspect="1" noChangeArrowheads="1"/>
-                    </pic:cNvPicPr>
+                    <pic:cNvPr id="1" name=""/>
+                    <pic:cNvPicPr/>
                   </pic:nvPicPr>
                   <pic:blipFill>
-                    <a:blip r:embed="rId41">
-                      <a:extLst>
-                        <a:ext uri="{28A0092B-C50C-407E-A947-70E740481C1C}">
-                          <a14:useLocalDpi xmlns:a14="http://schemas.microsoft.com/office/drawing/2010/main" val="0"/>
-                        </a:ext>
-                      </a:extLst>
-                    </a:blip>
-                    <a:srcRect/>
+                    <a:blip r:embed="rId41"/>
                     <a:stretch>
                       <a:fillRect/>
                     </a:stretch>
                   </pic:blipFill>
-                  <pic:spPr bwMode="auto">
+                  <pic:spPr>
                     <a:xfrm>
                       <a:off x="0" y="0"/>
-                      <a:ext cx="6033135" cy="3699510"/>
+                      <a:ext cx="6033135" cy="4850765"/>
                     </a:xfrm>
                     <a:prstGeom prst="rect">
                       <a:avLst/>
                     </a:prstGeom>
-                    <a:noFill/>
-                    <a:ln>
-                      <a:noFill/>
-                    </a:ln>
                   </pic:spPr>
                 </pic:pic>
               </a:graphicData>
@@ -26153,7 +26141,6 @@
           <w:u w:val="single"/>
           <w:lang w:val="pt-BR" w:eastAsia="pt-BR"/>
         </w:rPr>
-        <w:lastRenderedPageBreak/>
         <w:t>Testemunha</w:t>
       </w:r>
       <w:r>
@@ -27277,13 +27264,13 @@
       </w:pPr>
       <w:r>
         <w:rPr>
-          <w:noProof/>
+          <w:lang w:val="pt-BR" w:eastAsia="pt-BR"/>
         </w:rPr>
         <w:drawing>
-          <wp:inline distT="0" distB="0" distL="0" distR="0" wp14:anchorId="3986D712" wp14:editId="1C89C76C">
-            <wp:extent cx="6033135" cy="4618990"/>
-            <wp:effectExtent l="0" t="0" r="5715" b="0"/>
-            <wp:docPr id="29" name="Imagem 29" descr="C:\Users\leo\AppData\Local\Microsoft\Windows\INetCache\Content.MSO\E0442762.tmp"/>
+          <wp:inline distT="0" distB="0" distL="0" distR="0" wp14:anchorId="4EE19AD4" wp14:editId="39F31D8A">
+            <wp:extent cx="6033135" cy="5537200"/>
+            <wp:effectExtent l="0" t="0" r="5715" b="6350"/>
+            <wp:docPr id="24" name="Imagem 24"/>
             <wp:cNvGraphicFramePr>
               <a:graphicFrameLocks xmlns:a="http://schemas.openxmlformats.org/drawingml/2006/main" noChangeAspect="1"/>
             </wp:cNvGraphicFramePr>
@@ -27291,36 +27278,23 @@
               <a:graphicData uri="http://schemas.openxmlformats.org/drawingml/2006/picture">
                 <pic:pic xmlns:pic="http://schemas.openxmlformats.org/drawingml/2006/picture">
                   <pic:nvPicPr>
-                    <pic:cNvPr id="0" name="Picture 5" descr="C:\Users\leo\AppData\Local\Microsoft\Windows\INetCache\Content.MSO\E0442762.tmp"/>
-                    <pic:cNvPicPr>
-                      <a:picLocks noChangeAspect="1" noChangeArrowheads="1"/>
-                    </pic:cNvPicPr>
+                    <pic:cNvPr id="1" name=""/>
+                    <pic:cNvPicPr/>
                   </pic:nvPicPr>
                   <pic:blipFill>
-                    <a:blip r:embed="rId43">
-                      <a:extLst>
-                        <a:ext uri="{28A0092B-C50C-407E-A947-70E740481C1C}">
-                          <a14:useLocalDpi xmlns:a14="http://schemas.microsoft.com/office/drawing/2010/main" val="0"/>
-                        </a:ext>
-                      </a:extLst>
-                    </a:blip>
-                    <a:srcRect/>
+                    <a:blip r:embed="rId43"/>
                     <a:stretch>
                       <a:fillRect/>
                     </a:stretch>
                   </pic:blipFill>
-                  <pic:spPr bwMode="auto">
+                  <pic:spPr>
                     <a:xfrm>
                       <a:off x="0" y="0"/>
-                      <a:ext cx="6033135" cy="4618990"/>
+                      <a:ext cx="6033135" cy="5537200"/>
                     </a:xfrm>
                     <a:prstGeom prst="rect">
                       <a:avLst/>
                     </a:prstGeom>
-                    <a:noFill/>
-                    <a:ln>
-                      <a:noFill/>
-                    </a:ln>
                   </pic:spPr>
                 </pic:pic>
               </a:graphicData>
@@ -27343,6 +27317,7 @@
         <w:rPr>
           <w:w w:val="105"/>
         </w:rPr>
+        <w:lastRenderedPageBreak/>
         <w:t>Fonte: elaborado pelo autor (2026)</w:t>
       </w:r>
     </w:p>
@@ -27392,7 +27367,6 @@
         <w:rPr>
           <w:lang w:val="pt-BR" w:eastAsia="pt-BR"/>
         </w:rPr>
-        <w:lastRenderedPageBreak/>
         <w:t xml:space="preserve">O diagrama </w:t>
       </w:r>
       <w:r>
@@ -28116,6 +28090,7 @@
           <w:noProof/>
           <w:lang w:val="pt-BR" w:eastAsia="pt-BR"/>
         </w:rPr>
+        <w:lastRenderedPageBreak/>
         <w:drawing>
           <wp:inline distT="0" distB="0" distL="0" distR="0" wp14:anchorId="426C3DA5" wp14:editId="2FA3E91D">
             <wp:extent cx="6033135" cy="1516380"/>
@@ -29127,6 +29102,7 @@
         <w:rPr>
           <w:lang w:val="pt-BR" w:eastAsia="pt-BR"/>
         </w:rPr>
+        <w:lastRenderedPageBreak/>
         <w:t xml:space="preserve">O modelo também contempla a hipótese de não interposição. A </w:t>
       </w:r>
       <w:r>
@@ -29304,14 +29280,7 @@
         <w:rPr>
           <w:lang w:val="pt-BR" w:eastAsia="pt-BR"/>
         </w:rPr>
-        <w:t xml:space="preserve">, o julgamento e seus possíveis resultados. O modelo fornece suporte especialmente às Questões de Competência relacionadas à existência de recurso contra a sentença, ao prazo recursal, à necessidade de representação, ao encaminhamento à Turma </w:t>
-      </w:r>
-      <w:r>
-        <w:rPr>
-          <w:lang w:val="pt-BR" w:eastAsia="pt-BR"/>
-        </w:rPr>
-        <w:lastRenderedPageBreak/>
-        <w:t>Recursal e ao resultado do julgamento do recurso</w:t>
+        <w:t>, o julgamento e seus possíveis resultados. O modelo fornece suporte especialmente às Questões de Competência relacionadas à existência de recurso contra a sentença, ao prazo recursal, à necessidade de representação, ao encaminhamento à Turma Recursal e ao resultado do julgamento do recurso</w:t>
       </w:r>
       <w:r>
         <w:rPr>
@@ -29696,7 +29665,14 @@
         <w:rPr>
           <w:lang w:val="pt-BR" w:eastAsia="pt-BR"/>
         </w:rPr>
-        <w:t xml:space="preserve">. As três especializações integram um conjunto </w:t>
+        <w:t xml:space="preserve">. As três especializações integram um </w:t>
+      </w:r>
+      <w:r>
+        <w:rPr>
+          <w:lang w:val="pt-BR" w:eastAsia="pt-BR"/>
+        </w:rPr>
+        <w:lastRenderedPageBreak/>
+        <w:t xml:space="preserve">conjunto </w:t>
       </w:r>
       <w:r>
         <w:rPr>
@@ -29920,14 +29896,7 @@
         <w:rPr>
           <w:lang w:val="pt-BR" w:eastAsia="pt-BR"/>
         </w:rPr>
-        <w:t xml:space="preserve">. Esse evento representa a continuidade </w:t>
-      </w:r>
-      <w:r>
-        <w:rPr>
-          <w:lang w:val="pt-BR" w:eastAsia="pt-BR"/>
-        </w:rPr>
-        <w:lastRenderedPageBreak/>
-        <w:t xml:space="preserve">das medidas destinadas à satisfação da obrigação e pode posteriormente </w:t>
+        <w:t xml:space="preserve">. Esse evento representa a continuidade das medidas destinadas à satisfação da obrigação e pode posteriormente </w:t>
       </w:r>
       <w:r>
         <w:rPr>
@@ -30118,6 +30087,7 @@
           <w:noProof/>
           <w:lang w:val="pt-BR" w:eastAsia="pt-BR"/>
         </w:rPr>
+        <w:lastRenderedPageBreak/>
         <w:drawing>
           <wp:inline distT="0" distB="0" distL="0" distR="0" wp14:anchorId="782BC31A" wp14:editId="6AA5BDB3">
             <wp:extent cx="6033135" cy="6166485"/>
@@ -30194,11 +30164,7 @@
         <w:ind w:left="737" w:hanging="737"/>
       </w:pPr>
       <w:r>
-        <w:t xml:space="preserve">Rastreabilidade das questões de competência e </w:t>
-      </w:r>
-      <w:r>
-        <w:lastRenderedPageBreak/>
-        <w:t>instanciações simuladas</w:t>
+        <w:t>Rastreabilidade das questões de competência e instanciações simuladas</w:t>
       </w:r>
       <w:r>
         <w:br/>
@@ -30272,7 +30238,14 @@
         <w:rPr>
           <w:lang w:val="pt-BR" w:eastAsia="pt-BR"/>
         </w:rPr>
-        <w:t xml:space="preserve"> representa os eventos e situações relacionados à fase posterior ao trânsito em julgado da sentença, abrangendo o cumprimento da obrigação judicial e os possíveis desdobramentos até o encerramento do processo.</w:t>
+        <w:t xml:space="preserve"> representa os eventos e situações relacionados à fase posterior ao trânsito em julgado da sentença, abrangendo o cumprimento da </w:t>
+      </w:r>
+      <w:r>
+        <w:rPr>
+          <w:lang w:val="pt-BR" w:eastAsia="pt-BR"/>
+        </w:rPr>
+        <w:lastRenderedPageBreak/>
+        <w:t>obrigação judicial e os possíveis desdobramentos até o encerramento do processo.</w:t>
       </w:r>
     </w:p>
     <w:p>
@@ -30285,14 +30258,14 @@
           <w:w w:val="105"/>
         </w:rPr>
       </w:pPr>
+      <w:proofErr w:type="spellStart"/>
       <w:r>
         <w:rPr>
           <w:lang w:val="pt-BR" w:eastAsia="pt-BR"/>
         </w:rPr>
         <w:t>kljhkljk</w:t>
       </w:r>
-      <w:bookmarkStart w:id="55" w:name="_GoBack"/>
-      <w:bookmarkEnd w:id="55"/>
+      <w:proofErr w:type="spellEnd"/>
     </w:p>
     <w:p>
       <w:pPr>
@@ -45410,7 +45383,7 @@
 </file>
 
 <file path=customXml/itemProps1.xml><?xml version="1.0" encoding="utf-8"?>
-<ds:datastoreItem xmlns:ds="http://schemas.openxmlformats.org/officeDocument/2006/customXml" ds:itemID="{97E44DEA-FBFE-440A-9DA3-1E7EF2C80C16}">
+<ds:datastoreItem xmlns:ds="http://schemas.openxmlformats.org/officeDocument/2006/customXml" ds:itemID="{9116F95C-C7FA-4AFA-9210-52F70179CAD0}">
   <ds:schemaRefs>
     <ds:schemaRef ds:uri="http://schemas.openxmlformats.org/officeDocument/2006/bibliography"/>
   </ds:schemaRefs>

</xml_diff>

<commit_message>
correções na escrita pra cada diagrama
</commit_message>
<xml_diff>
--- a/backup/tcc-jec.docx
+++ b/backup/tcc-jec.docx
@@ -16055,13 +16055,13 @@
       </w:pPr>
       <w:r>
         <w:rPr>
-          <w:noProof/>
+          <w:w w:val="105"/>
         </w:rPr>
         <w:drawing>
-          <wp:inline distT="0" distB="0" distL="0" distR="0" wp14:anchorId="1331E313" wp14:editId="5E359A11">
-            <wp:extent cx="4966513" cy="3446396"/>
-            <wp:effectExtent l="0" t="0" r="5715" b="1905"/>
-            <wp:docPr id="19" name="Imagem 19" descr="pacotes"/>
+          <wp:inline distT="0" distB="0" distL="0" distR="0" wp14:anchorId="5C0FC211" wp14:editId="396107E2">
+            <wp:extent cx="6033135" cy="4207510"/>
+            <wp:effectExtent l="0" t="0" r="5715" b="2540"/>
+            <wp:docPr id="2" name="Imagem 2"/>
             <wp:cNvGraphicFramePr>
               <a:graphicFrameLocks xmlns:a="http://schemas.openxmlformats.org/drawingml/2006/main" noChangeAspect="1"/>
             </wp:cNvGraphicFramePr>
@@ -16069,36 +16069,23 @@
               <a:graphicData uri="http://schemas.openxmlformats.org/drawingml/2006/picture">
                 <pic:pic xmlns:pic="http://schemas.openxmlformats.org/drawingml/2006/picture">
                   <pic:nvPicPr>
-                    <pic:cNvPr id="0" name="rmiz-modal-img-14989538c878" descr="pacotes"/>
-                    <pic:cNvPicPr>
-                      <a:picLocks noChangeAspect="1" noChangeArrowheads="1"/>
-                    </pic:cNvPicPr>
+                    <pic:cNvPr id="1" name=""/>
+                    <pic:cNvPicPr/>
                   </pic:nvPicPr>
                   <pic:blipFill>
-                    <a:blip r:embed="rId27" cstate="print">
-                      <a:extLst>
-                        <a:ext uri="{28A0092B-C50C-407E-A947-70E740481C1C}">
-                          <a14:useLocalDpi xmlns:a14="http://schemas.microsoft.com/office/drawing/2010/main" val="0"/>
-                        </a:ext>
-                      </a:extLst>
-                    </a:blip>
-                    <a:srcRect/>
+                    <a:blip r:embed="rId27"/>
                     <a:stretch>
                       <a:fillRect/>
                     </a:stretch>
                   </pic:blipFill>
-                  <pic:spPr bwMode="auto">
+                  <pic:spPr>
                     <a:xfrm>
                       <a:off x="0" y="0"/>
-                      <a:ext cx="5072181" cy="3519722"/>
+                      <a:ext cx="6033135" cy="4207510"/>
                     </a:xfrm>
                     <a:prstGeom prst="rect">
                       <a:avLst/>
                     </a:prstGeom>
-                    <a:noFill/>
-                    <a:ln>
-                      <a:noFill/>
-                    </a:ln>
                   </pic:spPr>
                 </pic:pic>
               </a:graphicData>
@@ -16764,6 +16751,7 @@
                 <w:b/>
                 <w:bCs/>
               </w:rPr>
+              <w:lastRenderedPageBreak/>
               <w:t>Contestação</w:t>
             </w:r>
           </w:p>
@@ -16854,7 +16842,6 @@
                 <w:b/>
                 <w:bCs/>
               </w:rPr>
-              <w:lastRenderedPageBreak/>
               <w:t>Produção de Prova</w:t>
             </w:r>
           </w:p>
@@ -17684,7 +17671,15 @@
                 <w:i/>
                 <w:iCs/>
               </w:rPr>
-              <w:t>Relação Jurídico-Processual, Representação Processual, Obrigação Judicial, Competência Jurisdicional, Acordo Processual, Relação Recursal</w:t>
+              <w:t xml:space="preserve">Relação Jurídico-Processual, Representação Processual, Obrigação Judicial, Competência Jurisdicional, </w:t>
+            </w:r>
+            <w:r>
+              <w:rPr>
+                <w:i/>
+                <w:iCs/>
+              </w:rPr>
+              <w:lastRenderedPageBreak/>
+              <w:t>Acordo Processual, Relação Recursal</w:t>
             </w:r>
             <w:r>
               <w:t xml:space="preserve"> e outros relators específicos</w:t>
@@ -17713,6 +17708,7 @@
               </w:rPr>
             </w:pPr>
             <w:r>
+              <w:lastRenderedPageBreak/>
               <w:t>UFO-L</w:t>
             </w:r>
           </w:p>
@@ -17759,15 +17755,7 @@
                 <w:i/>
                 <w:iCs/>
               </w:rPr>
-              <w:t xml:space="preserve">Direito à Prestação e Dever </w:t>
-            </w:r>
-            <w:r>
-              <w:rPr>
-                <w:i/>
-                <w:iCs/>
-              </w:rPr>
-              <w:lastRenderedPageBreak/>
-              <w:t>de Prestação,</w:t>
+              <w:t>Direito à Prestação e Dever de Prestação,</w:t>
             </w:r>
             <w:r>
               <w:t xml:space="preserve"> vinculados à </w:t>
@@ -18295,7 +18283,14 @@
         <w:rPr>
           <w:lang w:val="pt-BR" w:eastAsia="pt-BR"/>
         </w:rPr>
-        <w:t xml:space="preserve"> representa os principais participantes envolvidos na relação processual e os papéis que podem ser desempenhados no contexto do Juizado Especial Federal Cível. A estrutura parte dos </w:t>
+        <w:t xml:space="preserve"> representa os principais participantes envolvidos na relação processual e os papéis que podem ser desempenhados no contexto do Juizado Especial </w:t>
+      </w:r>
+      <w:r>
+        <w:rPr>
+          <w:lang w:val="pt-BR" w:eastAsia="pt-BR"/>
+        </w:rPr>
+        <w:lastRenderedPageBreak/>
+        <w:t xml:space="preserve">Federal Cível. A estrutura parte dos </w:t>
       </w:r>
       <w:proofErr w:type="spellStart"/>
       <w:r>
@@ -18368,7 +18363,6 @@
         <w:rPr>
           <w:lang w:val="pt-BR" w:eastAsia="pt-BR"/>
         </w:rPr>
-        <w:lastRenderedPageBreak/>
         <w:t xml:space="preserve">O </w:t>
       </w:r>
       <w:r>
@@ -18879,6 +18873,7 @@
           <w:sz w:val="24"/>
           <w:szCs w:val="24"/>
         </w:rPr>
+        <w:lastRenderedPageBreak/>
         <w:t xml:space="preserve">Figura </w:t>
       </w:r>
       <w:r>
@@ -19055,7 +19050,6 @@
         <w:jc w:val="left"/>
       </w:pPr>
       <w:r>
-        <w:lastRenderedPageBreak/>
         <w:t>4.</w:t>
       </w:r>
       <w:r>
@@ -19470,6 +19464,7 @@
           <w:sz w:val="24"/>
           <w:szCs w:val="24"/>
         </w:rPr>
+        <w:lastRenderedPageBreak/>
         <w:t xml:space="preserve">Figura </w:t>
       </w:r>
       <w:r>
@@ -19734,14 +19729,7 @@
         <w:rPr>
           <w:lang w:val="pt-BR" w:eastAsia="pt-BR"/>
         </w:rPr>
-        <w:t xml:space="preserve">. Essa modelagem evidencia que a representação processual não </w:t>
-      </w:r>
-      <w:r>
-        <w:rPr>
-          <w:lang w:val="pt-BR" w:eastAsia="pt-BR"/>
-        </w:rPr>
-        <w:lastRenderedPageBreak/>
-        <w:t>constitui uma característica essencial da pessoa, mas um papel assumido por ela quando atua na representação de uma das partes em determinado processo.</w:t>
+        <w:t>. Essa modelagem evidencia que a representação processual não constitui uma característica essencial da pessoa, mas um papel assumido por ela quando atua na representação de uma das partes em determinado processo.</w:t>
       </w:r>
     </w:p>
     <w:p>
@@ -20118,6 +20106,7 @@
           <w:u w:val="single"/>
           <w:lang w:val="pt-BR" w:eastAsia="pt-BR"/>
         </w:rPr>
+        <w:lastRenderedPageBreak/>
         <w:t>Representantes</w:t>
       </w:r>
       <w:r>
@@ -20424,14 +20413,7 @@
         <w:rPr>
           <w:lang w:val="pt-BR" w:eastAsia="pt-BR"/>
         </w:rPr>
-        <w:t xml:space="preserve">. Essa modelagem evidencia que </w:t>
-      </w:r>
-      <w:r>
-        <w:rPr>
-          <w:lang w:val="pt-BR" w:eastAsia="pt-BR"/>
-        </w:rPr>
-        <w:lastRenderedPageBreak/>
-        <w:t>a atuação como serventuário não corresponde a uma característica essencial da pessoa, mas a um papel assumido em razão de sua participação no contexto institucional e processual da Justiça.</w:t>
+        <w:t>. Essa modelagem evidencia que a atuação como serventuário não corresponde a uma característica essencial da pessoa, mas a um papel assumido em razão de sua participação no contexto institucional e processual da Justiça.</w:t>
       </w:r>
     </w:p>
     <w:p>
@@ -20784,6 +20766,7 @@
           <w:sz w:val="24"/>
           <w:szCs w:val="24"/>
         </w:rPr>
+        <w:lastRenderedPageBreak/>
         <w:t xml:space="preserve">Figura </w:t>
       </w:r>
       <w:r>
@@ -21048,15 +21031,7 @@
           <w:u w:val="single"/>
           <w:lang w:val="pt-BR" w:eastAsia="pt-BR"/>
         </w:rPr>
-        <w:t xml:space="preserve">Processo </w:t>
-      </w:r>
-      <w:r>
-        <w:rPr>
-          <w:u w:val="single"/>
-          <w:lang w:val="pt-BR" w:eastAsia="pt-BR"/>
-        </w:rPr>
-        <w:lastRenderedPageBreak/>
-        <w:t>Judicial Federal</w:t>
+        <w:t>Processo Judicial Federal</w:t>
       </w:r>
       <w:r>
         <w:rPr>
@@ -21107,7 +21082,32 @@
         <w:rPr>
           <w:lang w:val="pt-BR" w:eastAsia="pt-BR"/>
         </w:rPr>
-        <w:t xml:space="preserve"> e associada à Pessoa que pretende buscar determinada tutela jurisdicional. Essa pretensão reúne os principais elementos necessários à análise de cabimento, incluindo um ou mais </w:t>
+        <w:t xml:space="preserve"> e associada </w:t>
+      </w:r>
+      <w:r>
+        <w:rPr>
+          <w:lang w:val="pt-BR" w:eastAsia="pt-BR"/>
+        </w:rPr>
+        <w:t xml:space="preserve">ao </w:t>
+      </w:r>
+      <w:r>
+        <w:rPr>
+          <w:u w:val="single"/>
+          <w:lang w:val="pt-BR" w:eastAsia="pt-BR"/>
+        </w:rPr>
+        <w:t>Demandante</w:t>
+      </w:r>
+      <w:r>
+        <w:rPr>
+          <w:lang w:val="pt-BR" w:eastAsia="pt-BR"/>
+        </w:rPr>
+        <w:t xml:space="preserve"> </w:t>
+      </w:r>
+      <w:r>
+        <w:rPr>
+          <w:lang w:val="pt-BR" w:eastAsia="pt-BR"/>
+        </w:rPr>
+        <w:t xml:space="preserve">que pretende buscar determinada tutela jurisdicional. Essa pretensão reúne os principais elementos necessários à análise de cabimento, incluindo um ou mais </w:t>
       </w:r>
       <w:r>
         <w:rPr>
@@ -21424,6 +21424,7 @@
           <w:u w:val="single"/>
           <w:lang w:val="pt-BR" w:eastAsia="pt-BR"/>
         </w:rPr>
+        <w:lastRenderedPageBreak/>
         <w:t>Juizado Especial Federal Cível</w:t>
       </w:r>
       <w:r>
@@ -21574,7 +21575,6 @@
           <w:sz w:val="24"/>
           <w:szCs w:val="24"/>
         </w:rPr>
-        <w:lastRenderedPageBreak/>
         <w:t xml:space="preserve">Figura </w:t>
       </w:r>
       <w:r>
@@ -21653,13 +21653,13 @@
       </w:pPr>
       <w:r>
         <w:rPr>
-          <w:noProof/>
+          <w:lang w:val="pt-BR" w:eastAsia="pt-BR"/>
         </w:rPr>
         <w:drawing>
-          <wp:inline distT="0" distB="0" distL="0" distR="0" wp14:anchorId="4D8F0646" wp14:editId="739FCE3C">
-            <wp:extent cx="6033135" cy="5750560"/>
-            <wp:effectExtent l="0" t="0" r="5715" b="2540"/>
-            <wp:docPr id="17" name="Imagem 17" descr="pretencao"/>
+          <wp:inline distT="0" distB="0" distL="0" distR="0" wp14:anchorId="70B00F7D" wp14:editId="16109E09">
+            <wp:extent cx="6033135" cy="5833110"/>
+            <wp:effectExtent l="0" t="0" r="5715" b="0"/>
+            <wp:docPr id="21" name="Imagem 21"/>
             <wp:cNvGraphicFramePr>
               <a:graphicFrameLocks xmlns:a="http://schemas.openxmlformats.org/drawingml/2006/main" noChangeAspect="1"/>
             </wp:cNvGraphicFramePr>
@@ -21667,36 +21667,23 @@
               <a:graphicData uri="http://schemas.openxmlformats.org/drawingml/2006/picture">
                 <pic:pic xmlns:pic="http://schemas.openxmlformats.org/drawingml/2006/picture">
                   <pic:nvPicPr>
-                    <pic:cNvPr id="0" name="rmiz-modal-img-d188356a9fc8" descr="pretencao"/>
-                    <pic:cNvPicPr>
-                      <a:picLocks noChangeAspect="1" noChangeArrowheads="1"/>
-                    </pic:cNvPicPr>
+                    <pic:cNvPr id="1" name=""/>
+                    <pic:cNvPicPr/>
                   </pic:nvPicPr>
                   <pic:blipFill>
-                    <a:blip r:embed="rId32">
-                      <a:extLst>
-                        <a:ext uri="{28A0092B-C50C-407E-A947-70E740481C1C}">
-                          <a14:useLocalDpi xmlns:a14="http://schemas.microsoft.com/office/drawing/2010/main" val="0"/>
-                        </a:ext>
-                      </a:extLst>
-                    </a:blip>
-                    <a:srcRect/>
+                    <a:blip r:embed="rId32"/>
                     <a:stretch>
                       <a:fillRect/>
                     </a:stretch>
                   </pic:blipFill>
-                  <pic:spPr bwMode="auto">
+                  <pic:spPr>
                     <a:xfrm>
                       <a:off x="0" y="0"/>
-                      <a:ext cx="6033135" cy="5750560"/>
+                      <a:ext cx="6033135" cy="5833110"/>
                     </a:xfrm>
                     <a:prstGeom prst="rect">
                       <a:avLst/>
                     </a:prstGeom>
-                    <a:noFill/>
-                    <a:ln>
-                      <a:noFill/>
-                    </a:ln>
                   </pic:spPr>
                 </pic:pic>
               </a:graphicData>
@@ -21778,6 +21765,7 @@
         <w:rPr>
           <w:lang w:val="pt-BR" w:eastAsia="pt-BR"/>
         </w:rPr>
+        <w:lastRenderedPageBreak/>
         <w:t>O diagrama</w:t>
       </w:r>
       <w:r>
@@ -21958,7 +21946,6 @@
         <w:rPr>
           <w:lang w:val="pt-BR" w:eastAsia="pt-BR"/>
         </w:rPr>
-        <w:lastRenderedPageBreak/>
         <w:t xml:space="preserve">A representação jurídica das partes é formalizada pelo </w:t>
       </w:r>
       <w:r>
@@ -22595,7 +22582,14 @@
         <w:rPr>
           <w:lang w:val="pt-BR" w:eastAsia="pt-BR"/>
         </w:rPr>
-        <w:t>, tornando explícita a dependência entre a atribuição de competência ao órgão judicial e as normas jurídicas aplicáveis ao caso.</w:t>
+        <w:t xml:space="preserve">, tornando explícita a dependência entre a atribuição de competência ao órgão judicial e as normas jurídicas aplicáveis </w:t>
+      </w:r>
+      <w:r>
+        <w:rPr>
+          <w:lang w:val="pt-BR" w:eastAsia="pt-BR"/>
+        </w:rPr>
+        <w:lastRenderedPageBreak/>
+        <w:t>ao caso.</w:t>
       </w:r>
     </w:p>
     <w:p>
@@ -22645,7 +22639,6 @@
           <w:sz w:val="24"/>
           <w:szCs w:val="24"/>
         </w:rPr>
-        <w:lastRenderedPageBreak/>
         <w:t xml:space="preserve">Figura </w:t>
       </w:r>
       <w:r>
@@ -22724,14 +22717,13 @@
       </w:pPr>
       <w:r>
         <w:rPr>
-          <w:noProof/>
           <w:lang w:val="pt-BR" w:eastAsia="pt-BR"/>
         </w:rPr>
         <w:drawing>
-          <wp:inline distT="0" distB="0" distL="0" distR="0" wp14:anchorId="1C06C176" wp14:editId="57412D2B">
-            <wp:extent cx="6033135" cy="3060065"/>
-            <wp:effectExtent l="0" t="0" r="5715" b="6985"/>
-            <wp:docPr id="14" name="Imagem 14"/>
+          <wp:inline distT="0" distB="0" distL="0" distR="0" wp14:anchorId="5563BE2E" wp14:editId="523CCDDB">
+            <wp:extent cx="6033135" cy="3126105"/>
+            <wp:effectExtent l="0" t="0" r="5715" b="0"/>
+            <wp:docPr id="33" name="Imagem 33"/>
             <wp:cNvGraphicFramePr>
               <a:graphicFrameLocks xmlns:a="http://schemas.openxmlformats.org/drawingml/2006/main" noChangeAspect="1"/>
             </wp:cNvGraphicFramePr>
@@ -22751,7 +22743,7 @@
                   <pic:spPr>
                     <a:xfrm>
                       <a:off x="0" y="0"/>
-                      <a:ext cx="6033135" cy="3060065"/>
+                      <a:ext cx="6033135" cy="3126105"/>
                     </a:xfrm>
                     <a:prstGeom prst="rect">
                       <a:avLst/>
@@ -22910,7 +22902,14 @@
         <w:rPr>
           <w:lang w:val="pt-BR" w:eastAsia="pt-BR"/>
         </w:rPr>
-        <w:t xml:space="preserve"> representa os elementos utilizados para caracterizar a pretensão submetida ao Juizado Especial Federal Cível. O modelo distingue a própria </w:t>
+        <w:t xml:space="preserve"> representa os elementos utilizados para caracterizar a pretensão submetida ao Juizado Especial Federal Cível. O modelo distingue a </w:t>
+      </w:r>
+      <w:r>
+        <w:rPr>
+          <w:lang w:val="pt-BR" w:eastAsia="pt-BR"/>
+        </w:rPr>
+        <w:lastRenderedPageBreak/>
+        <w:t xml:space="preserve">própria </w:t>
       </w:r>
       <w:r>
         <w:rPr>
@@ -23003,15 +23002,7 @@
           <w:u w:val="single"/>
           <w:lang w:val="pt-BR" w:eastAsia="pt-BR"/>
         </w:rPr>
-        <w:t xml:space="preserve">Pedido </w:t>
-      </w:r>
-      <w:r>
-        <w:rPr>
-          <w:u w:val="single"/>
-          <w:lang w:val="pt-BR" w:eastAsia="pt-BR"/>
-        </w:rPr>
-        <w:lastRenderedPageBreak/>
-        <w:t>Processual</w:t>
+        <w:t>Pedido Processual</w:t>
       </w:r>
       <w:r>
         <w:rPr>
@@ -23462,13 +23453,13 @@
       </w:pPr>
       <w:r>
         <w:rPr>
-          <w:noProof/>
+          <w:lang w:val="pt-BR" w:eastAsia="pt-BR"/>
         </w:rPr>
         <w:drawing>
-          <wp:inline distT="0" distB="0" distL="0" distR="0" wp14:anchorId="2A7D9C06" wp14:editId="4AFBF16C">
-            <wp:extent cx="6033135" cy="3964305"/>
+          <wp:inline distT="0" distB="0" distL="0" distR="0" wp14:anchorId="17C7E586" wp14:editId="032EE4D1">
+            <wp:extent cx="6033135" cy="4046220"/>
             <wp:effectExtent l="0" t="0" r="5715" b="0"/>
-            <wp:docPr id="13" name="Imagem 13" descr="demanda-causa-pedido"/>
+            <wp:docPr id="30" name="Imagem 30"/>
             <wp:cNvGraphicFramePr>
               <a:graphicFrameLocks xmlns:a="http://schemas.openxmlformats.org/drawingml/2006/main" noChangeAspect="1"/>
             </wp:cNvGraphicFramePr>
@@ -23476,36 +23467,23 @@
               <a:graphicData uri="http://schemas.openxmlformats.org/drawingml/2006/picture">
                 <pic:pic xmlns:pic="http://schemas.openxmlformats.org/drawingml/2006/picture">
                   <pic:nvPicPr>
-                    <pic:cNvPr id="0" name="rmiz-modal-img-7f756998f168" descr="demanda-causa-pedido"/>
-                    <pic:cNvPicPr>
-                      <a:picLocks noChangeAspect="1" noChangeArrowheads="1"/>
-                    </pic:cNvPicPr>
+                    <pic:cNvPr id="1" name=""/>
+                    <pic:cNvPicPr/>
                   </pic:nvPicPr>
                   <pic:blipFill>
-                    <a:blip r:embed="rId34">
-                      <a:extLst>
-                        <a:ext uri="{28A0092B-C50C-407E-A947-70E740481C1C}">
-                          <a14:useLocalDpi xmlns:a14="http://schemas.microsoft.com/office/drawing/2010/main" val="0"/>
-                        </a:ext>
-                      </a:extLst>
-                    </a:blip>
-                    <a:srcRect/>
+                    <a:blip r:embed="rId34"/>
                     <a:stretch>
                       <a:fillRect/>
                     </a:stretch>
                   </pic:blipFill>
-                  <pic:spPr bwMode="auto">
+                  <pic:spPr>
                     <a:xfrm>
                       <a:off x="0" y="0"/>
-                      <a:ext cx="6033135" cy="3964305"/>
+                      <a:ext cx="6033135" cy="4046220"/>
                     </a:xfrm>
                     <a:prstGeom prst="rect">
                       <a:avLst/>
                     </a:prstGeom>
-                    <a:noFill/>
-                    <a:ln>
-                      <a:noFill/>
-                    </a:ln>
                   </pic:spPr>
                 </pic:pic>
               </a:graphicData>
@@ -25712,14 +25690,13 @@
       </w:pPr>
       <w:r>
         <w:rPr>
-          <w:noProof/>
           <w:lang w:val="pt-BR" w:eastAsia="pt-BR"/>
         </w:rPr>
         <w:drawing>
-          <wp:inline distT="0" distB="0" distL="0" distR="0" wp14:anchorId="75FC3263" wp14:editId="1127550B">
-            <wp:extent cx="6033135" cy="5398135"/>
-            <wp:effectExtent l="0" t="0" r="5715" b="0"/>
-            <wp:docPr id="26" name="Imagem 26"/>
+          <wp:inline distT="0" distB="0" distL="0" distR="0" wp14:anchorId="06BA1D36" wp14:editId="4AB48AE2">
+            <wp:extent cx="6033135" cy="5405755"/>
+            <wp:effectExtent l="0" t="0" r="5715" b="4445"/>
+            <wp:docPr id="36" name="Imagem 36"/>
             <wp:cNvGraphicFramePr>
               <a:graphicFrameLocks xmlns:a="http://schemas.openxmlformats.org/drawingml/2006/main" noChangeAspect="1"/>
             </wp:cNvGraphicFramePr>
@@ -25739,7 +25716,7 @@
                   <pic:spPr>
                     <a:xfrm>
                       <a:off x="0" y="0"/>
-                      <a:ext cx="6033135" cy="5398135"/>
+                      <a:ext cx="6033135" cy="5405755"/>
                     </a:xfrm>
                     <a:prstGeom prst="rect">
                       <a:avLst/>
@@ -27427,14 +27404,13 @@
       </w:pPr>
       <w:r>
         <w:rPr>
-          <w:noProof/>
           <w:lang w:val="pt-BR" w:eastAsia="pt-BR"/>
         </w:rPr>
         <w:drawing>
-          <wp:inline distT="0" distB="0" distL="0" distR="0" wp14:anchorId="6CB2797E" wp14:editId="537787F8">
-            <wp:extent cx="6033135" cy="4382135"/>
+          <wp:inline distT="0" distB="0" distL="0" distR="0" wp14:anchorId="5722B8F2" wp14:editId="12DD920D">
+            <wp:extent cx="6033135" cy="4408170"/>
             <wp:effectExtent l="0" t="0" r="5715" b="0"/>
-            <wp:docPr id="28" name="Imagem 28"/>
+            <wp:docPr id="37" name="Imagem 37"/>
             <wp:cNvGraphicFramePr>
               <a:graphicFrameLocks xmlns:a="http://schemas.openxmlformats.org/drawingml/2006/main" noChangeAspect="1"/>
             </wp:cNvGraphicFramePr>
@@ -27454,7 +27430,7 @@
                   <pic:spPr>
                     <a:xfrm>
                       <a:off x="0" y="0"/>
-                      <a:ext cx="6033135" cy="4382135"/>
+                      <a:ext cx="6033135" cy="4408170"/>
                     </a:xfrm>
                     <a:prstGeom prst="rect">
                       <a:avLst/>
@@ -28590,13 +28566,57 @@
         <w:rPr>
           <w:lang w:val="pt-BR" w:eastAsia="pt-BR"/>
         </w:rPr>
-        <w:t xml:space="preserve"> impõe uma </w:t>
+        <w:t xml:space="preserve"> </w:t>
+      </w:r>
+      <w:r>
+        <w:rPr>
+          <w:lang w:val="pt-BR" w:eastAsia="pt-BR"/>
+        </w:rPr>
+        <w:t xml:space="preserve">possui duas fases distintas, </w:t>
       </w:r>
       <w:r>
         <w:rPr>
           <w:u w:val="single"/>
           <w:lang w:val="pt-BR" w:eastAsia="pt-BR"/>
         </w:rPr>
+        <w:t>Sentença Não Transitada em Julgado</w:t>
+      </w:r>
+      <w:r>
+        <w:rPr>
+          <w:lang w:val="pt-BR" w:eastAsia="pt-BR"/>
+        </w:rPr>
+        <w:t xml:space="preserve"> e </w:t>
+      </w:r>
+      <w:r>
+        <w:rPr>
+          <w:u w:val="single"/>
+          <w:lang w:val="pt-BR" w:eastAsia="pt-BR"/>
+        </w:rPr>
+        <w:t>Sentença Transitada em Julgado</w:t>
+      </w:r>
+      <w:r>
+        <w:rPr>
+          <w:lang w:val="pt-BR" w:eastAsia="pt-BR"/>
+        </w:rPr>
+        <w:t xml:space="preserve"> </w:t>
+      </w:r>
+      <w:r>
+        <w:rPr>
+          <w:lang w:val="pt-BR" w:eastAsia="pt-BR"/>
+        </w:rPr>
+        <w:t xml:space="preserve">esse que </w:t>
+      </w:r>
+      <w:r>
+        <w:rPr>
+          <w:lang w:val="pt-BR" w:eastAsia="pt-BR"/>
+        </w:rPr>
+        <w:t xml:space="preserve">impõe uma </w:t>
+      </w:r>
+      <w:r>
+        <w:rPr>
+          <w:u w:val="single"/>
+          <w:lang w:val="pt-BR" w:eastAsia="pt-BR"/>
+        </w:rPr>
         <w:t>Obrigação Judicial</w:t>
       </w:r>
       <w:r>
@@ -28724,7 +28744,14 @@
         <w:rPr>
           <w:lang w:val="pt-BR" w:eastAsia="pt-BR"/>
         </w:rPr>
-        <w:t>, evidenciando a correlação entre o direito reconhecido a uma parte e o dever correspondente atribuído à outra.</w:t>
+        <w:t xml:space="preserve">, evidenciando a correlação entre o direito reconhecido a uma </w:t>
+      </w:r>
+      <w:r>
+        <w:rPr>
+          <w:lang w:val="pt-BR" w:eastAsia="pt-BR"/>
+        </w:rPr>
+        <w:lastRenderedPageBreak/>
+        <w:t>parte e o dever correspondente atribuído à outra.</w:t>
       </w:r>
     </w:p>
     <w:p>
@@ -28741,7 +28768,6 @@
         <w:rPr>
           <w:lang w:val="pt-BR" w:eastAsia="pt-BR"/>
         </w:rPr>
-        <w:lastRenderedPageBreak/>
         <w:t xml:space="preserve">A </w:t>
       </w:r>
       <w:r>
@@ -28909,17 +28935,65 @@
         <w:rPr>
           <w:lang w:val="pt-BR" w:eastAsia="pt-BR"/>
         </w:rPr>
-        <w:t xml:space="preserve"> como objeto. A ocorrência desse evento leva à </w:t>
-      </w:r>
-      <w:proofErr w:type="spellStart"/>
-      <w:r>
-        <w:rPr>
-          <w:rFonts w:ascii="Courier New" w:hAnsi="Courier New" w:cs="Courier New"/>
-          <w:lang w:val="pt-BR" w:eastAsia="pt-BR"/>
-        </w:rPr>
-        <w:t>situation</w:t>
-      </w:r>
-      <w:proofErr w:type="spellEnd"/>
+        <w:t xml:space="preserve"> como objeto. A ocorrência desse evento leva </w:t>
+      </w:r>
+      <w:r>
+        <w:rPr>
+          <w:lang w:val="pt-BR" w:eastAsia="pt-BR"/>
+        </w:rPr>
+        <w:t>a</w:t>
+      </w:r>
+      <w:r>
+        <w:rPr>
+          <w:lang w:val="pt-BR" w:eastAsia="pt-BR"/>
+        </w:rPr>
+        <w:t xml:space="preserve"> </w:t>
+      </w:r>
+      <w:r>
+        <w:rPr>
+          <w:lang w:val="pt-BR" w:eastAsia="pt-BR"/>
+        </w:rPr>
+        <w:t>passagem de</w:t>
+      </w:r>
+      <w:r>
+        <w:rPr>
+          <w:lang w:val="pt-BR" w:eastAsia="pt-BR"/>
+        </w:rPr>
+        <w:t xml:space="preserve"> </w:t>
+      </w:r>
+      <w:r>
+        <w:rPr>
+          <w:u w:val="single"/>
+          <w:lang w:val="pt-BR" w:eastAsia="pt-BR"/>
+        </w:rPr>
+        <w:t>Sentença</w:t>
+      </w:r>
+      <w:r>
+        <w:rPr>
+          <w:u w:val="single"/>
+          <w:lang w:val="pt-BR" w:eastAsia="pt-BR"/>
+        </w:rPr>
+        <w:t xml:space="preserve"> Não</w:t>
+      </w:r>
+      <w:r>
+        <w:rPr>
+          <w:u w:val="single"/>
+          <w:lang w:val="pt-BR" w:eastAsia="pt-BR"/>
+        </w:rPr>
+        <w:t xml:space="preserve"> Transitada em Julgado</w:t>
+      </w:r>
+      <w:r>
+        <w:rPr>
+          <w:lang w:val="pt-BR" w:eastAsia="pt-BR"/>
+        </w:rPr>
+        <w:t xml:space="preserve"> </w:t>
+      </w:r>
+      <w:r>
+        <w:rPr>
+          <w:lang w:val="pt-BR" w:eastAsia="pt-BR"/>
+        </w:rPr>
+        <w:t>para</w:t>
+      </w:r>
       <w:r>
         <w:rPr>
           <w:lang w:val="pt-BR" w:eastAsia="pt-BR"/>
@@ -29089,14 +29163,13 @@
       </w:pPr>
       <w:r>
         <w:rPr>
-          <w:noProof/>
           <w:lang w:val="pt-BR" w:eastAsia="pt-BR"/>
         </w:rPr>
         <w:drawing>
-          <wp:inline distT="0" distB="0" distL="0" distR="0" wp14:anchorId="426C3DA5" wp14:editId="2FA3E91D">
-            <wp:extent cx="6033135" cy="1516380"/>
-            <wp:effectExtent l="0" t="0" r="5715" b="7620"/>
-            <wp:docPr id="31" name="Imagem 31"/>
+          <wp:inline distT="0" distB="0" distL="0" distR="0" wp14:anchorId="6F547023" wp14:editId="4B0E25FD">
+            <wp:extent cx="6033135" cy="1582420"/>
+            <wp:effectExtent l="0" t="0" r="5715" b="0"/>
+            <wp:docPr id="39" name="Imagem 39"/>
             <wp:cNvGraphicFramePr>
               <a:graphicFrameLocks xmlns:a="http://schemas.openxmlformats.org/drawingml/2006/main" noChangeAspect="1"/>
             </wp:cNvGraphicFramePr>
@@ -29116,7 +29189,7 @@
                   <pic:spPr>
                     <a:xfrm>
                       <a:off x="0" y="0"/>
-                      <a:ext cx="6033135" cy="1516380"/>
+                      <a:ext cx="6033135" cy="1582420"/>
                     </a:xfrm>
                     <a:prstGeom prst="rect">
                       <a:avLst/>
@@ -29201,40 +29274,193 @@
         <w:rPr>
           <w:lang w:val="pt-BR" w:eastAsia="pt-BR"/>
         </w:rPr>
-        <w:t xml:space="preserve"> representa os principais elementos envolvidos na impugnação da sentença, desde a abertura do prazo recursal até o </w:t>
+        <w:t xml:space="preserve"> representa os principais elementos envolvidos na impugnação da sentença, desde a abertura do prazo recursal até o julgamento do recurso pela Turma Recursal. O modelo contempla tanto a hipótese de interposição do recurso quanto a ausência de manifestação recursal, além dos participantes, documentos, prazos e situações decorrentes dessa etapa do processo.</w:t>
+      </w:r>
+    </w:p>
+    <w:p>
+      <w:pPr>
+        <w:pStyle w:val="Corpodetexto"/>
+        <w:spacing w:line="312" w:lineRule="auto"/>
+        <w:ind w:left="284" w:right="113" w:firstLine="737"/>
+        <w:jc w:val="both"/>
+        <w:rPr>
+          <w:lang w:val="pt-BR" w:eastAsia="pt-BR"/>
+        </w:rPr>
+      </w:pPr>
+      <w:r>
+        <w:rPr>
+          <w:lang w:val="pt-BR" w:eastAsia="pt-BR"/>
+        </w:rPr>
+        <w:t xml:space="preserve">A </w:t>
       </w:r>
       <w:r>
         <w:rPr>
           <w:u w:val="single"/>
           <w:lang w:val="pt-BR" w:eastAsia="pt-BR"/>
         </w:rPr>
-        <w:t>julgamento do recurso</w:t>
-      </w:r>
-      <w:r>
-        <w:rPr>
-          <w:lang w:val="pt-BR" w:eastAsia="pt-BR"/>
-        </w:rPr>
-        <w:t xml:space="preserve"> pela </w:t>
+        <w:t>Sentença</w:t>
+      </w:r>
+      <w:r>
+        <w:rPr>
+          <w:lang w:val="pt-BR" w:eastAsia="pt-BR"/>
+        </w:rPr>
+        <w:t xml:space="preserve">, representada como </w:t>
+      </w:r>
+      <w:proofErr w:type="spellStart"/>
+      <w:r>
+        <w:rPr>
+          <w:rFonts w:ascii="Courier New" w:hAnsi="Courier New" w:cs="Courier New"/>
+          <w:lang w:val="pt-BR" w:eastAsia="pt-BR"/>
+        </w:rPr>
+        <w:t>subkind</w:t>
+      </w:r>
+      <w:proofErr w:type="spellEnd"/>
+      <w:r>
+        <w:rPr>
+          <w:lang w:val="pt-BR" w:eastAsia="pt-BR"/>
+        </w:rPr>
+        <w:t xml:space="preserve"> de </w:t>
       </w:r>
       <w:r>
         <w:rPr>
           <w:u w:val="single"/>
           <w:lang w:val="pt-BR" w:eastAsia="pt-BR"/>
         </w:rPr>
-        <w:t>Turma Recursal</w:t>
-      </w:r>
-      <w:r>
-        <w:rPr>
-          <w:lang w:val="pt-BR" w:eastAsia="pt-BR"/>
-        </w:rPr>
-        <w:t>. O modelo contempla tanto a hipótese de interposição do recurso quanto a ausência de manifestação recursal, além dos participantes, documentos, prazos e situações decorrentes dessa etapa do processo.</w:t>
+        <w:t>Documento</w:t>
+      </w:r>
+      <w:r>
+        <w:rPr>
+          <w:lang w:val="pt-BR" w:eastAsia="pt-BR"/>
+        </w:rPr>
+        <w:t xml:space="preserve"> e criada pelo </w:t>
+      </w:r>
+      <w:proofErr w:type="spellStart"/>
+      <w:r>
+        <w:rPr>
+          <w:rFonts w:ascii="Courier New" w:hAnsi="Courier New" w:cs="Courier New"/>
+          <w:lang w:val="pt-BR" w:eastAsia="pt-BR"/>
+        </w:rPr>
+        <w:t>event</w:t>
+      </w:r>
+      <w:proofErr w:type="spellEnd"/>
+      <w:r>
+        <w:rPr>
+          <w:lang w:val="pt-BR" w:eastAsia="pt-BR"/>
+        </w:rPr>
+        <w:t xml:space="preserve"> </w:t>
+      </w:r>
+      <w:r>
+        <w:rPr>
+          <w:u w:val="single"/>
+          <w:lang w:val="pt-BR" w:eastAsia="pt-BR"/>
+        </w:rPr>
+        <w:t>Julgamento</w:t>
+      </w:r>
+      <w:r>
+        <w:rPr>
+          <w:lang w:val="pt-BR" w:eastAsia="pt-BR"/>
+        </w:rPr>
+        <w:t xml:space="preserve">, pode assumir a </w:t>
+      </w:r>
+      <w:proofErr w:type="spellStart"/>
+      <w:r>
+        <w:rPr>
+          <w:rFonts w:ascii="Courier New" w:hAnsi="Courier New" w:cs="Courier New"/>
+          <w:lang w:val="pt-BR" w:eastAsia="pt-BR"/>
+        </w:rPr>
+        <w:t>phase</w:t>
+      </w:r>
+      <w:proofErr w:type="spellEnd"/>
+      <w:r>
+        <w:rPr>
+          <w:lang w:val="pt-BR" w:eastAsia="pt-BR"/>
+        </w:rPr>
+        <w:t xml:space="preserve"> </w:t>
+      </w:r>
+      <w:r>
+        <w:rPr>
+          <w:u w:val="single"/>
+          <w:lang w:val="pt-BR" w:eastAsia="pt-BR"/>
+        </w:rPr>
+        <w:t>Sentença Não Transitada em Julgado</w:t>
+      </w:r>
+      <w:r>
+        <w:rPr>
+          <w:lang w:val="pt-BR" w:eastAsia="pt-BR"/>
+        </w:rPr>
+        <w:t xml:space="preserve"> enquanto ainda estiver sujeita à impugnação. Nesse contexto, pode exercer o </w:t>
+      </w:r>
+      <w:r>
+        <w:rPr>
+          <w:rFonts w:ascii="Courier New" w:hAnsi="Courier New" w:cs="Courier New"/>
+          <w:lang w:val="pt-BR" w:eastAsia="pt-BR"/>
+        </w:rPr>
+        <w:t>role</w:t>
+      </w:r>
+      <w:r>
+        <w:rPr>
+          <w:lang w:val="pt-BR" w:eastAsia="pt-BR"/>
+        </w:rPr>
+        <w:t xml:space="preserve"> </w:t>
+      </w:r>
+      <w:r>
+        <w:rPr>
+          <w:u w:val="single"/>
+          <w:lang w:val="pt-BR" w:eastAsia="pt-BR"/>
+        </w:rPr>
+        <w:t>Sentença Recorrida</w:t>
+      </w:r>
+      <w:r>
+        <w:rPr>
+          <w:lang w:val="pt-BR" w:eastAsia="pt-BR"/>
+        </w:rPr>
+        <w:t xml:space="preserve"> quando for objeto de um recurso. Esse papel é mediado pelo </w:t>
+      </w:r>
+      <w:r>
+        <w:rPr>
+          <w:rFonts w:ascii="Courier New" w:hAnsi="Courier New" w:cs="Courier New"/>
+          <w:lang w:val="pt-BR" w:eastAsia="pt-BR"/>
+        </w:rPr>
+        <w:t>relator</w:t>
+      </w:r>
+      <w:r>
+        <w:rPr>
+          <w:lang w:val="pt-BR" w:eastAsia="pt-BR"/>
+        </w:rPr>
+        <w:t xml:space="preserve"> </w:t>
+      </w:r>
+      <w:r>
+        <w:rPr>
+          <w:u w:val="single"/>
+          <w:lang w:val="pt-BR" w:eastAsia="pt-BR"/>
+        </w:rPr>
+        <w:t>Relação Recursal</w:t>
+      </w:r>
+      <w:r>
+        <w:rPr>
+          <w:lang w:val="pt-BR" w:eastAsia="pt-BR"/>
+        </w:rPr>
+        <w:t xml:space="preserve">, que também envolve a </w:t>
+      </w:r>
+      <w:r>
+        <w:rPr>
+          <w:u w:val="single"/>
+          <w:lang w:val="pt-BR" w:eastAsia="pt-BR"/>
+        </w:rPr>
+        <w:t>Parte Processual</w:t>
+      </w:r>
+      <w:r>
+        <w:rPr>
+          <w:lang w:val="pt-BR" w:eastAsia="pt-BR"/>
+        </w:rPr>
+        <w:t>, permitindo representar a relação constituída em torno da impugnação da decisão.</w:t>
       </w:r>
     </w:p>
     <w:p>
       <w:pPr>
         <w:pStyle w:val="Corpodetexto"/>
         <w:spacing w:line="312" w:lineRule="auto"/>
-        <w:ind w:left="282" w:right="116" w:firstLine="737"/>
+        <w:ind w:left="284" w:right="113" w:firstLine="737"/>
         <w:jc w:val="both"/>
         <w:rPr>
           <w:lang w:val="pt-BR" w:eastAsia="pt-BR"/>
@@ -29244,6 +29470,167 @@
         <w:rPr>
           <w:lang w:val="pt-BR" w:eastAsia="pt-BR"/>
         </w:rPr>
+        <w:t xml:space="preserve">O </w:t>
+      </w:r>
+      <w:r>
+        <w:rPr>
+          <w:u w:val="single"/>
+          <w:lang w:val="pt-BR" w:eastAsia="pt-BR"/>
+        </w:rPr>
+        <w:t>Recurso Inominado</w:t>
+      </w:r>
+      <w:r>
+        <w:rPr>
+          <w:lang w:val="pt-BR" w:eastAsia="pt-BR"/>
+        </w:rPr>
+        <w:t xml:space="preserve"> é modelado como </w:t>
+      </w:r>
+      <w:proofErr w:type="spellStart"/>
+      <w:r>
+        <w:rPr>
+          <w:rFonts w:ascii="Courier New" w:hAnsi="Courier New" w:cs="Courier New"/>
+          <w:lang w:val="pt-BR" w:eastAsia="pt-BR"/>
+        </w:rPr>
+        <w:t>subkind</w:t>
+      </w:r>
+      <w:proofErr w:type="spellEnd"/>
+      <w:r>
+        <w:rPr>
+          <w:lang w:val="pt-BR" w:eastAsia="pt-BR"/>
+        </w:rPr>
+        <w:t xml:space="preserve"> de </w:t>
+      </w:r>
+      <w:r>
+        <w:rPr>
+          <w:u w:val="single"/>
+          <w:lang w:val="pt-BR" w:eastAsia="pt-BR"/>
+        </w:rPr>
+        <w:t>Documento</w:t>
+      </w:r>
+      <w:r>
+        <w:rPr>
+          <w:lang w:val="pt-BR" w:eastAsia="pt-BR"/>
+        </w:rPr>
+        <w:t xml:space="preserve"> e impugna a </w:t>
+      </w:r>
+      <w:r>
+        <w:rPr>
+          <w:u w:val="single"/>
+          <w:lang w:val="pt-BR" w:eastAsia="pt-BR"/>
+        </w:rPr>
+        <w:t>Sentença Recorrida</w:t>
+      </w:r>
+      <w:r>
+        <w:rPr>
+          <w:lang w:val="pt-BR" w:eastAsia="pt-BR"/>
+        </w:rPr>
+        <w:t xml:space="preserve">. Sua apresentação ocorre por meio do </w:t>
+      </w:r>
+      <w:proofErr w:type="spellStart"/>
+      <w:r>
+        <w:rPr>
+          <w:rFonts w:ascii="Courier New" w:hAnsi="Courier New" w:cs="Courier New"/>
+          <w:lang w:val="pt-BR" w:eastAsia="pt-BR"/>
+        </w:rPr>
+        <w:t>event</w:t>
+      </w:r>
+      <w:proofErr w:type="spellEnd"/>
+      <w:r>
+        <w:rPr>
+          <w:lang w:val="pt-BR" w:eastAsia="pt-BR"/>
+        </w:rPr>
+        <w:t xml:space="preserve"> </w:t>
+      </w:r>
+      <w:r>
+        <w:rPr>
+          <w:u w:val="single"/>
+          <w:lang w:val="pt-BR" w:eastAsia="pt-BR"/>
+        </w:rPr>
+        <w:t>Interposição de Recurso</w:t>
+      </w:r>
+      <w:r>
+        <w:rPr>
+          <w:lang w:val="pt-BR" w:eastAsia="pt-BR"/>
+        </w:rPr>
+        <w:t xml:space="preserve">, regulado pela </w:t>
+      </w:r>
+      <w:r>
+        <w:rPr>
+          <w:u w:val="single"/>
+          <w:lang w:val="pt-BR" w:eastAsia="pt-BR"/>
+        </w:rPr>
+        <w:t>Regra de Prazo Recursal</w:t>
+      </w:r>
+      <w:r>
+        <w:rPr>
+          <w:lang w:val="pt-BR" w:eastAsia="pt-BR"/>
+        </w:rPr>
+        <w:t xml:space="preserve">, especialização de </w:t>
+      </w:r>
+      <w:r>
+        <w:rPr>
+          <w:u w:val="single"/>
+          <w:lang w:val="pt-BR" w:eastAsia="pt-BR"/>
+        </w:rPr>
+        <w:t>Regra Jurídica</w:t>
+      </w:r>
+      <w:r>
+        <w:rPr>
+          <w:lang w:val="pt-BR" w:eastAsia="pt-BR"/>
+        </w:rPr>
+        <w:t xml:space="preserve">. A regra é caracterizada pela </w:t>
+      </w:r>
+      <w:proofErr w:type="spellStart"/>
+      <w:r>
+        <w:rPr>
+          <w:rStyle w:val="Ttulo8Char"/>
+          <w:rFonts w:ascii="Courier New" w:hAnsi="Courier New" w:cs="Courier New"/>
+          <w:lang w:val="pt-BR" w:eastAsia="pt-BR"/>
+        </w:rPr>
+        <w:t>quality</w:t>
+      </w:r>
+      <w:proofErr w:type="spellEnd"/>
+      <w:r>
+        <w:rPr>
+          <w:lang w:val="pt-BR" w:eastAsia="pt-BR"/>
+        </w:rPr>
+        <w:t xml:space="preserve"> </w:t>
+      </w:r>
+      <w:r>
+        <w:rPr>
+          <w:u w:val="single"/>
+          <w:lang w:val="pt-BR" w:eastAsia="pt-BR"/>
+        </w:rPr>
+        <w:t>Prazo Recursal</w:t>
+      </w:r>
+      <w:r>
+        <w:rPr>
+          <w:lang w:val="pt-BR" w:eastAsia="pt-BR"/>
+        </w:rPr>
+        <w:t xml:space="preserve">, permitindo representar o intervalo temporal </w:t>
+      </w:r>
+      <w:r>
+        <w:rPr>
+          <w:lang w:val="pt-BR" w:eastAsia="pt-BR"/>
+        </w:rPr>
+        <w:lastRenderedPageBreak/>
+        <w:t>aplicável à apresentação do recurso.</w:t>
+      </w:r>
+    </w:p>
+    <w:p>
+      <w:pPr>
+        <w:pStyle w:val="Corpodetexto"/>
+        <w:spacing w:line="312" w:lineRule="auto"/>
+        <w:ind w:left="284" w:right="113" w:firstLine="737"/>
+        <w:jc w:val="both"/>
+        <w:rPr>
+          <w:lang w:val="pt-BR" w:eastAsia="pt-BR"/>
+        </w:rPr>
+      </w:pPr>
+      <w:r>
+        <w:rPr>
+          <w:lang w:val="pt-BR" w:eastAsia="pt-BR"/>
+        </w:rPr>
         <w:t xml:space="preserve">A </w:t>
       </w:r>
       <w:r>
@@ -29251,316 +29638,26 @@
           <w:u w:val="single"/>
           <w:lang w:val="pt-BR" w:eastAsia="pt-BR"/>
         </w:rPr>
-        <w:t>Sentença</w:t>
-      </w:r>
-      <w:r>
-        <w:rPr>
-          <w:lang w:val="pt-BR" w:eastAsia="pt-BR"/>
-        </w:rPr>
-        <w:t xml:space="preserve">, representada como </w:t>
-      </w:r>
-      <w:proofErr w:type="spellStart"/>
-      <w:r>
-        <w:rPr>
-          <w:rFonts w:ascii="Courier New" w:hAnsi="Courier New" w:cs="Courier New"/>
-          <w:lang w:val="pt-BR" w:eastAsia="pt-BR"/>
-        </w:rPr>
-        <w:t>subkind</w:t>
-      </w:r>
-      <w:proofErr w:type="spellEnd"/>
-      <w:r>
-        <w:rPr>
-          <w:lang w:val="pt-BR" w:eastAsia="pt-BR"/>
-        </w:rPr>
-        <w:t xml:space="preserve"> de </w:t>
+        <w:t>Interposição de Recurso</w:t>
+      </w:r>
+      <w:r>
+        <w:rPr>
+          <w:lang w:val="pt-BR" w:eastAsia="pt-BR"/>
+        </w:rPr>
+        <w:t xml:space="preserve"> cria o </w:t>
       </w:r>
       <w:r>
         <w:rPr>
           <w:u w:val="single"/>
           <w:lang w:val="pt-BR" w:eastAsia="pt-BR"/>
         </w:rPr>
-        <w:t>Documento</w:t>
-      </w:r>
-      <w:r>
-        <w:rPr>
-          <w:lang w:val="pt-BR" w:eastAsia="pt-BR"/>
-        </w:rPr>
-        <w:t xml:space="preserve">, é produzida pelo </w:t>
-      </w:r>
-      <w:proofErr w:type="spellStart"/>
-      <w:r>
-        <w:rPr>
-          <w:rFonts w:ascii="Courier New" w:hAnsi="Courier New" w:cs="Courier New"/>
-          <w:lang w:val="pt-BR" w:eastAsia="pt-BR"/>
-        </w:rPr>
-        <w:t>event</w:t>
-      </w:r>
-      <w:proofErr w:type="spellEnd"/>
-      <w:r>
-        <w:rPr>
-          <w:lang w:val="pt-BR" w:eastAsia="pt-BR"/>
-        </w:rPr>
-        <w:t xml:space="preserve"> </w:t>
-      </w:r>
-      <w:r>
-        <w:rPr>
-          <w:u w:val="single"/>
-          <w:lang w:val="pt-BR" w:eastAsia="pt-BR"/>
-        </w:rPr>
-        <w:t>Julgamento</w:t>
-      </w:r>
-      <w:r>
-        <w:rPr>
-          <w:lang w:val="pt-BR" w:eastAsia="pt-BR"/>
-        </w:rPr>
-        <w:t xml:space="preserve"> e pode assumir o role </w:t>
-      </w:r>
-      <w:r>
-        <w:rPr>
-          <w:u w:val="single"/>
-          <w:lang w:val="pt-BR" w:eastAsia="pt-BR"/>
-        </w:rPr>
-        <w:t>Sentença Recorrida</w:t>
-      </w:r>
-      <w:r>
-        <w:rPr>
-          <w:lang w:val="pt-BR" w:eastAsia="pt-BR"/>
-        </w:rPr>
-        <w:t xml:space="preserve"> quando se torna objeto de impugnação. Essa posição é mediada pelo relator </w:t>
-      </w:r>
-      <w:r>
-        <w:rPr>
-          <w:rFonts w:ascii="Courier New" w:hAnsi="Courier New" w:cs="Courier New"/>
-          <w:lang w:val="pt-BR" w:eastAsia="pt-BR"/>
-        </w:rPr>
-        <w:t>Relação Recursal</w:t>
-      </w:r>
-      <w:r>
-        <w:rPr>
-          <w:lang w:val="pt-BR" w:eastAsia="pt-BR"/>
-        </w:rPr>
-        <w:t xml:space="preserve">, que também envolve a </w:t>
-      </w:r>
-      <w:r>
-        <w:rPr>
-          <w:u w:val="single"/>
-          <w:lang w:val="pt-BR" w:eastAsia="pt-BR"/>
-        </w:rPr>
-        <w:t>Parte Processual</w:t>
-      </w:r>
-      <w:r>
-        <w:rPr>
-          <w:lang w:val="pt-BR" w:eastAsia="pt-BR"/>
-        </w:rPr>
-        <w:t>, permitindo representar a relação constituída em torno da impugnação da decisão.</w:t>
-      </w:r>
-    </w:p>
-    <w:p>
-      <w:pPr>
-        <w:pStyle w:val="Corpodetexto"/>
-        <w:spacing w:line="312" w:lineRule="auto"/>
-        <w:ind w:left="282" w:right="116" w:firstLine="737"/>
-        <w:jc w:val="both"/>
-        <w:rPr>
-          <w:lang w:val="pt-BR" w:eastAsia="pt-BR"/>
-        </w:rPr>
-      </w:pPr>
-      <w:r>
-        <w:rPr>
-          <w:lang w:val="pt-BR" w:eastAsia="pt-BR"/>
-        </w:rPr>
-        <w:t xml:space="preserve">O </w:t>
-      </w:r>
-      <w:r>
-        <w:rPr>
-          <w:u w:val="single"/>
-          <w:lang w:val="pt-BR" w:eastAsia="pt-BR"/>
-        </w:rPr>
         <w:t>Recurso Inominado</w:t>
       </w:r>
       <w:r>
         <w:rPr>
           <w:lang w:val="pt-BR" w:eastAsia="pt-BR"/>
         </w:rPr>
-        <w:t xml:space="preserve"> é modelado como </w:t>
-      </w:r>
-      <w:proofErr w:type="spellStart"/>
-      <w:r>
-        <w:rPr>
-          <w:rFonts w:ascii="Courier New" w:hAnsi="Courier New" w:cs="Courier New"/>
-          <w:lang w:val="pt-BR" w:eastAsia="pt-BR"/>
-        </w:rPr>
-        <w:t>subkind</w:t>
-      </w:r>
-      <w:proofErr w:type="spellEnd"/>
-      <w:r>
-        <w:rPr>
-          <w:lang w:val="pt-BR" w:eastAsia="pt-BR"/>
-        </w:rPr>
-        <w:t xml:space="preserve"> de </w:t>
-      </w:r>
-      <w:r>
-        <w:rPr>
-          <w:u w:val="single"/>
-          <w:lang w:val="pt-BR" w:eastAsia="pt-BR"/>
-        </w:rPr>
-        <w:t>Documento</w:t>
-      </w:r>
-      <w:r>
-        <w:rPr>
-          <w:lang w:val="pt-BR" w:eastAsia="pt-BR"/>
-        </w:rPr>
-        <w:t xml:space="preserve"> e impugna a </w:t>
-      </w:r>
-      <w:r>
-        <w:rPr>
-          <w:u w:val="single"/>
-          <w:lang w:val="pt-BR" w:eastAsia="pt-BR"/>
-        </w:rPr>
-        <w:t>Sentença Recorrida</w:t>
-      </w:r>
-      <w:r>
-        <w:rPr>
-          <w:lang w:val="pt-BR" w:eastAsia="pt-BR"/>
-        </w:rPr>
-        <w:t xml:space="preserve">. Sua apresentação ocorre por meio do </w:t>
-      </w:r>
-      <w:proofErr w:type="spellStart"/>
-      <w:r>
-        <w:rPr>
-          <w:rFonts w:ascii="Courier New" w:hAnsi="Courier New" w:cs="Courier New"/>
-          <w:lang w:val="pt-BR" w:eastAsia="pt-BR"/>
-        </w:rPr>
-        <w:t>event</w:t>
-      </w:r>
-      <w:proofErr w:type="spellEnd"/>
-      <w:r>
-        <w:rPr>
-          <w:lang w:val="pt-BR" w:eastAsia="pt-BR"/>
-        </w:rPr>
-        <w:t xml:space="preserve"> </w:t>
-      </w:r>
-      <w:r>
-        <w:rPr>
-          <w:u w:val="single"/>
-          <w:lang w:val="pt-BR" w:eastAsia="pt-BR"/>
-        </w:rPr>
-        <w:t>Interposição de Recurso</w:t>
-      </w:r>
-      <w:r>
-        <w:rPr>
-          <w:lang w:val="pt-BR" w:eastAsia="pt-BR"/>
-        </w:rPr>
-        <w:t xml:space="preserve">, regulado pela </w:t>
-      </w:r>
-      <w:r>
-        <w:rPr>
-          <w:u w:val="single"/>
-          <w:lang w:val="pt-BR" w:eastAsia="pt-BR"/>
-        </w:rPr>
-        <w:t>Regra de Prazo Recursal</w:t>
-      </w:r>
-      <w:r>
-        <w:rPr>
-          <w:lang w:val="pt-BR" w:eastAsia="pt-BR"/>
-        </w:rPr>
-        <w:t xml:space="preserve">, especialização de </w:t>
-      </w:r>
-      <w:r>
-        <w:rPr>
-          <w:u w:val="single"/>
-          <w:lang w:val="pt-BR" w:eastAsia="pt-BR"/>
-        </w:rPr>
-        <w:t>Regra Jurídica</w:t>
-      </w:r>
-      <w:r>
-        <w:rPr>
-          <w:lang w:val="pt-BR" w:eastAsia="pt-BR"/>
-        </w:rPr>
-        <w:t xml:space="preserve">. A regra é caracterizada pela </w:t>
-      </w:r>
-      <w:proofErr w:type="spellStart"/>
-      <w:r>
-        <w:rPr>
-          <w:rFonts w:ascii="Courier New" w:hAnsi="Courier New" w:cs="Courier New"/>
-          <w:lang w:val="pt-BR" w:eastAsia="pt-BR"/>
-        </w:rPr>
-        <w:t>quality</w:t>
-      </w:r>
-      <w:proofErr w:type="spellEnd"/>
-      <w:r>
-        <w:rPr>
-          <w:lang w:val="pt-BR" w:eastAsia="pt-BR"/>
-        </w:rPr>
-        <w:t xml:space="preserve"> </w:t>
-      </w:r>
-      <w:r>
-        <w:rPr>
-          <w:u w:val="single"/>
-          <w:lang w:val="pt-BR" w:eastAsia="pt-BR"/>
-        </w:rPr>
-        <w:t>Prazo Recursal</w:t>
-      </w:r>
-      <w:r>
-        <w:rPr>
-          <w:lang w:val="pt-BR" w:eastAsia="pt-BR"/>
-        </w:rPr>
-        <w:t>, permitindo representar o intervalo temporal aplicável à apresentação do recurso.</w:t>
-      </w:r>
-    </w:p>
-    <w:p>
-      <w:pPr>
-        <w:pStyle w:val="Corpodetexto"/>
-        <w:spacing w:line="312" w:lineRule="auto"/>
-        <w:ind w:left="282" w:right="116" w:firstLine="737"/>
-        <w:jc w:val="both"/>
-        <w:rPr>
-          <w:lang w:val="pt-BR" w:eastAsia="pt-BR"/>
-        </w:rPr>
-      </w:pPr>
-      <w:r>
-        <w:rPr>
-          <w:lang w:val="pt-BR" w:eastAsia="pt-BR"/>
-        </w:rPr>
-        <w:t xml:space="preserve">A </w:t>
-      </w:r>
-      <w:r>
-        <w:rPr>
-          <w:u w:val="single"/>
-          <w:lang w:val="pt-BR" w:eastAsia="pt-BR"/>
-        </w:rPr>
-        <w:t>Interposição de Recurso</w:t>
-      </w:r>
-      <w:r>
-        <w:rPr>
-          <w:lang w:val="pt-BR" w:eastAsia="pt-BR"/>
-        </w:rPr>
-        <w:t xml:space="preserve"> cria o </w:t>
-      </w:r>
-      <w:r>
-        <w:rPr>
-          <w:u w:val="single"/>
-          <w:lang w:val="pt-BR" w:eastAsia="pt-BR"/>
-        </w:rPr>
-        <w:t>Recurso Inominado</w:t>
-      </w:r>
-      <w:r>
-        <w:rPr>
-          <w:lang w:val="pt-BR" w:eastAsia="pt-BR"/>
-        </w:rPr>
-        <w:t xml:space="preserve"> e </w:t>
-      </w:r>
-      <w:r>
-        <w:rPr>
-          <w:lang w:val="pt-BR" w:eastAsia="pt-BR"/>
-        </w:rPr>
-        <w:t>leva</w:t>
-      </w:r>
-      <w:r>
-        <w:rPr>
-          <w:lang w:val="pt-BR" w:eastAsia="pt-BR"/>
-        </w:rPr>
-        <w:t xml:space="preserve"> a </w:t>
+        <w:t xml:space="preserve"> e leva à </w:t>
       </w:r>
       <w:proofErr w:type="spellStart"/>
       <w:r>
@@ -29638,14 +29735,7 @@
         <w:rPr>
           <w:lang w:val="pt-BR" w:eastAsia="pt-BR"/>
         </w:rPr>
-        <w:t xml:space="preserve">, representando o encaminhamento do processo para apreciação do recurso. A remessa destina o </w:t>
-      </w:r>
-      <w:r>
-        <w:rPr>
-          <w:lang w:val="pt-BR" w:eastAsia="pt-BR"/>
-        </w:rPr>
-        <w:lastRenderedPageBreak/>
-        <w:t xml:space="preserve">recurso à </w:t>
+        <w:t xml:space="preserve">, que possui dependência histórica em relação à interposição. A remessa destina o processo à </w:t>
       </w:r>
       <w:r>
         <w:rPr>
@@ -29693,7 +29783,7 @@
       <w:pPr>
         <w:pStyle w:val="Corpodetexto"/>
         <w:spacing w:line="312" w:lineRule="auto"/>
-        <w:ind w:left="282" w:right="116" w:firstLine="737"/>
+        <w:ind w:left="284" w:right="113" w:firstLine="737"/>
         <w:jc w:val="both"/>
         <w:rPr>
           <w:lang w:val="pt-BR" w:eastAsia="pt-BR"/>
@@ -29790,7 +29880,7 @@
       <w:pPr>
         <w:pStyle w:val="Corpodetexto"/>
         <w:spacing w:line="312" w:lineRule="auto"/>
-        <w:ind w:left="282" w:right="116" w:firstLine="737"/>
+        <w:ind w:left="284" w:right="113" w:firstLine="737"/>
         <w:jc w:val="both"/>
         <w:rPr>
           <w:lang w:val="pt-BR" w:eastAsia="pt-BR"/>
@@ -29828,7 +29918,20 @@
         <w:rPr>
           <w:lang w:val="pt-BR" w:eastAsia="pt-BR"/>
         </w:rPr>
-        <w:t xml:space="preserve"> e possui </w:t>
+        <w:t xml:space="preserve"> e possui dependência histórica em relação à </w:t>
+      </w:r>
+      <w:r>
+        <w:rPr>
+          <w:u w:val="single"/>
+          <w:lang w:val="pt-BR" w:eastAsia="pt-BR"/>
+        </w:rPr>
+        <w:t>Remessa à Turma Recursal</w:t>
+      </w:r>
+      <w:r>
+        <w:rPr>
+          <w:lang w:val="pt-BR" w:eastAsia="pt-BR"/>
+        </w:rPr>
+        <w:t xml:space="preserve">. A </w:t>
       </w:r>
       <w:proofErr w:type="spellStart"/>
       <w:r>
@@ -29836,35 +29939,91 @@
           <w:rFonts w:ascii="Courier New" w:hAnsi="Courier New" w:cs="Courier New"/>
           <w:lang w:val="pt-BR" w:eastAsia="pt-BR"/>
         </w:rPr>
-        <w:t>historicalDependence</w:t>
+        <w:t>situation</w:t>
       </w:r>
       <w:proofErr w:type="spellEnd"/>
       <w:r>
         <w:rPr>
           <w:lang w:val="pt-BR" w:eastAsia="pt-BR"/>
         </w:rPr>
-        <w:t xml:space="preserve"> em relação à </w:t>
+        <w:t xml:space="preserve"> </w:t>
       </w:r>
       <w:r>
         <w:rPr>
           <w:u w:val="single"/>
           <w:lang w:val="pt-BR" w:eastAsia="pt-BR"/>
         </w:rPr>
-        <w:t>Remessa à Turma Recursal</w:t>
-      </w:r>
-      <w:r>
-        <w:rPr>
-          <w:lang w:val="pt-BR" w:eastAsia="pt-BR"/>
-        </w:rPr>
-        <w:t xml:space="preserve">. A situação </w:t>
+        <w:t>Processo Encaminhado à Turma Recursal</w:t>
+      </w:r>
+      <w:r>
+        <w:rPr>
+          <w:lang w:val="pt-BR" w:eastAsia="pt-BR"/>
+        </w:rPr>
+        <w:t xml:space="preserve"> </w:t>
+      </w:r>
+      <w:r>
+        <w:rPr>
+          <w:rFonts w:ascii="Courier New" w:hAnsi="Courier New" w:cs="Courier New"/>
+          <w:lang w:val="pt-BR" w:eastAsia="pt-BR"/>
+        </w:rPr>
+        <w:t>triggers</w:t>
+      </w:r>
+      <w:r>
+        <w:rPr>
+          <w:lang w:val="pt-BR" w:eastAsia="pt-BR"/>
+        </w:rPr>
+        <w:t xml:space="preserve"> esse julgamento, que cria o </w:t>
       </w:r>
       <w:r>
         <w:rPr>
           <w:u w:val="single"/>
           <w:lang w:val="pt-BR" w:eastAsia="pt-BR"/>
         </w:rPr>
-        <w:t>Processo Encaminhado à Turma Recursal</w:t>
-      </w:r>
+        <w:t>Acórdão</w:t>
+      </w:r>
+      <w:r>
+        <w:rPr>
+          <w:lang w:val="pt-BR" w:eastAsia="pt-BR"/>
+        </w:rPr>
+        <w:t xml:space="preserve">, representado como </w:t>
+      </w:r>
+      <w:proofErr w:type="spellStart"/>
+      <w:r>
+        <w:rPr>
+          <w:rFonts w:ascii="Courier New" w:hAnsi="Courier New" w:cs="Courier New"/>
+          <w:lang w:val="pt-BR" w:eastAsia="pt-BR"/>
+        </w:rPr>
+        <w:t>subkind</w:t>
+      </w:r>
+      <w:proofErr w:type="spellEnd"/>
+      <w:r>
+        <w:rPr>
+          <w:lang w:val="pt-BR" w:eastAsia="pt-BR"/>
+        </w:rPr>
+        <w:t xml:space="preserve"> de </w:t>
+      </w:r>
+      <w:r>
+        <w:rPr>
+          <w:u w:val="single"/>
+          <w:lang w:val="pt-BR" w:eastAsia="pt-BR"/>
+        </w:rPr>
+        <w:t>Documento</w:t>
+      </w:r>
+      <w:r>
+        <w:rPr>
+          <w:lang w:val="pt-BR" w:eastAsia="pt-BR"/>
+        </w:rPr>
+        <w:t xml:space="preserve">, e leva à </w:t>
+      </w:r>
+      <w:proofErr w:type="spellStart"/>
+      <w:r>
+        <w:rPr>
+          <w:rFonts w:ascii="Courier New" w:hAnsi="Courier New" w:cs="Courier New"/>
+          <w:lang w:val="pt-BR" w:eastAsia="pt-BR"/>
+        </w:rPr>
+        <w:t>situation</w:t>
+      </w:r>
+      <w:proofErr w:type="spellEnd"/>
       <w:r>
         <w:rPr>
           <w:lang w:val="pt-BR" w:eastAsia="pt-BR"/>
@@ -29873,29 +30032,213 @@
       </w:r>
       <w:r>
         <w:rPr>
+          <w:u w:val="single"/>
+          <w:lang w:val="pt-BR" w:eastAsia="pt-BR"/>
+        </w:rPr>
+        <w:t>Resultado do Julgamento Recursal</w:t>
+      </w:r>
+      <w:r>
+        <w:rPr>
+          <w:lang w:val="pt-BR" w:eastAsia="pt-BR"/>
+        </w:rPr>
+        <w:t>.</w:t>
+      </w:r>
+    </w:p>
+    <w:p>
+      <w:pPr>
+        <w:pStyle w:val="Corpodetexto"/>
+        <w:spacing w:line="312" w:lineRule="auto"/>
+        <w:ind w:left="284" w:right="113" w:firstLine="737"/>
+        <w:jc w:val="both"/>
+        <w:rPr>
+          <w:lang w:val="pt-BR" w:eastAsia="pt-BR"/>
+        </w:rPr>
+      </w:pPr>
+      <w:r>
+        <w:rPr>
+          <w:lang w:val="pt-BR" w:eastAsia="pt-BR"/>
+        </w:rPr>
+        <w:t xml:space="preserve">O </w:t>
+      </w:r>
+      <w:r>
+        <w:rPr>
+          <w:u w:val="single"/>
+          <w:lang w:val="pt-BR" w:eastAsia="pt-BR"/>
+        </w:rPr>
+        <w:t>Resultado do Julgamento Recursal</w:t>
+      </w:r>
+      <w:r>
+        <w:rPr>
+          <w:lang w:val="pt-BR" w:eastAsia="pt-BR"/>
+        </w:rPr>
+        <w:t xml:space="preserve"> é especializado nas </w:t>
+      </w:r>
+      <w:proofErr w:type="spellStart"/>
+      <w:r>
+        <w:rPr>
           <w:rFonts w:ascii="Courier New" w:hAnsi="Courier New" w:cs="Courier New"/>
           <w:lang w:val="pt-BR" w:eastAsia="pt-BR"/>
         </w:rPr>
+        <w:t>situations</w:t>
+      </w:r>
+      <w:proofErr w:type="spellEnd"/>
+      <w:r>
+        <w:rPr>
+          <w:lang w:val="pt-BR" w:eastAsia="pt-BR"/>
+        </w:rPr>
+        <w:t xml:space="preserve"> </w:t>
+      </w:r>
+      <w:r>
+        <w:rPr>
+          <w:u w:val="single"/>
+          <w:lang w:val="pt-BR" w:eastAsia="pt-BR"/>
+        </w:rPr>
+        <w:t>Recurso Provido</w:t>
+      </w:r>
+      <w:r>
+        <w:rPr>
+          <w:lang w:val="pt-BR" w:eastAsia="pt-BR"/>
+        </w:rPr>
+        <w:t xml:space="preserve">, </w:t>
+      </w:r>
+      <w:r>
+        <w:rPr>
+          <w:u w:val="single"/>
+          <w:lang w:val="pt-BR" w:eastAsia="pt-BR"/>
+        </w:rPr>
+        <w:t>Recurso Parcialmente Provido</w:t>
+      </w:r>
+      <w:r>
+        <w:rPr>
+          <w:lang w:val="pt-BR" w:eastAsia="pt-BR"/>
+        </w:rPr>
+        <w:t xml:space="preserve">, </w:t>
+      </w:r>
+      <w:r>
+        <w:rPr>
+          <w:u w:val="single"/>
+          <w:lang w:val="pt-BR" w:eastAsia="pt-BR"/>
+        </w:rPr>
+        <w:t>Recurso Desprovido</w:t>
+      </w:r>
+      <w:r>
+        <w:rPr>
+          <w:lang w:val="pt-BR" w:eastAsia="pt-BR"/>
+        </w:rPr>
+        <w:t xml:space="preserve"> e </w:t>
+      </w:r>
+      <w:r>
+        <w:rPr>
+          <w:u w:val="single"/>
+          <w:lang w:val="pt-BR" w:eastAsia="pt-BR"/>
+        </w:rPr>
+        <w:t>Recurso Não Conhecido</w:t>
+      </w:r>
+      <w:r>
+        <w:rPr>
+          <w:lang w:val="pt-BR" w:eastAsia="pt-BR"/>
+        </w:rPr>
+        <w:t xml:space="preserve">. Essas especializações formam um conjunto </w:t>
+      </w:r>
+      <w:r>
+        <w:rPr>
+          <w:rFonts w:ascii="Courier New" w:hAnsi="Courier New" w:cs="Courier New"/>
+          <w:lang w:val="pt-BR" w:eastAsia="pt-BR"/>
+        </w:rPr>
+        <w:t>{</w:t>
+      </w:r>
+      <w:proofErr w:type="spellStart"/>
+      <w:r>
+        <w:rPr>
+          <w:rFonts w:ascii="Courier New" w:hAnsi="Courier New" w:cs="Courier New"/>
+          <w:lang w:val="pt-BR" w:eastAsia="pt-BR"/>
+        </w:rPr>
+        <w:t>disjoint</w:t>
+      </w:r>
+      <w:proofErr w:type="spellEnd"/>
+      <w:r>
+        <w:rPr>
+          <w:rFonts w:ascii="Courier New" w:hAnsi="Courier New" w:cs="Courier New"/>
+          <w:lang w:val="pt-BR" w:eastAsia="pt-BR"/>
+        </w:rPr>
+        <w:t>, complete}</w:t>
+      </w:r>
+      <w:r>
+        <w:rPr>
+          <w:lang w:val="pt-BR" w:eastAsia="pt-BR"/>
+        </w:rPr>
+        <w:t>, permitindo representar, dentro do escopo da ontologia, os diferentes resultados possíveis da apreciação do recurso.</w:t>
+      </w:r>
+    </w:p>
+    <w:p>
+      <w:pPr>
+        <w:pStyle w:val="Corpodetexto"/>
+        <w:spacing w:line="312" w:lineRule="auto"/>
+        <w:ind w:left="284" w:right="113" w:firstLine="737"/>
+        <w:jc w:val="both"/>
+        <w:rPr>
+          <w:lang w:val="pt-BR" w:eastAsia="pt-BR"/>
+        </w:rPr>
+      </w:pPr>
+      <w:r>
+        <w:rPr>
+          <w:lang w:val="pt-BR" w:eastAsia="pt-BR"/>
+        </w:rPr>
+        <w:t xml:space="preserve">O modelo também contempla a hipótese de não interposição. A </w:t>
+      </w:r>
+      <w:r>
+        <w:rPr>
+          <w:u w:val="single"/>
+          <w:lang w:val="pt-BR" w:eastAsia="pt-BR"/>
+        </w:rPr>
+        <w:t>Sentença</w:t>
+      </w:r>
+      <w:r>
+        <w:rPr>
+          <w:lang w:val="pt-BR" w:eastAsia="pt-BR"/>
+        </w:rPr>
+        <w:t xml:space="preserve"> </w:t>
+      </w:r>
+      <w:r>
+        <w:rPr>
+          <w:rFonts w:ascii="Courier New" w:hAnsi="Courier New" w:cs="Courier New"/>
+          <w:lang w:val="pt-BR" w:eastAsia="pt-BR"/>
+        </w:rPr>
         <w:t>triggers</w:t>
       </w:r>
       <w:r>
         <w:rPr>
           <w:lang w:val="pt-BR" w:eastAsia="pt-BR"/>
         </w:rPr>
-        <w:t xml:space="preserve"> esse julgamento, que produz o </w:t>
+        <w:t xml:space="preserve"> o </w:t>
+      </w:r>
+      <w:proofErr w:type="spellStart"/>
+      <w:r>
+        <w:rPr>
+          <w:rFonts w:ascii="Courier New" w:hAnsi="Courier New" w:cs="Courier New"/>
+          <w:lang w:val="pt-BR" w:eastAsia="pt-BR"/>
+        </w:rPr>
+        <w:t>event</w:t>
+      </w:r>
+      <w:proofErr w:type="spellEnd"/>
+      <w:r>
+        <w:rPr>
+          <w:lang w:val="pt-BR" w:eastAsia="pt-BR"/>
+        </w:rPr>
+        <w:t xml:space="preserve"> </w:t>
       </w:r>
       <w:r>
         <w:rPr>
           <w:u w:val="single"/>
           <w:lang w:val="pt-BR" w:eastAsia="pt-BR"/>
         </w:rPr>
-        <w:t>Acórdão</w:t>
-      </w:r>
-      <w:r>
-        <w:rPr>
-          <w:lang w:val="pt-BR" w:eastAsia="pt-BR"/>
-        </w:rPr>
-        <w:t xml:space="preserve">, representado como </w:t>
+        <w:t>Decurso do Prazo Recursal</w:t>
+      </w:r>
+      <w:r>
+        <w:rPr>
+          <w:lang w:val="pt-BR" w:eastAsia="pt-BR"/>
+        </w:rPr>
+        <w:t xml:space="preserve">, que leva à </w:t>
       </w:r>
       <w:proofErr w:type="spellStart"/>
       <w:r>
@@ -29903,39 +30246,40 @@
           <w:rFonts w:ascii="Courier New" w:hAnsi="Courier New" w:cs="Courier New"/>
           <w:lang w:val="pt-BR" w:eastAsia="pt-BR"/>
         </w:rPr>
-        <w:t>subkind</w:t>
+        <w:t>situation</w:t>
       </w:r>
       <w:proofErr w:type="spellEnd"/>
       <w:r>
         <w:rPr>
           <w:lang w:val="pt-BR" w:eastAsia="pt-BR"/>
         </w:rPr>
-        <w:t xml:space="preserve"> de </w:t>
+        <w:t xml:space="preserve"> </w:t>
       </w:r>
       <w:r>
         <w:rPr>
           <w:u w:val="single"/>
           <w:lang w:val="pt-BR" w:eastAsia="pt-BR"/>
         </w:rPr>
-        <w:t>Documento</w:t>
-      </w:r>
-      <w:r>
-        <w:rPr>
-          <w:lang w:val="pt-BR" w:eastAsia="pt-BR"/>
-        </w:rPr>
-        <w:t xml:space="preserve">, e </w:t>
-      </w:r>
-      <w:r>
-        <w:rPr>
-          <w:lang w:val="pt-BR" w:eastAsia="pt-BR"/>
-        </w:rPr>
-        <w:t>leva</w:t>
-      </w:r>
-      <w:r>
-        <w:rPr>
-          <w:lang w:val="pt-BR" w:eastAsia="pt-BR"/>
-        </w:rPr>
-        <w:t xml:space="preserve"> a </w:t>
+        <w:t>Ausência de Recurso</w:t>
+      </w:r>
+      <w:r>
+        <w:rPr>
+          <w:lang w:val="pt-BR" w:eastAsia="pt-BR"/>
+        </w:rPr>
+        <w:t xml:space="preserve">. Essa situação, por sua vez, </w:t>
+      </w:r>
+      <w:r>
+        <w:rPr>
+          <w:rFonts w:ascii="Courier New" w:hAnsi="Courier New" w:cs="Courier New"/>
+          <w:lang w:val="pt-BR" w:eastAsia="pt-BR"/>
+        </w:rPr>
+        <w:t>triggers</w:t>
+      </w:r>
+      <w:r>
+        <w:rPr>
+          <w:lang w:val="pt-BR" w:eastAsia="pt-BR"/>
+        </w:rPr>
+        <w:t xml:space="preserve"> o </w:t>
       </w:r>
       <w:proofErr w:type="spellStart"/>
       <w:r>
@@ -29943,34 +30287,34 @@
           <w:rFonts w:ascii="Courier New" w:hAnsi="Courier New" w:cs="Courier New"/>
           <w:lang w:val="pt-BR" w:eastAsia="pt-BR"/>
         </w:rPr>
-        <w:t>situation</w:t>
+        <w:t>event</w:t>
       </w:r>
       <w:proofErr w:type="spellEnd"/>
       <w:r>
         <w:rPr>
           <w:lang w:val="pt-BR" w:eastAsia="pt-BR"/>
         </w:rPr>
-        <w:t xml:space="preserve"> Resulta</w:t>
+        <w:t xml:space="preserve"> </w:t>
       </w:r>
       <w:r>
         <w:rPr>
           <w:u w:val="single"/>
           <w:lang w:val="pt-BR" w:eastAsia="pt-BR"/>
         </w:rPr>
-        <w:t>do do Julgamento Recursal</w:t>
-      </w:r>
-      <w:r>
-        <w:rPr>
-          <w:lang w:val="pt-BR" w:eastAsia="pt-BR"/>
-        </w:rPr>
-        <w:t>.</w:t>
+        <w:t>Trânsito em Julgado</w:t>
+      </w:r>
+      <w:r>
+        <w:rPr>
+          <w:lang w:val="pt-BR" w:eastAsia="pt-BR"/>
+        </w:rPr>
+        <w:t>, representando o encerramento da possibilidade recursal considerada nesse trecho do modelo.</w:t>
       </w:r>
     </w:p>
     <w:p>
       <w:pPr>
         <w:pStyle w:val="Corpodetexto"/>
         <w:spacing w:line="312" w:lineRule="auto"/>
-        <w:ind w:left="282" w:right="116" w:firstLine="737"/>
+        <w:ind w:left="284" w:right="113" w:firstLine="737"/>
         <w:jc w:val="both"/>
         <w:rPr>
           <w:lang w:val="pt-BR" w:eastAsia="pt-BR"/>
@@ -29980,317 +30324,23 @@
         <w:rPr>
           <w:lang w:val="pt-BR" w:eastAsia="pt-BR"/>
         </w:rPr>
-        <w:t xml:space="preserve">O </w:t>
+        <w:t xml:space="preserve">Dessa forma, o diagrama </w:t>
       </w:r>
       <w:r>
         <w:rPr>
           <w:u w:val="single"/>
           <w:lang w:val="pt-BR" w:eastAsia="pt-BR"/>
         </w:rPr>
-        <w:t>Resultado do Julgamento Recursal</w:t>
-      </w:r>
-      <w:r>
-        <w:rPr>
-          <w:lang w:val="pt-BR" w:eastAsia="pt-BR"/>
-        </w:rPr>
-        <w:t xml:space="preserve"> é especializado nas </w:t>
-      </w:r>
-      <w:proofErr w:type="spellStart"/>
-      <w:r>
-        <w:rPr>
-          <w:rFonts w:ascii="Courier New" w:hAnsi="Courier New" w:cs="Courier New"/>
-          <w:lang w:val="pt-BR" w:eastAsia="pt-BR"/>
-        </w:rPr>
-        <w:t>situations</w:t>
-      </w:r>
-      <w:proofErr w:type="spellEnd"/>
-      <w:r>
-        <w:rPr>
-          <w:lang w:val="pt-BR" w:eastAsia="pt-BR"/>
-        </w:rPr>
-        <w:t xml:space="preserve"> </w:t>
-      </w:r>
-      <w:r>
-        <w:rPr>
-          <w:u w:val="single"/>
-          <w:lang w:val="pt-BR" w:eastAsia="pt-BR"/>
-        </w:rPr>
-        <w:t>Recurso Provido</w:t>
-      </w:r>
-      <w:r>
-        <w:rPr>
-          <w:lang w:val="pt-BR" w:eastAsia="pt-BR"/>
-        </w:rPr>
-        <w:t xml:space="preserve">, </w:t>
-      </w:r>
-      <w:r>
-        <w:rPr>
-          <w:u w:val="single"/>
-          <w:lang w:val="pt-BR" w:eastAsia="pt-BR"/>
-        </w:rPr>
-        <w:t>Recurso Parcialmente Provido</w:t>
-      </w:r>
-      <w:r>
-        <w:rPr>
-          <w:lang w:val="pt-BR" w:eastAsia="pt-BR"/>
-        </w:rPr>
-        <w:t xml:space="preserve">, </w:t>
-      </w:r>
-      <w:r>
-        <w:rPr>
-          <w:u w:val="single"/>
-          <w:lang w:val="pt-BR" w:eastAsia="pt-BR"/>
-        </w:rPr>
-        <w:t>Recurso Desprovido</w:t>
-      </w:r>
-      <w:r>
-        <w:rPr>
-          <w:lang w:val="pt-BR" w:eastAsia="pt-BR"/>
-        </w:rPr>
-        <w:t xml:space="preserve"> e </w:t>
-      </w:r>
-      <w:r>
-        <w:rPr>
-          <w:u w:val="single"/>
-          <w:lang w:val="pt-BR" w:eastAsia="pt-BR"/>
-        </w:rPr>
-        <w:t>Recurso Não Conhecido</w:t>
-      </w:r>
-      <w:r>
-        <w:rPr>
-          <w:lang w:val="pt-BR" w:eastAsia="pt-BR"/>
-        </w:rPr>
-        <w:t xml:space="preserve">. Essas especializações formam um conjunto </w:t>
-      </w:r>
-      <w:r>
-        <w:rPr>
-          <w:rFonts w:ascii="Courier New" w:hAnsi="Courier New" w:cs="Courier New"/>
-          <w:lang w:val="pt-BR" w:eastAsia="pt-BR"/>
-        </w:rPr>
-        <w:t>{</w:t>
-      </w:r>
-      <w:proofErr w:type="spellStart"/>
-      <w:r>
-        <w:rPr>
-          <w:rFonts w:ascii="Courier New" w:hAnsi="Courier New" w:cs="Courier New"/>
-          <w:lang w:val="pt-BR" w:eastAsia="pt-BR"/>
-        </w:rPr>
-        <w:t>disjoint</w:t>
-      </w:r>
-      <w:proofErr w:type="spellEnd"/>
-      <w:r>
-        <w:rPr>
-          <w:rFonts w:ascii="Courier New" w:hAnsi="Courier New" w:cs="Courier New"/>
-          <w:lang w:val="pt-BR" w:eastAsia="pt-BR"/>
-        </w:rPr>
-        <w:t>, complete}</w:t>
-      </w:r>
-      <w:r>
-        <w:rPr>
-          <w:lang w:val="pt-BR" w:eastAsia="pt-BR"/>
-        </w:rPr>
-        <w:t>, permitindo representar, dentro do escopo da ontologia, os diferentes resultados possíveis da apreciação do recurso.</w:t>
-      </w:r>
-    </w:p>
-    <w:p>
-      <w:pPr>
-        <w:pStyle w:val="Corpodetexto"/>
-        <w:spacing w:line="312" w:lineRule="auto"/>
-        <w:ind w:left="282" w:right="116" w:firstLine="737"/>
-        <w:jc w:val="both"/>
-        <w:rPr>
-          <w:lang w:val="pt-BR" w:eastAsia="pt-BR"/>
-        </w:rPr>
-      </w:pPr>
-      <w:r>
-        <w:rPr>
-          <w:lang w:val="pt-BR" w:eastAsia="pt-BR"/>
-        </w:rPr>
-        <w:t xml:space="preserve">O modelo também contempla a hipótese de não interposição. A </w:t>
-      </w:r>
-      <w:r>
-        <w:rPr>
-          <w:u w:val="single"/>
-          <w:lang w:val="pt-BR" w:eastAsia="pt-BR"/>
-        </w:rPr>
-        <w:t>Sentença</w:t>
-      </w:r>
-      <w:r>
-        <w:rPr>
-          <w:lang w:val="pt-BR" w:eastAsia="pt-BR"/>
-        </w:rPr>
-        <w:t xml:space="preserve"> </w:t>
-      </w:r>
-      <w:r>
-        <w:rPr>
-          <w:rFonts w:ascii="Courier New" w:hAnsi="Courier New" w:cs="Courier New"/>
-          <w:lang w:val="pt-BR" w:eastAsia="pt-BR"/>
-        </w:rPr>
-        <w:t>triggers</w:t>
-      </w:r>
-      <w:r>
-        <w:rPr>
-          <w:lang w:val="pt-BR" w:eastAsia="pt-BR"/>
-        </w:rPr>
-        <w:t xml:space="preserve"> o </w:t>
-      </w:r>
-      <w:proofErr w:type="spellStart"/>
-      <w:r>
-        <w:rPr>
-          <w:rFonts w:ascii="Courier New" w:hAnsi="Courier New" w:cs="Courier New"/>
-          <w:lang w:val="pt-BR" w:eastAsia="pt-BR"/>
-        </w:rPr>
-        <w:t>event</w:t>
-      </w:r>
-      <w:proofErr w:type="spellEnd"/>
-      <w:r>
-        <w:rPr>
-          <w:lang w:val="pt-BR" w:eastAsia="pt-BR"/>
-        </w:rPr>
-        <w:t xml:space="preserve"> </w:t>
-      </w:r>
-      <w:r>
-        <w:rPr>
-          <w:u w:val="single"/>
-          <w:lang w:val="pt-BR" w:eastAsia="pt-BR"/>
-        </w:rPr>
-        <w:t>Decurso do Prazo Recursal</w:t>
-      </w:r>
-      <w:r>
-        <w:rPr>
-          <w:lang w:val="pt-BR" w:eastAsia="pt-BR"/>
-        </w:rPr>
-        <w:t xml:space="preserve">, que </w:t>
-      </w:r>
-      <w:r>
-        <w:rPr>
-          <w:lang w:val="pt-BR" w:eastAsia="pt-BR"/>
-        </w:rPr>
-        <w:t>leva</w:t>
-      </w:r>
-      <w:r>
-        <w:rPr>
-          <w:lang w:val="pt-BR" w:eastAsia="pt-BR"/>
-        </w:rPr>
-        <w:t xml:space="preserve"> a </w:t>
-      </w:r>
-      <w:proofErr w:type="spellStart"/>
-      <w:r>
-        <w:rPr>
-          <w:rFonts w:ascii="Courier New" w:hAnsi="Courier New" w:cs="Courier New"/>
-          <w:lang w:val="pt-BR" w:eastAsia="pt-BR"/>
-        </w:rPr>
-        <w:t>situation</w:t>
-      </w:r>
-      <w:proofErr w:type="spellEnd"/>
-      <w:r>
-        <w:rPr>
-          <w:lang w:val="pt-BR" w:eastAsia="pt-BR"/>
-        </w:rPr>
-        <w:t xml:space="preserve"> </w:t>
-      </w:r>
-      <w:r>
-        <w:rPr>
-          <w:u w:val="single"/>
-          <w:lang w:val="pt-BR" w:eastAsia="pt-BR"/>
-        </w:rPr>
-        <w:t>Ausência de Recurso</w:t>
-      </w:r>
-      <w:r>
-        <w:rPr>
-          <w:lang w:val="pt-BR" w:eastAsia="pt-BR"/>
-        </w:rPr>
-        <w:t xml:space="preserve">. Essa situação, por sua vez, </w:t>
-      </w:r>
-      <w:r>
-        <w:rPr>
-          <w:rFonts w:ascii="Courier New" w:hAnsi="Courier New" w:cs="Courier New"/>
-          <w:lang w:val="pt-BR" w:eastAsia="pt-BR"/>
-        </w:rPr>
-        <w:t>triggers</w:t>
-      </w:r>
-      <w:r>
-        <w:rPr>
-          <w:lang w:val="pt-BR" w:eastAsia="pt-BR"/>
-        </w:rPr>
-        <w:t xml:space="preserve"> o </w:t>
-      </w:r>
-      <w:proofErr w:type="spellStart"/>
-      <w:r>
-        <w:rPr>
-          <w:rFonts w:ascii="Courier New" w:hAnsi="Courier New" w:cs="Courier New"/>
-          <w:lang w:val="pt-BR" w:eastAsia="pt-BR"/>
-        </w:rPr>
-        <w:t>event</w:t>
-      </w:r>
-      <w:proofErr w:type="spellEnd"/>
-      <w:r>
-        <w:rPr>
-          <w:lang w:val="pt-BR" w:eastAsia="pt-BR"/>
-        </w:rPr>
-        <w:t xml:space="preserve"> </w:t>
-      </w:r>
-      <w:r>
-        <w:rPr>
-          <w:u w:val="single"/>
-          <w:lang w:val="pt-BR" w:eastAsia="pt-BR"/>
-        </w:rPr>
-        <w:t>Trânsito em Julgado</w:t>
-      </w:r>
-      <w:r>
-        <w:rPr>
-          <w:lang w:val="pt-BR" w:eastAsia="pt-BR"/>
-        </w:rPr>
-        <w:t>, representando o encerramento da possibilidade recursal considerada nesse trecho do modelo.</w:t>
-      </w:r>
-    </w:p>
-    <w:p>
-      <w:pPr>
-        <w:pStyle w:val="Corpodetexto"/>
-        <w:spacing w:line="312" w:lineRule="auto"/>
-        <w:ind w:left="282" w:right="116" w:firstLine="737"/>
-        <w:jc w:val="both"/>
-        <w:rPr>
-          <w:lang w:val="pt-BR" w:eastAsia="pt-BR"/>
-        </w:rPr>
-      </w:pPr>
-      <w:r>
-        <w:rPr>
-          <w:lang w:val="pt-BR" w:eastAsia="pt-BR"/>
-        </w:rPr>
-        <w:t xml:space="preserve">Dessa forma, o diagrama </w:t>
-      </w:r>
-      <w:r>
-        <w:rPr>
-          <w:u w:val="single"/>
-          <w:lang w:val="pt-BR" w:eastAsia="pt-BR"/>
-        </w:rPr>
         <w:t>Recursos</w:t>
       </w:r>
       <w:r>
         <w:rPr>
           <w:lang w:val="pt-BR" w:eastAsia="pt-BR"/>
         </w:rPr>
-        <w:t xml:space="preserve"> organiza os principais conceitos relacionados à fase recursal, integrando a decisão impugnada, o recurso, o prazo, a representação processual, a remessa à </w:t>
-      </w:r>
-      <w:r>
-        <w:rPr>
-          <w:lang w:val="pt-BR" w:eastAsia="pt-BR"/>
-        </w:rPr>
-        <w:t>Turma Recursal</w:t>
-      </w:r>
-      <w:r>
-        <w:rPr>
-          <w:lang w:val="pt-BR" w:eastAsia="pt-BR"/>
-        </w:rPr>
-        <w:t>, o julgamento e seus possíveis resultados. O modelo fornece suporte especialmente às Questões de Competência relacionadas à existência de recurso contra a sentença, ao prazo recursal, à necessidade de representação, ao encaminhamento à Turma Recursal e ao resultado do julgamento do recurso</w:t>
-      </w:r>
-      <w:r>
-        <w:rPr>
-          <w:lang w:val="pt-BR" w:eastAsia="pt-BR"/>
-        </w:rPr>
-        <w:t>.</w:t>
-      </w:r>
+        <w:t xml:space="preserve"> organiza os principais conceitos relacionados à fase recursal, integrando a decisão impugnada, o recurso, o prazo, a representação processual, a remessa à Turma Recursal, o julgamento e seus possíveis resultados.</w:t>
+      </w:r>
+      <w:bookmarkStart w:id="141" w:name="_GoBack"/>
+      <w:bookmarkEnd w:id="141"/>
     </w:p>
     <w:p>
       <w:pPr>
@@ -30316,9 +30366,9 @@
           <w:szCs w:val="24"/>
         </w:rPr>
       </w:pPr>
-      <w:bookmarkStart w:id="141" w:name="_Toc243994392"/>
-      <w:bookmarkStart w:id="142" w:name="_Toc243994658"/>
-      <w:bookmarkStart w:id="143" w:name="_Toc243998316"/>
+      <w:bookmarkStart w:id="142" w:name="_Toc243994392"/>
+      <w:bookmarkStart w:id="143" w:name="_Toc243994658"/>
+      <w:bookmarkStart w:id="144" w:name="_Toc243998316"/>
       <w:r>
         <w:rPr>
           <w:i w:val="0"/>
@@ -30391,9 +30441,9 @@
         </w:rPr>
         <w:t xml:space="preserve"> - Diagrama de Recursos</w:t>
       </w:r>
-      <w:bookmarkEnd w:id="141"/>
       <w:bookmarkEnd w:id="142"/>
       <w:bookmarkEnd w:id="143"/>
+      <w:bookmarkEnd w:id="144"/>
     </w:p>
     <w:p>
       <w:pPr>
@@ -30406,14 +30456,13 @@
       </w:pPr>
       <w:r>
         <w:rPr>
-          <w:noProof/>
           <w:lang w:val="pt-BR" w:eastAsia="pt-BR"/>
         </w:rPr>
         <w:drawing>
-          <wp:inline distT="0" distB="0" distL="0" distR="0" wp14:anchorId="2FD5B63B" wp14:editId="15EA9AB7">
-            <wp:extent cx="6033135" cy="3617595"/>
-            <wp:effectExtent l="0" t="0" r="5715" b="1905"/>
-            <wp:docPr id="32" name="Imagem 32"/>
+          <wp:inline distT="0" distB="0" distL="0" distR="0" wp14:anchorId="787F437F" wp14:editId="6C673314">
+            <wp:extent cx="6033135" cy="3593465"/>
+            <wp:effectExtent l="0" t="0" r="5715" b="6985"/>
+            <wp:docPr id="42" name="Imagem 42"/>
             <wp:cNvGraphicFramePr>
               <a:graphicFrameLocks xmlns:a="http://schemas.openxmlformats.org/drawingml/2006/main" noChangeAspect="1"/>
             </wp:cNvGraphicFramePr>
@@ -30433,7 +30482,7 @@
                   <pic:spPr>
                     <a:xfrm>
                       <a:off x="0" y="0"/>
-                      <a:ext cx="6033135" cy="3617595"/>
+                      <a:ext cx="6033135" cy="3593465"/>
                     </a:xfrm>
                     <a:prstGeom prst="rect">
                       <a:avLst/>
@@ -31170,9 +31219,9 @@
           <w:szCs w:val="24"/>
         </w:rPr>
       </w:pPr>
-      <w:bookmarkStart w:id="144" w:name="_Toc243994393"/>
-      <w:bookmarkStart w:id="145" w:name="_Toc243994659"/>
-      <w:bookmarkStart w:id="146" w:name="_Toc243998317"/>
+      <w:bookmarkStart w:id="145" w:name="_Toc243994393"/>
+      <w:bookmarkStart w:id="146" w:name="_Toc243994659"/>
+      <w:bookmarkStart w:id="147" w:name="_Toc243998317"/>
       <w:r>
         <w:rPr>
           <w:i w:val="0"/>
@@ -31244,9 +31293,9 @@
         </w:rPr>
         <w:t xml:space="preserve"> - Diagrama de Cumprimento e Encerramento</w:t>
       </w:r>
-      <w:bookmarkEnd w:id="144"/>
       <w:bookmarkEnd w:id="145"/>
       <w:bookmarkEnd w:id="146"/>
+      <w:bookmarkEnd w:id="147"/>
     </w:p>
     <w:p>
       <w:pPr>
@@ -31343,12 +31392,12 @@
         <w:spacing w:before="2"/>
         <w:ind w:left="737" w:hanging="737"/>
       </w:pPr>
-      <w:bookmarkStart w:id="147" w:name="_Toc243998361"/>
+      <w:bookmarkStart w:id="148" w:name="_Toc243998361"/>
       <w:r>
         <w:lastRenderedPageBreak/>
         <w:t>Avaliação da Ontologia</w:t>
       </w:r>
-      <w:bookmarkEnd w:id="147"/>
+      <w:bookmarkEnd w:id="148"/>
     </w:p>
     <w:p>
       <w:pPr>
@@ -31432,7 +31481,7 @@
           <w:szCs w:val="24"/>
         </w:rPr>
       </w:pPr>
-      <w:bookmarkStart w:id="148" w:name="_Toc243998322"/>
+      <w:bookmarkStart w:id="149" w:name="_Toc243998322"/>
       <w:r>
         <w:rPr>
           <w:i w:val="0"/>
@@ -31524,7 +31573,7 @@
         </w:rPr>
         <w:t>Rastreabilidade das QCs</w:t>
       </w:r>
-      <w:bookmarkEnd w:id="148"/>
+      <w:bookmarkEnd w:id="149"/>
     </w:p>
     <w:p>
       <w:pPr>
@@ -33919,6 +33968,7 @@
         <w:rPr>
           <w:w w:val="105"/>
         </w:rPr>
+        <w:lastRenderedPageBreak/>
         <w:t>Fonte: elaborado pelo autor (2026)</w:t>
       </w:r>
     </w:p>
@@ -34009,7 +34059,7 @@
           <w:szCs w:val="24"/>
         </w:rPr>
       </w:pPr>
-      <w:bookmarkStart w:id="149" w:name="_Toc243998323"/>
+      <w:bookmarkStart w:id="150" w:name="_Toc243998323"/>
       <w:r>
         <w:rPr>
           <w:i w:val="0"/>
@@ -34091,7 +34141,7 @@
         </w:rPr>
         <w:t xml:space="preserve"> - Cenarios instanciados</w:t>
       </w:r>
-      <w:bookmarkEnd w:id="149"/>
+      <w:bookmarkEnd w:id="150"/>
     </w:p>
     <w:tbl>
       <w:tblPr>
@@ -34445,6 +34495,7 @@
               <w:ind w:right="147"/>
             </w:pPr>
             <w:r>
+              <w:lastRenderedPageBreak/>
               <w:t>C5</w:t>
             </w:r>
           </w:p>
@@ -34613,7 +34664,7 @@
           <w:szCs w:val="24"/>
         </w:rPr>
       </w:pPr>
-      <w:bookmarkStart w:id="150" w:name="_Toc243998324"/>
+      <w:bookmarkStart w:id="151" w:name="_Toc243998324"/>
       <w:r>
         <w:rPr>
           <w:i w:val="0"/>
@@ -34695,7 +34746,7 @@
         </w:rPr>
         <w:t xml:space="preserve"> - Identidade e classificação dos indivíduos</w:t>
       </w:r>
-      <w:bookmarkEnd w:id="150"/>
+      <w:bookmarkEnd w:id="151"/>
     </w:p>
     <w:tbl>
       <w:tblPr>
@@ -35253,6 +35304,7 @@
               <w:ind w:right="147"/>
             </w:pPr>
             <w:r>
+              <w:lastRenderedPageBreak/>
               <w:t>C1-VAL-PRET</w:t>
             </w:r>
           </w:p>
@@ -36046,7 +36098,7 @@
         </w:rPr>
         <w:t xml:space="preserve">     </w:t>
       </w:r>
-      <w:bookmarkStart w:id="151" w:name="_Toc243998325"/>
+      <w:bookmarkStart w:id="152" w:name="_Toc243998325"/>
       <w:r>
         <w:rPr>
           <w:i w:val="0"/>
@@ -36128,7 +36180,7 @@
         </w:rPr>
         <w:t xml:space="preserve"> - Relaçoes entre instancias</w:t>
       </w:r>
-      <w:bookmarkEnd w:id="151"/>
+      <w:bookmarkEnd w:id="152"/>
     </w:p>
     <w:tbl>
       <w:tblPr>
@@ -36353,6 +36405,7 @@
               <w:ind w:right="147"/>
             </w:pPr>
             <w:r>
+              <w:lastRenderedPageBreak/>
               <w:t>C1-PRET, C1-AUT, C1-REU</w:t>
             </w:r>
           </w:p>
@@ -36707,6 +36760,7 @@
               <w:ind w:right="147"/>
             </w:pPr>
             <w:r>
+              <w:lastRenderedPageBreak/>
               <w:t>C1-CUMPRIR, C1-CUMPRIDA, C1-CONCLUIR</w:t>
             </w:r>
           </w:p>
@@ -36826,7 +36880,7 @@
           <w:szCs w:val="24"/>
         </w:rPr>
       </w:pPr>
-      <w:bookmarkStart w:id="152" w:name="_Toc243998326"/>
+      <w:bookmarkStart w:id="153" w:name="_Toc243998326"/>
       <w:r>
         <w:rPr>
           <w:i w:val="0"/>
@@ -36908,7 +36962,7 @@
         </w:rPr>
         <w:t xml:space="preserve"> - Recortes temporais do cumprimento</w:t>
       </w:r>
-      <w:bookmarkEnd w:id="152"/>
+      <w:bookmarkEnd w:id="153"/>
     </w:p>
     <w:tbl>
       <w:tblPr>
@@ -37284,7 +37338,7 @@
           <w:szCs w:val="24"/>
         </w:rPr>
       </w:pPr>
-      <w:bookmarkStart w:id="153" w:name="_Toc243998327"/>
+      <w:bookmarkStart w:id="154" w:name="_Toc243998327"/>
       <w:r>
         <w:rPr>
           <w:i w:val="0"/>
@@ -37386,7 +37440,7 @@
         </w:rPr>
         <w:t>nstanciação recurso, acordo e dever de comparecimento</w:t>
       </w:r>
-      <w:bookmarkEnd w:id="153"/>
+      <w:bookmarkEnd w:id="154"/>
     </w:p>
     <w:tbl>
       <w:tblPr>
@@ -37901,7 +37955,7 @@
         </w:rPr>
         <w:t xml:space="preserve">     </w:t>
       </w:r>
-      <w:bookmarkStart w:id="154" w:name="_Toc243998328"/>
+      <w:bookmarkStart w:id="155" w:name="_Toc243998328"/>
       <w:r>
         <w:rPr>
           <w:i w:val="0"/>
@@ -37993,7 +38047,7 @@
         </w:rPr>
         <w:t>Instanciação da análise probatória, complementação de provas e aptidão para julgamento</w:t>
       </w:r>
-      <w:bookmarkEnd w:id="154"/>
+      <w:bookmarkEnd w:id="155"/>
     </w:p>
     <w:tbl>
       <w:tblPr>
@@ -38218,6 +38272,7 @@
         <w:rPr>
           <w:w w:val="105"/>
         </w:rPr>
+        <w:lastRenderedPageBreak/>
         <w:t xml:space="preserve">     </w:t>
       </w:r>
       <w:r>
@@ -38339,9 +38394,9 @@
         </w:tabs>
         <w:ind w:left="825" w:hanging="543"/>
       </w:pPr>
-      <w:bookmarkStart w:id="155" w:name="Conclusão"/>
-      <w:bookmarkStart w:id="156" w:name="_bookmark11"/>
-      <w:bookmarkStart w:id="157" w:name="_Toc243998362"/>
+      <w:bookmarkStart w:id="156" w:name="Conclusão"/>
+      <w:bookmarkStart w:id="157" w:name="_bookmark11"/>
+      <w:bookmarkStart w:id="158" w:name="_Toc243998362"/>
       <w:r>
         <w:rPr>
           <w:spacing w:val="-5"/>
@@ -38349,9 +38404,9 @@
         <w:lastRenderedPageBreak/>
         <w:t>Conclusão</w:t>
       </w:r>
-      <w:bookmarkEnd w:id="155"/>
       <w:bookmarkEnd w:id="156"/>
       <w:bookmarkEnd w:id="157"/>
+      <w:bookmarkEnd w:id="158"/>
     </w:p>
     <w:p>
       <w:pPr>
@@ -38401,9 +38456,9 @@
         </w:tabs>
         <w:ind w:left="1019" w:hanging="737"/>
       </w:pPr>
-      <w:bookmarkStart w:id="158" w:name="Considerações_Finais"/>
-      <w:bookmarkStart w:id="159" w:name="_bookmark12"/>
-      <w:bookmarkStart w:id="160" w:name="_Toc243998363"/>
+      <w:bookmarkStart w:id="159" w:name="Considerações_Finais"/>
+      <w:bookmarkStart w:id="160" w:name="_bookmark12"/>
+      <w:bookmarkStart w:id="161" w:name="_Toc243998363"/>
       <w:r>
         <w:rPr>
           <w:w w:val="85"/>
@@ -38422,9 +38477,9 @@
         </w:rPr>
         <w:t>Finais</w:t>
       </w:r>
-      <w:bookmarkEnd w:id="158"/>
       <w:bookmarkEnd w:id="159"/>
       <w:bookmarkEnd w:id="160"/>
+      <w:bookmarkEnd w:id="161"/>
     </w:p>
     <w:p>
       <w:pPr>
@@ -38537,9 +38592,9 @@
         </w:tabs>
         <w:ind w:left="1019" w:hanging="737"/>
       </w:pPr>
-      <w:bookmarkStart w:id="161" w:name="Trabalhos_Futuros"/>
-      <w:bookmarkStart w:id="162" w:name="_bookmark13"/>
-      <w:bookmarkStart w:id="163" w:name="_Toc243998364"/>
+      <w:bookmarkStart w:id="162" w:name="Trabalhos_Futuros"/>
+      <w:bookmarkStart w:id="163" w:name="_bookmark13"/>
+      <w:bookmarkStart w:id="164" w:name="_Toc243998364"/>
       <w:r>
         <w:rPr>
           <w:w w:val="90"/>
@@ -38559,9 +38614,9 @@
         </w:rPr>
         <w:t>Futuros</w:t>
       </w:r>
-      <w:bookmarkEnd w:id="161"/>
       <w:bookmarkEnd w:id="162"/>
       <w:bookmarkEnd w:id="163"/>
+      <w:bookmarkEnd w:id="164"/>
     </w:p>
     <w:p>
       <w:pPr>
@@ -38617,11 +38672,11 @@
       <w:pPr>
         <w:pStyle w:val="Ttulo1"/>
       </w:pPr>
-      <w:bookmarkStart w:id="164" w:name="_Toc243998365"/>
+      <w:bookmarkStart w:id="165" w:name="_Toc243998365"/>
       <w:r>
         <w:t>Declaração de uso de IA generativa</w:t>
       </w:r>
-      <w:bookmarkEnd w:id="164"/>
+      <w:bookmarkEnd w:id="165"/>
     </w:p>
     <w:p>
       <w:pPr>
@@ -38704,8 +38759,6 @@
         </w:rPr>
         <w:t>As sugestões fornecidas pela ferramenta foram analisadas, revisadas e, quando necessário, modificadas pelo autor, que realizou a seleção das fontes, a definição dos conceitos, a construção e o refinamento da ontologia e a verificação do conteúdo apresentado. O autor assume integral responsabilidade pelo conteúdo final deste trabalho.</w:t>
       </w:r>
-      <w:bookmarkStart w:id="165" w:name="_GoBack"/>
-      <w:bookmarkEnd w:id="165"/>
     </w:p>
     <w:p>
       <w:pPr>
@@ -50229,7 +50282,31 @@
                 <w:b w:val="0"/>
                 <w:bCs w:val="0"/>
               </w:rPr>
-              <w:t>Sentença Recorrida</w:t>
+              <w:t>Sentença</w:t>
+            </w:r>
+            <w:r>
+              <w:rPr>
+                <w:rStyle w:val="Forte"/>
+                <w:b w:val="0"/>
+                <w:bCs w:val="0"/>
+              </w:rPr>
+              <w:t xml:space="preserve"> </w:t>
+            </w:r>
+            <w:r>
+              <w:rPr>
+                <w:rStyle w:val="Forte"/>
+                <w:b w:val="0"/>
+                <w:bCs w:val="0"/>
+              </w:rPr>
+              <w:t>Não</w:t>
+            </w:r>
+            <w:r>
+              <w:rPr>
+                <w:rStyle w:val="Forte"/>
+                <w:b w:val="0"/>
+                <w:bCs w:val="0"/>
+              </w:rPr>
+              <w:t xml:space="preserve"> Transitada em Julgado</w:t>
             </w:r>
           </w:p>
         </w:tc>
@@ -50247,7 +50324,7 @@
               <w:ind w:right="147"/>
             </w:pPr>
             <w:r>
-              <w:t>Sentença que está sendo questionada por meio de um recurso. Continua sendo a mesma sentença, agora nessa condição.</w:t>
+              <w:t>Sentença que ainda pode ser questionada por recurso ou cujo recurso ainda está pendente de julgamento.</w:t>
             </w:r>
           </w:p>
         </w:tc>
@@ -50265,7 +50342,7 @@
               <w:ind w:right="147"/>
             </w:pPr>
             <w:r>
-              <w:t>Lei nº 9.099/1995</w:t>
+              <w:t>Código de Processo Civil</w:t>
             </w:r>
           </w:p>
         </w:tc>
@@ -50296,6 +50373,72 @@
                 <w:bCs w:val="0"/>
               </w:rPr>
               <w:lastRenderedPageBreak/>
+              <w:t>Sentença Recorrida</w:t>
+            </w:r>
+          </w:p>
+        </w:tc>
+        <w:tc>
+          <w:tcPr>
+            <w:tcW w:w="7938" w:type="dxa"/>
+          </w:tcPr>
+          <w:p>
+            <w:pPr>
+              <w:pStyle w:val="Corpodetexto"/>
+              <w:tabs>
+                <w:tab w:val="left" w:pos="1077"/>
+              </w:tabs>
+              <w:spacing w:before="100"/>
+              <w:ind w:right="147"/>
+            </w:pPr>
+            <w:r>
+              <w:t>Sentença que está sendo questionada por meio de um recurso. Continua sendo a mesma sentença, agora nessa condição.</w:t>
+            </w:r>
+          </w:p>
+        </w:tc>
+        <w:tc>
+          <w:tcPr>
+            <w:tcW w:w="3119" w:type="dxa"/>
+          </w:tcPr>
+          <w:p>
+            <w:pPr>
+              <w:pStyle w:val="Corpodetexto"/>
+              <w:tabs>
+                <w:tab w:val="left" w:pos="1077"/>
+              </w:tabs>
+              <w:spacing w:before="100"/>
+              <w:ind w:right="147"/>
+            </w:pPr>
+            <w:r>
+              <w:t>Lei nº 9.099/1995</w:t>
+            </w:r>
+          </w:p>
+        </w:tc>
+      </w:tr>
+      <w:tr>
+        <w:trPr>
+          <w:trHeight w:val="301"/>
+        </w:trPr>
+        <w:tc>
+          <w:tcPr>
+            <w:tcW w:w="3260" w:type="dxa"/>
+          </w:tcPr>
+          <w:p>
+            <w:pPr>
+              <w:pStyle w:val="Corpodetexto"/>
+              <w:spacing w:before="100"/>
+              <w:ind w:right="147"/>
+              <w:rPr>
+                <w:rStyle w:val="Forte"/>
+                <w:b w:val="0"/>
+                <w:bCs w:val="0"/>
+              </w:rPr>
+            </w:pPr>
+            <w:r>
+              <w:rPr>
+                <w:rStyle w:val="Forte"/>
+                <w:b w:val="0"/>
+                <w:bCs w:val="0"/>
+              </w:rPr>
               <w:t>Sentença Transitada em Julgado</w:t>
             </w:r>
           </w:p>
@@ -55796,7 +55939,7 @@
     <w:charset w:val="00"/>
     <w:family w:val="roman"/>
     <w:pitch w:val="variable"/>
-    <w:sig w:usb0="E0002AFF" w:usb1="C0007843" w:usb2="00000009" w:usb3="00000000" w:csb0="000001FF" w:csb1="00000000"/>
+    <w:sig w:usb0="E0002EFF" w:usb1="C000785B" w:usb2="00000009" w:usb3="00000000" w:csb0="000001FF" w:csb1="00000000"/>
   </w:font>
   <w:font w:name="Palatino Linotype">
     <w:panose1 w:val="02040502050505030304"/>
@@ -55810,7 +55953,7 @@
     <w:charset w:val="00"/>
     <w:family w:val="swiss"/>
     <w:pitch w:val="variable"/>
-    <w:sig w:usb0="E0002AFF" w:usb1="C0007843" w:usb2="00000009" w:usb3="00000000" w:csb0="000001FF" w:csb1="00000000"/>
+    <w:sig w:usb0="E0002EFF" w:usb1="C000785B" w:usb2="00000009" w:usb3="00000000" w:csb0="000001FF" w:csb1="00000000"/>
   </w:font>
   <w:font w:name="Tahoma">
     <w:altName w:val="Tahoma"/>
@@ -55833,7 +55976,7 @@
     <w:charset w:val="00"/>
     <w:family w:val="swiss"/>
     <w:pitch w:val="variable"/>
-    <w:sig w:usb0="E0002AFF" w:usb1="4000ACFF" w:usb2="00000001" w:usb3="00000000" w:csb0="000001FF" w:csb1="00000000"/>
+    <w:sig w:usb0="E4002EFF" w:usb1="C200247B" w:usb2="00000009" w:usb3="00000000" w:csb0="000001FF" w:csb1="00000000"/>
   </w:font>
   <w:font w:name="Cambria">
     <w:panose1 w:val="02040503050406030204"/>
@@ -55854,7 +55997,7 @@
     <w:charset w:val="00"/>
     <w:family w:val="swiss"/>
     <w:pitch w:val="variable"/>
-    <w:sig w:usb0="A0002AEF" w:usb1="4000207B" w:usb2="00000000" w:usb3="00000000" w:csb0="000001FF" w:csb1="00000000"/>
+    <w:sig w:usb0="E4002EFF" w:usb1="C200247B" w:usb2="00000009" w:usb3="00000000" w:csb0="000001FF" w:csb1="00000000"/>
   </w:font>
 </w:fonts>
 </file>
@@ -55882,6 +56025,7 @@
     <w:rsid w:val="000E7247"/>
     <w:rsid w:val="00180C18"/>
     <w:rsid w:val="003353D3"/>
+    <w:rsid w:val="00390F95"/>
     <w:rsid w:val="00452E91"/>
     <w:rsid w:val="00514671"/>
     <w:rsid w:val="005B33F5"/>
@@ -56689,7 +56833,7 @@
 </file>
 
 <file path=customXml/itemProps1.xml><?xml version="1.0" encoding="utf-8"?>
-<ds:datastoreItem xmlns:ds="http://schemas.openxmlformats.org/officeDocument/2006/customXml" ds:itemID="{1E6BB3EA-227A-4C24-B675-7FA1935E6DD9}">
+<ds:datastoreItem xmlns:ds="http://schemas.openxmlformats.org/officeDocument/2006/customXml" ds:itemID="{7A4FA8C4-E75C-43EF-BF68-D42AE619267F}">
   <ds:schemaRefs>
     <ds:schemaRef ds:uri="http://schemas.openxmlformats.org/officeDocument/2006/bibliography"/>
   </ds:schemaRefs>

</xml_diff>